<commit_message>
changed lowercase=False to True in count vectorizer
</commit_message>
<xml_diff>
--- a/static/Project_4_Report.docx
+++ b/static/Project_4_Report.docx
@@ -198,9 +198,846 @@
     <w:p>
       <w:pPr>
         <w:rPr>
-          <w:lang w:val="tr-TR"/>
-        </w:rPr>
-      </w:pPr>
+          <w:b/>
+          <w:bCs/>
+          <w:u w:val="single"/>
+          <w:lang w:val="tr-TR"/>
+        </w:rPr>
+      </w:pPr>
+      <w:proofErr w:type="spellStart"/>
+      <w:r>
+        <w:rPr>
+          <w:b/>
+          <w:bCs/>
+          <w:u w:val="single"/>
+          <w:lang w:val="tr-TR"/>
+        </w:rPr>
+        <w:t>Task</w:t>
+      </w:r>
+      <w:proofErr w:type="spellEnd"/>
+      <w:r>
+        <w:rPr>
+          <w:b/>
+          <w:bCs/>
+          <w:u w:val="single"/>
+          <w:lang w:val="tr-TR"/>
+        </w:rPr>
+        <w:t xml:space="preserve"> 1 </w:t>
+      </w:r>
+      <w:proofErr w:type="spellStart"/>
+      <w:r>
+        <w:rPr>
+          <w:b/>
+          <w:bCs/>
+          <w:u w:val="single"/>
+          <w:lang w:val="tr-TR"/>
+        </w:rPr>
+        <w:t>Justification</w:t>
+      </w:r>
+      <w:proofErr w:type="spellEnd"/>
+      <w:r>
+        <w:rPr>
+          <w:b/>
+          <w:bCs/>
+          <w:u w:val="single"/>
+          <w:lang w:val="tr-TR"/>
+        </w:rPr>
+        <w:t xml:space="preserve">: </w:t>
+      </w:r>
+    </w:p>
+    <w:p>
+      <w:pPr>
+        <w:rPr>
+          <w:b/>
+          <w:bCs/>
+          <w:u w:val="single"/>
+          <w:lang w:val="tr-TR"/>
+        </w:rPr>
+      </w:pPr>
+      <w:proofErr w:type="spellStart"/>
+      <w:r>
+        <w:rPr>
+          <w:b/>
+          <w:bCs/>
+          <w:u w:val="single"/>
+          <w:lang w:val="tr-TR"/>
+        </w:rPr>
+        <w:t>Task</w:t>
+      </w:r>
+      <w:proofErr w:type="spellEnd"/>
+      <w:r>
+        <w:rPr>
+          <w:b/>
+          <w:bCs/>
+          <w:u w:val="single"/>
+          <w:lang w:val="tr-TR"/>
+        </w:rPr>
+        <w:t xml:space="preserve"> 1: </w:t>
+      </w:r>
+    </w:p>
+    <w:p>
+      <w:pPr>
+        <w:pStyle w:val="p1"/>
+        <w:rPr>
+          <w:sz w:val="24"/>
+          <w:szCs w:val="24"/>
+        </w:rPr>
+      </w:pPr>
+      <w:r>
+        <w:rPr>
+          <w:sz w:val="24"/>
+          <w:szCs w:val="24"/>
+        </w:rPr>
+        <w:t>Choose a feature representation that you believe is appropriate for a movie recom</w:t>
+      </w:r>
+      <w:r>
+        <w:rPr>
+          <w:sz w:val="24"/>
+          <w:szCs w:val="24"/>
+        </w:rPr>
+        <w:t xml:space="preserve">mender </w:t>
+      </w:r>
+      <w:r>
+        <w:rPr>
+          <w:sz w:val="24"/>
+          <w:szCs w:val="24"/>
+        </w:rPr>
+        <w:t>system. Justify your choice of features and write a method to extract them</w:t>
+      </w:r>
+      <w:r>
+        <w:rPr>
+          <w:sz w:val="24"/>
+          <w:szCs w:val="24"/>
+        </w:rPr>
+        <w:t xml:space="preserve"> </w:t>
+      </w:r>
+      <w:r>
+        <w:rPr>
+          <w:sz w:val="24"/>
+          <w:szCs w:val="24"/>
+        </w:rPr>
+        <w:t>from the dataset.</w:t>
+      </w:r>
+    </w:p>
+    <w:p>
+      <w:pPr>
+        <w:pStyle w:val="p1"/>
+        <w:rPr>
+          <w:sz w:val="24"/>
+          <w:szCs w:val="24"/>
+        </w:rPr>
+      </w:pPr>
+    </w:p>
+    <w:p>
+      <w:pPr>
+        <w:pStyle w:val="p1"/>
+        <w:jc w:val="both"/>
+        <w:rPr>
+          <w:rFonts w:ascii="Times New Roman" w:hAnsi="Times New Roman"/>
+          <w:sz w:val="24"/>
+          <w:szCs w:val="24"/>
+        </w:rPr>
+      </w:pPr>
+      <w:r>
+        <w:rPr>
+          <w:rFonts w:ascii="Times New Roman" w:hAnsi="Times New Roman"/>
+          <w:sz w:val="24"/>
+          <w:szCs w:val="24"/>
+        </w:rPr>
+        <w:tab/>
+      </w:r>
+      <w:r>
+        <w:rPr>
+          <w:rFonts w:ascii="Times New Roman" w:hAnsi="Times New Roman"/>
+          <w:sz w:val="24"/>
+          <w:szCs w:val="24"/>
+        </w:rPr>
+        <w:t xml:space="preserve">I have used a hybrid approach for the feature representation. It </w:t>
+      </w:r>
+      <w:r>
+        <w:rPr>
+          <w:rFonts w:ascii="Times New Roman" w:hAnsi="Times New Roman"/>
+          <w:sz w:val="24"/>
+          <w:szCs w:val="24"/>
+        </w:rPr>
+        <w:t>combines</w:t>
+      </w:r>
+      <w:r>
+        <w:rPr>
+          <w:rFonts w:ascii="Times New Roman" w:hAnsi="Times New Roman"/>
+          <w:sz w:val="24"/>
+          <w:szCs w:val="24"/>
+        </w:rPr>
+        <w:t xml:space="preserve"> 2 components: </w:t>
+      </w:r>
+      <w:r>
+        <w:rPr>
+          <w:rFonts w:ascii="Times New Roman" w:hAnsi="Times New Roman"/>
+          <w:b/>
+          <w:bCs/>
+          <w:sz w:val="24"/>
+          <w:szCs w:val="24"/>
+        </w:rPr>
+        <w:t>“Multi-Hot Encoded Movie Genres”</w:t>
+      </w:r>
+      <w:r>
+        <w:rPr>
+          <w:rFonts w:ascii="Times New Roman" w:hAnsi="Times New Roman"/>
+          <w:sz w:val="24"/>
+          <w:szCs w:val="24"/>
+        </w:rPr>
+        <w:t xml:space="preserve"> and </w:t>
+      </w:r>
+      <w:r>
+        <w:rPr>
+          <w:rFonts w:ascii="Times New Roman" w:hAnsi="Times New Roman"/>
+          <w:b/>
+          <w:bCs/>
+          <w:sz w:val="24"/>
+          <w:szCs w:val="24"/>
+        </w:rPr>
+        <w:t>“Minimum-Maximum Scaled Numerical Rating Values”</w:t>
+      </w:r>
+      <w:r>
+        <w:rPr>
+          <w:rFonts w:ascii="Times New Roman" w:hAnsi="Times New Roman"/>
+          <w:sz w:val="24"/>
+          <w:szCs w:val="24"/>
+        </w:rPr>
+        <w:t xml:space="preserve">. </w:t>
+      </w:r>
+      <w:r>
+        <w:rPr>
+          <w:rFonts w:ascii="Times New Roman" w:hAnsi="Times New Roman"/>
+          <w:sz w:val="24"/>
+          <w:szCs w:val="24"/>
+        </w:rPr>
+        <w:t xml:space="preserve"> </w:t>
+      </w:r>
+      <w:r>
+        <w:rPr>
+          <w:rFonts w:ascii="Times New Roman" w:hAnsi="Times New Roman"/>
+          <w:b/>
+          <w:bCs/>
+          <w:sz w:val="24"/>
+          <w:szCs w:val="24"/>
+        </w:rPr>
+        <w:t>“Multi-Hot Encoded Genres”</w:t>
+      </w:r>
+      <w:r>
+        <w:rPr>
+          <w:rFonts w:ascii="Times New Roman" w:hAnsi="Times New Roman"/>
+          <w:b/>
+          <w:bCs/>
+          <w:sz w:val="24"/>
+          <w:szCs w:val="24"/>
+        </w:rPr>
+        <w:t xml:space="preserve"> </w:t>
+      </w:r>
+      <w:r>
+        <w:rPr>
+          <w:rFonts w:ascii="Times New Roman" w:hAnsi="Times New Roman"/>
+          <w:sz w:val="24"/>
+          <w:szCs w:val="24"/>
+        </w:rPr>
+        <w:t>includes the categorical text data</w:t>
+      </w:r>
+      <w:r>
+        <w:rPr>
+          <w:rFonts w:ascii="Times New Roman" w:hAnsi="Times New Roman"/>
+          <w:sz w:val="24"/>
+          <w:szCs w:val="24"/>
+        </w:rPr>
+        <w:t xml:space="preserve"> that</w:t>
+      </w:r>
+      <w:r>
+        <w:rPr>
+          <w:rFonts w:ascii="Times New Roman" w:hAnsi="Times New Roman"/>
+          <w:sz w:val="24"/>
+          <w:szCs w:val="24"/>
+        </w:rPr>
+        <w:t xml:space="preserve"> represent</w:t>
+      </w:r>
+      <w:r>
+        <w:rPr>
+          <w:rFonts w:ascii="Times New Roman" w:hAnsi="Times New Roman"/>
+          <w:sz w:val="24"/>
+          <w:szCs w:val="24"/>
+        </w:rPr>
+        <w:t>s</w:t>
+      </w:r>
+      <w:r>
+        <w:rPr>
+          <w:rFonts w:ascii="Times New Roman" w:hAnsi="Times New Roman"/>
+          <w:sz w:val="24"/>
+          <w:szCs w:val="24"/>
+        </w:rPr>
+        <w:t xml:space="preserve"> </w:t>
+      </w:r>
+      <w:r>
+        <w:rPr>
+          <w:rFonts w:ascii="Times New Roman" w:hAnsi="Times New Roman"/>
+          <w:sz w:val="24"/>
+          <w:szCs w:val="24"/>
+        </w:rPr>
+        <w:t xml:space="preserve">the genres of the movie. </w:t>
+      </w:r>
+      <w:r>
+        <w:rPr>
+          <w:rFonts w:ascii="Times New Roman" w:hAnsi="Times New Roman"/>
+          <w:b/>
+          <w:bCs/>
+          <w:sz w:val="24"/>
+          <w:szCs w:val="24"/>
+        </w:rPr>
+        <w:t xml:space="preserve">“Minimum-Maximum Scaled Numerical Ratings” </w:t>
+      </w:r>
+      <w:r>
+        <w:rPr>
+          <w:rFonts w:ascii="Times New Roman" w:hAnsi="Times New Roman"/>
+          <w:sz w:val="24"/>
+          <w:szCs w:val="24"/>
+        </w:rPr>
+        <w:t xml:space="preserve">includes continuous numerical data that represents the user and critic </w:t>
+      </w:r>
+      <w:r>
+        <w:rPr>
+          <w:rFonts w:ascii="Times New Roman" w:hAnsi="Times New Roman"/>
+          <w:sz w:val="24"/>
+          <w:szCs w:val="24"/>
+        </w:rPr>
+        <w:t>evaluations and feedback given to the movie</w:t>
+      </w:r>
+      <w:r>
+        <w:rPr>
+          <w:rFonts w:ascii="Times New Roman" w:hAnsi="Times New Roman"/>
+          <w:sz w:val="24"/>
+          <w:szCs w:val="24"/>
+        </w:rPr>
+        <w:t xml:space="preserve"> by using the corresponding </w:t>
+      </w:r>
+      <w:r>
+        <w:rPr>
+          <w:rFonts w:ascii="Times New Roman" w:hAnsi="Times New Roman"/>
+          <w:b/>
+          <w:bCs/>
+          <w:sz w:val="24"/>
+          <w:szCs w:val="24"/>
+        </w:rPr>
+        <w:t>‘imdb_score’</w:t>
+      </w:r>
+      <w:r>
+        <w:rPr>
+          <w:rFonts w:ascii="Times New Roman" w:hAnsi="Times New Roman"/>
+          <w:sz w:val="24"/>
+          <w:szCs w:val="24"/>
+        </w:rPr>
+        <w:t xml:space="preserve"> value</w:t>
+      </w:r>
+      <w:r>
+        <w:rPr>
+          <w:rFonts w:ascii="Times New Roman" w:hAnsi="Times New Roman"/>
+          <w:sz w:val="24"/>
+          <w:szCs w:val="24"/>
+        </w:rPr>
+        <w:t xml:space="preserve"> of that movie. </w:t>
+      </w:r>
+    </w:p>
+    <w:p>
+      <w:pPr>
+        <w:rPr>
+          <w:lang w:val="tr-TR"/>
+        </w:rPr>
+      </w:pPr>
+    </w:p>
+    <w:p>
+      <w:pPr>
+        <w:rPr>
+          <w:lang w:val="tr-TR"/>
+        </w:rPr>
+      </w:pPr>
+    </w:p>
+    <w:p>
+      <w:pPr>
+        <w:spacing w:after="100" w:afterAutospacing="1" w:line="240" w:lineRule="auto"/>
+        <w:rPr>
+          <w:rFonts w:ascii="Arial" w:eastAsia="Times New Roman" w:hAnsi="Arial" w:cs="Times New Roman"/>
+          <w:kern w:val="0"/>
+          <w:lang w:eastAsia="tr-TR"/>
+          <w14:ligatures w14:val="none"/>
+        </w:rPr>
+      </w:pPr>
+      <w:r>
+        <w:rPr>
+          <w:rFonts w:ascii="Arial" w:eastAsia="Times New Roman" w:hAnsi="Arial" w:cs="Times New Roman"/>
+          <w:kern w:val="0"/>
+          <w:lang w:eastAsia="tr-TR"/>
+          <w14:ligatures w14:val="none"/>
+        </w:rPr>
+        <w:t>Based on the provided Django application code, here is the feature representation choice, its justification, and the extraction method implemented in the script.</w:t>
+      </w:r>
+    </w:p>
+    <w:p>
+      <w:pPr>
+        <w:spacing w:after="100" w:afterAutospacing="1" w:line="240" w:lineRule="auto"/>
+        <w:outlineLvl w:val="2"/>
+        <w:rPr>
+          <w:rFonts w:ascii="Arial" w:eastAsia="Times New Roman" w:hAnsi="Arial" w:cs="Times New Roman"/>
+          <w:b/>
+          <w:bCs/>
+          <w:kern w:val="0"/>
+          <w:sz w:val="27"/>
+          <w:szCs w:val="27"/>
+          <w:lang w:eastAsia="tr-TR"/>
+          <w14:ligatures w14:val="none"/>
+        </w:rPr>
+      </w:pPr>
+      <w:r>
+        <w:rPr>
+          <w:rFonts w:ascii="Arial" w:eastAsia="Times New Roman" w:hAnsi="Arial" w:cs="Times New Roman"/>
+          <w:b/>
+          <w:bCs/>
+          <w:kern w:val="0"/>
+          <w:sz w:val="27"/>
+          <w:szCs w:val="27"/>
+          <w:lang w:eastAsia="tr-TR"/>
+          <w14:ligatures w14:val="none"/>
+        </w:rPr>
+        <w:t>1. Choice of Feature Representation</w:t>
+      </w:r>
+    </w:p>
+    <w:p>
+      <w:pPr>
+        <w:spacing w:after="100" w:afterAutospacing="1" w:line="240" w:lineRule="auto"/>
+        <w:rPr>
+          <w:rFonts w:ascii="Arial" w:eastAsia="Times New Roman" w:hAnsi="Arial" w:cs="Times New Roman"/>
+          <w:kern w:val="0"/>
+          <w:lang w:eastAsia="tr-TR"/>
+          <w14:ligatures w14:val="none"/>
+        </w:rPr>
+      </w:pPr>
+      <w:r>
+        <w:rPr>
+          <w:rFonts w:ascii="Arial" w:eastAsia="Times New Roman" w:hAnsi="Arial" w:cs="Times New Roman"/>
+          <w:kern w:val="0"/>
+          <w:lang w:eastAsia="tr-TR"/>
+          <w14:ligatures w14:val="none"/>
+        </w:rPr>
+        <w:t xml:space="preserve">The code utilizes a </w:t>
+      </w:r>
+      <w:r>
+        <w:rPr>
+          <w:rFonts w:ascii="Arial" w:eastAsia="Times New Roman" w:hAnsi="Arial" w:cs="Times New Roman"/>
+          <w:b/>
+          <w:bCs/>
+          <w:kern w:val="0"/>
+          <w:lang w:eastAsia="tr-TR"/>
+          <w14:ligatures w14:val="none"/>
+        </w:rPr>
+        <w:t>Hybrid Feature Representation</w:t>
+      </w:r>
+      <w:r>
+        <w:rPr>
+          <w:rFonts w:ascii="Arial" w:eastAsia="Times New Roman" w:hAnsi="Arial" w:cs="Times New Roman"/>
+          <w:kern w:val="0"/>
+          <w:lang w:eastAsia="tr-TR"/>
+          <w14:ligatures w14:val="none"/>
+        </w:rPr>
+        <w:t xml:space="preserve"> that combines:</w:t>
+      </w:r>
+    </w:p>
+    <w:p>
+      <w:pPr>
+        <w:numPr>
+          <w:ilvl w:val="0"/>
+          <w:numId w:val="1"/>
+        </w:numPr>
+        <w:spacing w:after="100" w:afterAutospacing="1" w:line="240" w:lineRule="auto"/>
+        <w:rPr>
+          <w:rFonts w:ascii="Arial" w:eastAsia="Times New Roman" w:hAnsi="Arial" w:cs="Times New Roman"/>
+          <w:kern w:val="0"/>
+          <w:lang w:eastAsia="tr-TR"/>
+          <w14:ligatures w14:val="none"/>
+        </w:rPr>
+      </w:pPr>
+      <w:r>
+        <w:rPr>
+          <w:rFonts w:ascii="Arial" w:eastAsia="Times New Roman" w:hAnsi="Arial" w:cs="Times New Roman"/>
+          <w:b/>
+          <w:bCs/>
+          <w:kern w:val="0"/>
+          <w:lang w:eastAsia="tr-TR"/>
+          <w14:ligatures w14:val="none"/>
+        </w:rPr>
+        <w:t>Multi-</w:t>
+      </w:r>
+      <w:r>
+        <w:rPr>
+          <w:rFonts w:ascii="Arial" w:eastAsia="Times New Roman" w:hAnsi="Arial" w:cs="Times New Roman"/>
+          <w:b/>
+          <w:bCs/>
+          <w:kern w:val="0"/>
+          <w:lang w:eastAsia="tr-TR"/>
+          <w14:ligatures w14:val="none"/>
+        </w:rPr>
+        <w:t>hot-e</w:t>
+      </w:r>
+      <w:r>
+        <w:rPr>
+          <w:rFonts w:ascii="Arial" w:eastAsia="Times New Roman" w:hAnsi="Arial" w:cs="Times New Roman"/>
+          <w:b/>
+          <w:bCs/>
+          <w:kern w:val="0"/>
+          <w:lang w:eastAsia="tr-TR"/>
+          <w14:ligatures w14:val="none"/>
+        </w:rPr>
+        <w:t xml:space="preserve">ncoded </w:t>
+      </w:r>
+      <w:r>
+        <w:rPr>
+          <w:rFonts w:ascii="Arial" w:eastAsia="Times New Roman" w:hAnsi="Arial" w:cs="Times New Roman"/>
+          <w:b/>
+          <w:bCs/>
+          <w:kern w:val="0"/>
+          <w:lang w:eastAsia="tr-TR"/>
+          <w14:ligatures w14:val="none"/>
+        </w:rPr>
+        <w:t>g</w:t>
+      </w:r>
+      <w:r>
+        <w:rPr>
+          <w:rFonts w:ascii="Arial" w:eastAsia="Times New Roman" w:hAnsi="Arial" w:cs="Times New Roman"/>
+          <w:b/>
+          <w:bCs/>
+          <w:kern w:val="0"/>
+          <w:lang w:eastAsia="tr-TR"/>
+          <w14:ligatures w14:val="none"/>
+        </w:rPr>
+        <w:t>enres:</w:t>
+      </w:r>
+      <w:r>
+        <w:rPr>
+          <w:rFonts w:ascii="Arial" w:eastAsia="Times New Roman" w:hAnsi="Arial" w:cs="Times New Roman"/>
+          <w:kern w:val="0"/>
+          <w:lang w:eastAsia="tr-TR"/>
+          <w14:ligatures w14:val="none"/>
+        </w:rPr>
+        <w:t xml:space="preserve"> Categorical text data representing the movie's genres.</w:t>
+      </w:r>
+    </w:p>
+    <w:p>
+      <w:pPr>
+        <w:numPr>
+          <w:ilvl w:val="0"/>
+          <w:numId w:val="1"/>
+        </w:numPr>
+        <w:spacing w:after="100" w:afterAutospacing="1" w:line="240" w:lineRule="auto"/>
+        <w:rPr>
+          <w:rFonts w:ascii="Arial" w:eastAsia="Times New Roman" w:hAnsi="Arial" w:cs="Times New Roman"/>
+          <w:kern w:val="0"/>
+          <w:lang w:eastAsia="tr-TR"/>
+          <w14:ligatures w14:val="none"/>
+        </w:rPr>
+      </w:pPr>
+      <w:r>
+        <w:rPr>
+          <w:rFonts w:ascii="Arial" w:eastAsia="Times New Roman" w:hAnsi="Arial" w:cs="Times New Roman"/>
+          <w:b/>
+          <w:bCs/>
+          <w:kern w:val="0"/>
+          <w:lang w:eastAsia="tr-TR"/>
+          <w14:ligatures w14:val="none"/>
+        </w:rPr>
+        <w:t>Min-Max Scaled Numerical Ratings:</w:t>
+      </w:r>
+      <w:r>
+        <w:rPr>
+          <w:rFonts w:ascii="Arial" w:eastAsia="Times New Roman" w:hAnsi="Arial" w:cs="Times New Roman"/>
+          <w:kern w:val="0"/>
+          <w:lang w:eastAsia="tr-TR"/>
+          <w14:ligatures w14:val="none"/>
+        </w:rPr>
+        <w:t xml:space="preserve"> Continuous numerical data representing the movie's critical/audience reception via its </w:t>
+      </w:r>
+      <w:r>
+        <w:rPr>
+          <w:rFonts w:ascii="Arial" w:eastAsia="Times New Roman" w:hAnsi="Arial" w:cs="Courier New"/>
+          <w:kern w:val="0"/>
+          <w:sz w:val="20"/>
+          <w:szCs w:val="20"/>
+          <w:lang w:eastAsia="tr-TR"/>
+          <w14:ligatures w14:val="none"/>
+        </w:rPr>
+        <w:t>imdb_score</w:t>
+      </w:r>
+      <w:r>
+        <w:rPr>
+          <w:rFonts w:ascii="Arial" w:eastAsia="Times New Roman" w:hAnsi="Arial" w:cs="Times New Roman"/>
+          <w:kern w:val="0"/>
+          <w:lang w:eastAsia="tr-TR"/>
+          <w14:ligatures w14:val="none"/>
+        </w:rPr>
+        <w:t>.</w:t>
+      </w:r>
+    </w:p>
+    <w:p>
+      <w:pPr>
+        <w:spacing w:after="100" w:afterAutospacing="1" w:line="240" w:lineRule="auto"/>
+        <w:outlineLvl w:val="2"/>
+        <w:rPr>
+          <w:rFonts w:ascii="Arial" w:eastAsia="Times New Roman" w:hAnsi="Arial" w:cs="Times New Roman"/>
+          <w:b/>
+          <w:bCs/>
+          <w:kern w:val="0"/>
+          <w:sz w:val="27"/>
+          <w:szCs w:val="27"/>
+          <w:lang w:eastAsia="tr-TR"/>
+          <w14:ligatures w14:val="none"/>
+        </w:rPr>
+      </w:pPr>
+      <w:r>
+        <w:rPr>
+          <w:rFonts w:ascii="Arial" w:eastAsia="Times New Roman" w:hAnsi="Arial" w:cs="Times New Roman"/>
+          <w:b/>
+          <w:bCs/>
+          <w:kern w:val="0"/>
+          <w:sz w:val="27"/>
+          <w:szCs w:val="27"/>
+          <w:lang w:eastAsia="tr-TR"/>
+          <w14:ligatures w14:val="none"/>
+        </w:rPr>
+        <w:t>2. Justification of Features</w:t>
+      </w:r>
+    </w:p>
+    <w:p>
+      <w:pPr>
+        <w:numPr>
+          <w:ilvl w:val="0"/>
+          <w:numId w:val="2"/>
+        </w:numPr>
+        <w:spacing w:after="100" w:afterAutospacing="1" w:line="240" w:lineRule="auto"/>
+        <w:rPr>
+          <w:rFonts w:ascii="Arial" w:eastAsia="Times New Roman" w:hAnsi="Arial" w:cs="Times New Roman"/>
+          <w:kern w:val="0"/>
+          <w:lang w:eastAsia="tr-TR"/>
+          <w14:ligatures w14:val="none"/>
+        </w:rPr>
+      </w:pPr>
+      <w:r>
+        <w:rPr>
+          <w:rFonts w:ascii="Arial" w:eastAsia="Times New Roman" w:hAnsi="Arial" w:cs="Times New Roman"/>
+          <w:b/>
+          <w:bCs/>
+          <w:kern w:val="0"/>
+          <w:lang w:eastAsia="tr-TR"/>
+          <w14:ligatures w14:val="none"/>
+        </w:rPr>
+        <w:t>Genres (Categorical / Multi-label):</w:t>
+      </w:r>
+      <w:r>
+        <w:rPr>
+          <w:rFonts w:ascii="Arial" w:eastAsia="Times New Roman" w:hAnsi="Arial" w:cs="Times New Roman"/>
+          <w:kern w:val="0"/>
+          <w:lang w:eastAsia="tr-TR"/>
+          <w14:ligatures w14:val="none"/>
+        </w:rPr>
+        <w:t xml:space="preserve"> Movies rarely belong to just a single genre (e.g., </w:t>
+      </w:r>
+      <w:r>
+        <w:rPr>
+          <w:rFonts w:ascii="Arial" w:eastAsia="Times New Roman" w:hAnsi="Arial" w:cs="Times New Roman"/>
+          <w:i/>
+          <w:iCs/>
+          <w:kern w:val="0"/>
+          <w:lang w:eastAsia="tr-TR"/>
+          <w14:ligatures w14:val="none"/>
+        </w:rPr>
+        <w:t>Action|Adventure|Sci-Fi</w:t>
+      </w:r>
+      <w:r>
+        <w:rPr>
+          <w:rFonts w:ascii="Arial" w:eastAsia="Times New Roman" w:hAnsi="Arial" w:cs="Times New Roman"/>
+          <w:kern w:val="0"/>
+          <w:lang w:eastAsia="tr-TR"/>
+          <w14:ligatures w14:val="none"/>
+        </w:rPr>
+        <w:t>). Using a bag-of-words / count vectorizer approach (</w:t>
+      </w:r>
+      <w:r>
+        <w:rPr>
+          <w:rFonts w:ascii="Arial" w:eastAsia="Times New Roman" w:hAnsi="Arial" w:cs="Courier New"/>
+          <w:kern w:val="0"/>
+          <w:sz w:val="20"/>
+          <w:szCs w:val="20"/>
+          <w:lang w:eastAsia="tr-TR"/>
+          <w14:ligatures w14:val="none"/>
+        </w:rPr>
+        <w:t>CountVectorizer</w:t>
+      </w:r>
+      <w:r>
+        <w:rPr>
+          <w:rFonts w:ascii="Arial" w:eastAsia="Times New Roman" w:hAnsi="Arial" w:cs="Times New Roman"/>
+          <w:kern w:val="0"/>
+          <w:lang w:eastAsia="tr-TR"/>
+          <w14:ligatures w14:val="none"/>
+        </w:rPr>
+        <w:t>) split by the pipe (</w:t>
+      </w:r>
+      <w:r>
+        <w:rPr>
+          <w:rFonts w:ascii="Arial" w:eastAsia="Times New Roman" w:hAnsi="Arial" w:cs="Courier New"/>
+          <w:kern w:val="0"/>
+          <w:sz w:val="20"/>
+          <w:szCs w:val="20"/>
+          <w:lang w:eastAsia="tr-TR"/>
+          <w14:ligatures w14:val="none"/>
+        </w:rPr>
+        <w:t>|</w:t>
+      </w:r>
+      <w:r>
+        <w:rPr>
+          <w:rFonts w:ascii="Arial" w:eastAsia="Times New Roman" w:hAnsi="Arial" w:cs="Times New Roman"/>
+          <w:kern w:val="0"/>
+          <w:lang w:eastAsia="tr-TR"/>
+          <w14:ligatures w14:val="none"/>
+        </w:rPr>
+        <w:t xml:space="preserve">) delimiter creates a multi-hot binary vector. This allows the recommender model to capture specific content preferences (e.g., a user who prefers comedies or action films) through the inner product with the user preference vector </w:t>
+      </w:r>
+      <m:oMath>
+        <m:r>
+          <w:rPr>
+            <w:rFonts w:ascii="Cambria Math" w:eastAsia="Times New Roman" w:hAnsi="Cambria Math" w:cs="Times New Roman"/>
+            <w:kern w:val="0"/>
+            <w:lang w:eastAsia="tr-TR"/>
+            <w14:ligatures w14:val="none"/>
+          </w:rPr>
+          <m:t>w</m:t>
+        </m:r>
+      </m:oMath>
+      <w:r>
+        <w:rPr>
+          <w:rFonts w:ascii="Arial" w:eastAsia="Times New Roman" w:hAnsi="Arial" w:cs="Times New Roman"/>
+          <w:kern w:val="0"/>
+          <w:lang w:eastAsia="tr-TR"/>
+          <w14:ligatures w14:val="none"/>
+        </w:rPr>
+        <w:t>.</w:t>
+      </w:r>
+    </w:p>
+    <w:p>
+      <w:pPr>
+        <w:numPr>
+          <w:ilvl w:val="0"/>
+          <w:numId w:val="2"/>
+        </w:numPr>
+        <w:spacing w:after="100" w:afterAutospacing="1" w:line="240" w:lineRule="auto"/>
+        <w:rPr>
+          <w:rFonts w:ascii="Arial" w:eastAsia="Times New Roman" w:hAnsi="Arial" w:cs="Times New Roman"/>
+          <w:kern w:val="0"/>
+          <w:lang w:eastAsia="tr-TR"/>
+          <w14:ligatures w14:val="none"/>
+        </w:rPr>
+      </w:pPr>
+      <w:r>
+        <w:rPr>
+          <w:rFonts w:ascii="Arial" w:eastAsia="Times New Roman" w:hAnsi="Arial" w:cs="Times New Roman"/>
+          <w:b/>
+          <w:bCs/>
+          <w:kern w:val="0"/>
+          <w:lang w:eastAsia="tr-TR"/>
+          <w14:ligatures w14:val="none"/>
+        </w:rPr>
+        <w:t>IMDB Score (Numerical Quality Indicator):</w:t>
+      </w:r>
+      <w:r>
+        <w:rPr>
+          <w:rFonts w:ascii="Arial" w:eastAsia="Times New Roman" w:hAnsi="Arial" w:cs="Times New Roman"/>
+          <w:kern w:val="0"/>
+          <w:lang w:eastAsia="tr-TR"/>
+          <w14:ligatures w14:val="none"/>
+        </w:rPr>
+        <w:t xml:space="preserve"> A movie's rating acts as a reliable proxy for overall quality and general appeal. Applying a </w:t>
+      </w:r>
+      <w:r>
+        <w:rPr>
+          <w:rFonts w:ascii="Arial" w:eastAsia="Times New Roman" w:hAnsi="Arial" w:cs="Courier New"/>
+          <w:kern w:val="0"/>
+          <w:sz w:val="20"/>
+          <w:szCs w:val="20"/>
+          <w:lang w:eastAsia="tr-TR"/>
+          <w14:ligatures w14:val="none"/>
+        </w:rPr>
+        <w:t>MinMaxScaler</w:t>
+      </w:r>
+      <w:r>
+        <w:rPr>
+          <w:rFonts w:ascii="Arial" w:eastAsia="Times New Roman" w:hAnsi="Arial" w:cs="Times New Roman"/>
+          <w:kern w:val="0"/>
+          <w:lang w:eastAsia="tr-TR"/>
+          <w14:ligatures w14:val="none"/>
+        </w:rPr>
+        <w:t xml:space="preserve"> bounds this continuous score between </w:t>
+      </w:r>
+      <m:oMath>
+        <m:r>
+          <w:rPr>
+            <w:rFonts w:ascii="Cambria Math" w:eastAsia="Times New Roman" w:hAnsi="Cambria Math" w:cs="Times New Roman"/>
+            <w:kern w:val="0"/>
+            <w:lang w:eastAsia="tr-TR"/>
+            <w14:ligatures w14:val="none"/>
+          </w:rPr>
+          <m:t>0</m:t>
+        </m:r>
+      </m:oMath>
+      <w:r>
+        <w:rPr>
+          <w:rFonts w:ascii="Arial" w:eastAsia="Times New Roman" w:hAnsi="Arial" w:cs="Times New Roman"/>
+          <w:kern w:val="0"/>
+          <w:lang w:eastAsia="tr-TR"/>
+          <w14:ligatures w14:val="none"/>
+        </w:rPr>
+        <w:t xml:space="preserve"> and </w:t>
+      </w:r>
+      <m:oMath>
+        <m:r>
+          <w:rPr>
+            <w:rFonts w:ascii="Cambria Math" w:eastAsia="Times New Roman" w:hAnsi="Cambria Math" w:cs="Times New Roman"/>
+            <w:kern w:val="0"/>
+            <w:lang w:eastAsia="tr-TR"/>
+            <w14:ligatures w14:val="none"/>
+          </w:rPr>
+          <m:t>1</m:t>
+        </m:r>
+      </m:oMath>
+      <w:r>
+        <w:rPr>
+          <w:rFonts w:ascii="Arial" w:eastAsia="Times New Roman" w:hAnsi="Arial" w:cs="Times New Roman"/>
+          <w:kern w:val="0"/>
+          <w:lang w:eastAsia="tr-TR"/>
+          <w14:ligatures w14:val="none"/>
+        </w:rPr>
+        <w:t>. This normalization is crucial because it ensures that the numerical score doesn't overpower or unfairly dominate the binary genre dimensions during linear utility calculations (</w:t>
+      </w:r>
+      <m:oMath>
+        <m:r>
+          <w:rPr>
+            <w:rFonts w:ascii="Cambria Math" w:eastAsia="Times New Roman" w:hAnsi="Cambria Math" w:cs="Times New Roman"/>
+            <w:kern w:val="0"/>
+            <w:lang w:eastAsia="tr-TR"/>
+            <w14:ligatures w14:val="none"/>
+          </w:rPr>
+          <m:t>u=w⋅x</m:t>
+        </m:r>
+      </m:oMath>
+      <w:r>
+        <w:rPr>
+          <w:rFonts w:ascii="Arial" w:eastAsia="Times New Roman" w:hAnsi="Arial" w:cs="Times New Roman"/>
+          <w:kern w:val="0"/>
+          <w:lang w:eastAsia="tr-TR"/>
+          <w14:ligatures w14:val="none"/>
+        </w:rPr>
+        <w:t>).</w:t>
+      </w:r>
     </w:p>
     <w:p>
       <w:pPr>
@@ -224,6 +1061,279 @@
     </w:sectPr>
   </w:body>
 </w:document>
+</file>
+
+<file path=word/numbering.xml><?xml version="1.0" encoding="utf-8"?>
+<w:numbering xmlns:wpc="http://schemas.microsoft.com/office/word/2010/wordprocessingCanvas" xmlns:cx="http://schemas.microsoft.com/office/drawing/2014/chartex" xmlns:cx1="http://schemas.microsoft.com/office/drawing/2015/9/8/chartex" xmlns:cx2="http://schemas.microsoft.com/office/drawing/2015/10/21/chartex" xmlns:cx3="http://schemas.microsoft.com/office/drawing/2016/5/9/chartex" xmlns:cx4="http://schemas.microsoft.com/office/drawing/2016/5/10/chartex" xmlns:cx5="http://schemas.microsoft.com/office/drawing/2016/5/11/chartex" xmlns:cx6="http://schemas.microsoft.com/office/drawing/2016/5/12/chartex" xmlns:cx7="http://schemas.microsoft.com/office/drawing/2016/5/13/chartex" xmlns:cx8="http://schemas.microsoft.com/office/drawing/2016/5/14/chartex" xmlns:mc="http://schemas.openxmlformats.org/markup-compatibility/2006" xmlns:m="http://schemas.openxmlformats.org/officeDocument/2006/math" xmlns:aink="http://schemas.microsoft.com/office/drawing/2016/ink" xmlns:am3d="http://schemas.microsoft.com/office/drawing/2017/model3d" xmlns:oel="http://schemas.microsoft.com/office/2019/extlst" xmlns:r="http://schemas.openxmlformats.org/officeDocument/2006/relationships" xmlns:wp14="http://schemas.microsoft.com/office/word/2010/wordprocessingDrawing" xmlns:wp="http://schemas.openxmlformats.org/drawingml/2006/wordprocessingDrawing" xmlns:wpg="http://schemas.microsoft.com/office/word/2010/wordprocessingGroup" xmlns:wpi="http://schemas.microsoft.com/office/word/2010/wordprocessingInk" xmlns:wps="http://schemas.microsoft.com/office/word/2010/wordprocessingShape" xmlns:o="urn:schemas-microsoft-com:office:office" xmlns:v="urn:schemas-microsoft-com:vml" xmlns:w10="urn:schemas-microsoft-com:office:word" xmlns:w="http://schemas.openxmlformats.org/wordprocessingml/2006/main" xmlns:w14="http://schemas.microsoft.com/office/word/2010/wordml" xmlns:w15="http://schemas.microsoft.com/office/word/2012/wordml" xmlns:w16cex="http://schemas.microsoft.com/office/word/2018/wordml/cex" xmlns:w16cid="http://schemas.microsoft.com/office/word/2016/wordml/cid" xmlns:w16="http://schemas.microsoft.com/office/word/2018/wordml" xmlns:w16sdtdh="http://schemas.microsoft.com/office/word/2020/wordml/sdtdatahash" xmlns:w16sdtfl="http://schemas.microsoft.com/office/word/2024/wordml/sdtformatlock" xmlns:w16se="http://schemas.microsoft.com/office/word/2015/wordml/symex" xmlns:w16du="http://schemas.microsoft.com/office/word/2023/wordml/word16du" xmlns:wne="http://schemas.microsoft.com/office/word/2006/wordml" mc:Ignorable="w14 w15 w16se w16cid w16 w16cex w16sdtdh w16sdtfl w16du wp14">
+  <w:abstractNum w:abstractNumId="0" w15:restartNumberingAfterBreak="0">
+    <w:nsid w:val="1E183B5D"/>
+    <w:multiLevelType w:val="multilevel"/>
+    <w:tmpl w:val="3ECCA39A"/>
+    <w:lvl w:ilvl="0">
+      <w:start w:val="1"/>
+      <w:numFmt w:val="bullet"/>
+      <w:lvlText w:val=""/>
+      <w:lvlJc w:val="left"/>
+      <w:pPr>
+        <w:tabs>
+          <w:tab w:val="num" w:pos="720"/>
+        </w:tabs>
+        <w:ind w:left="720" w:hanging="360"/>
+      </w:pPr>
+      <w:rPr>
+        <w:rFonts w:ascii="Symbol" w:hAnsi="Symbol" w:hint="default"/>
+        <w:sz w:val="20"/>
+      </w:rPr>
+    </w:lvl>
+    <w:lvl w:ilvl="1" w:tentative="1">
+      <w:start w:val="1"/>
+      <w:numFmt w:val="bullet"/>
+      <w:lvlText w:val="o"/>
+      <w:lvlJc w:val="left"/>
+      <w:pPr>
+        <w:tabs>
+          <w:tab w:val="num" w:pos="1440"/>
+        </w:tabs>
+        <w:ind w:left="1440" w:hanging="360"/>
+      </w:pPr>
+      <w:rPr>
+        <w:rFonts w:ascii="Courier New" w:hAnsi="Courier New" w:hint="default"/>
+        <w:sz w:val="20"/>
+      </w:rPr>
+    </w:lvl>
+    <w:lvl w:ilvl="2" w:tentative="1">
+      <w:start w:val="1"/>
+      <w:numFmt w:val="bullet"/>
+      <w:lvlText w:val=""/>
+      <w:lvlJc w:val="left"/>
+      <w:pPr>
+        <w:tabs>
+          <w:tab w:val="num" w:pos="2160"/>
+        </w:tabs>
+        <w:ind w:left="2160" w:hanging="360"/>
+      </w:pPr>
+      <w:rPr>
+        <w:rFonts w:ascii="Wingdings" w:hAnsi="Wingdings" w:hint="default"/>
+        <w:sz w:val="20"/>
+      </w:rPr>
+    </w:lvl>
+    <w:lvl w:ilvl="3" w:tentative="1">
+      <w:start w:val="1"/>
+      <w:numFmt w:val="bullet"/>
+      <w:lvlText w:val=""/>
+      <w:lvlJc w:val="left"/>
+      <w:pPr>
+        <w:tabs>
+          <w:tab w:val="num" w:pos="2880"/>
+        </w:tabs>
+        <w:ind w:left="2880" w:hanging="360"/>
+      </w:pPr>
+      <w:rPr>
+        <w:rFonts w:ascii="Wingdings" w:hAnsi="Wingdings" w:hint="default"/>
+        <w:sz w:val="20"/>
+      </w:rPr>
+    </w:lvl>
+    <w:lvl w:ilvl="4" w:tentative="1">
+      <w:start w:val="1"/>
+      <w:numFmt w:val="bullet"/>
+      <w:lvlText w:val=""/>
+      <w:lvlJc w:val="left"/>
+      <w:pPr>
+        <w:tabs>
+          <w:tab w:val="num" w:pos="3600"/>
+        </w:tabs>
+        <w:ind w:left="3600" w:hanging="360"/>
+      </w:pPr>
+      <w:rPr>
+        <w:rFonts w:ascii="Wingdings" w:hAnsi="Wingdings" w:hint="default"/>
+        <w:sz w:val="20"/>
+      </w:rPr>
+    </w:lvl>
+    <w:lvl w:ilvl="5" w:tentative="1">
+      <w:start w:val="1"/>
+      <w:numFmt w:val="bullet"/>
+      <w:lvlText w:val=""/>
+      <w:lvlJc w:val="left"/>
+      <w:pPr>
+        <w:tabs>
+          <w:tab w:val="num" w:pos="4320"/>
+        </w:tabs>
+        <w:ind w:left="4320" w:hanging="360"/>
+      </w:pPr>
+      <w:rPr>
+        <w:rFonts w:ascii="Wingdings" w:hAnsi="Wingdings" w:hint="default"/>
+        <w:sz w:val="20"/>
+      </w:rPr>
+    </w:lvl>
+    <w:lvl w:ilvl="6" w:tentative="1">
+      <w:start w:val="1"/>
+      <w:numFmt w:val="bullet"/>
+      <w:lvlText w:val=""/>
+      <w:lvlJc w:val="left"/>
+      <w:pPr>
+        <w:tabs>
+          <w:tab w:val="num" w:pos="5040"/>
+        </w:tabs>
+        <w:ind w:left="5040" w:hanging="360"/>
+      </w:pPr>
+      <w:rPr>
+        <w:rFonts w:ascii="Wingdings" w:hAnsi="Wingdings" w:hint="default"/>
+        <w:sz w:val="20"/>
+      </w:rPr>
+    </w:lvl>
+    <w:lvl w:ilvl="7" w:tentative="1">
+      <w:start w:val="1"/>
+      <w:numFmt w:val="bullet"/>
+      <w:lvlText w:val=""/>
+      <w:lvlJc w:val="left"/>
+      <w:pPr>
+        <w:tabs>
+          <w:tab w:val="num" w:pos="5760"/>
+        </w:tabs>
+        <w:ind w:left="5760" w:hanging="360"/>
+      </w:pPr>
+      <w:rPr>
+        <w:rFonts w:ascii="Wingdings" w:hAnsi="Wingdings" w:hint="default"/>
+        <w:sz w:val="20"/>
+      </w:rPr>
+    </w:lvl>
+    <w:lvl w:ilvl="8" w:tentative="1">
+      <w:start w:val="1"/>
+      <w:numFmt w:val="bullet"/>
+      <w:lvlText w:val=""/>
+      <w:lvlJc w:val="left"/>
+      <w:pPr>
+        <w:tabs>
+          <w:tab w:val="num" w:pos="6480"/>
+        </w:tabs>
+        <w:ind w:left="6480" w:hanging="360"/>
+      </w:pPr>
+      <w:rPr>
+        <w:rFonts w:ascii="Wingdings" w:hAnsi="Wingdings" w:hint="default"/>
+        <w:sz w:val="20"/>
+      </w:rPr>
+    </w:lvl>
+  </w:abstractNum>
+  <w:abstractNum w:abstractNumId="1" w15:restartNumberingAfterBreak="0">
+    <w:nsid w:val="64974D7D"/>
+    <w:multiLevelType w:val="multilevel"/>
+    <w:tmpl w:val="568A6E3E"/>
+    <w:lvl w:ilvl="0">
+      <w:start w:val="1"/>
+      <w:numFmt w:val="decimal"/>
+      <w:lvlText w:val="%1."/>
+      <w:lvlJc w:val="left"/>
+      <w:pPr>
+        <w:tabs>
+          <w:tab w:val="num" w:pos="720"/>
+        </w:tabs>
+        <w:ind w:left="720" w:hanging="360"/>
+      </w:pPr>
+    </w:lvl>
+    <w:lvl w:ilvl="1" w:tentative="1">
+      <w:start w:val="1"/>
+      <w:numFmt w:val="decimal"/>
+      <w:lvlText w:val="%2."/>
+      <w:lvlJc w:val="left"/>
+      <w:pPr>
+        <w:tabs>
+          <w:tab w:val="num" w:pos="1440"/>
+        </w:tabs>
+        <w:ind w:left="1440" w:hanging="360"/>
+      </w:pPr>
+    </w:lvl>
+    <w:lvl w:ilvl="2" w:tentative="1">
+      <w:start w:val="1"/>
+      <w:numFmt w:val="decimal"/>
+      <w:lvlText w:val="%3."/>
+      <w:lvlJc w:val="left"/>
+      <w:pPr>
+        <w:tabs>
+          <w:tab w:val="num" w:pos="2160"/>
+        </w:tabs>
+        <w:ind w:left="2160" w:hanging="360"/>
+      </w:pPr>
+    </w:lvl>
+    <w:lvl w:ilvl="3" w:tentative="1">
+      <w:start w:val="1"/>
+      <w:numFmt w:val="decimal"/>
+      <w:lvlText w:val="%4."/>
+      <w:lvlJc w:val="left"/>
+      <w:pPr>
+        <w:tabs>
+          <w:tab w:val="num" w:pos="2880"/>
+        </w:tabs>
+        <w:ind w:left="2880" w:hanging="360"/>
+      </w:pPr>
+    </w:lvl>
+    <w:lvl w:ilvl="4" w:tentative="1">
+      <w:start w:val="1"/>
+      <w:numFmt w:val="decimal"/>
+      <w:lvlText w:val="%5."/>
+      <w:lvlJc w:val="left"/>
+      <w:pPr>
+        <w:tabs>
+          <w:tab w:val="num" w:pos="3600"/>
+        </w:tabs>
+        <w:ind w:left="3600" w:hanging="360"/>
+      </w:pPr>
+    </w:lvl>
+    <w:lvl w:ilvl="5" w:tentative="1">
+      <w:start w:val="1"/>
+      <w:numFmt w:val="decimal"/>
+      <w:lvlText w:val="%6."/>
+      <w:lvlJc w:val="left"/>
+      <w:pPr>
+        <w:tabs>
+          <w:tab w:val="num" w:pos="4320"/>
+        </w:tabs>
+        <w:ind w:left="4320" w:hanging="360"/>
+      </w:pPr>
+    </w:lvl>
+    <w:lvl w:ilvl="6" w:tentative="1">
+      <w:start w:val="1"/>
+      <w:numFmt w:val="decimal"/>
+      <w:lvlText w:val="%7."/>
+      <w:lvlJc w:val="left"/>
+      <w:pPr>
+        <w:tabs>
+          <w:tab w:val="num" w:pos="5040"/>
+        </w:tabs>
+        <w:ind w:left="5040" w:hanging="360"/>
+      </w:pPr>
+    </w:lvl>
+    <w:lvl w:ilvl="7" w:tentative="1">
+      <w:start w:val="1"/>
+      <w:numFmt w:val="decimal"/>
+      <w:lvlText w:val="%8."/>
+      <w:lvlJc w:val="left"/>
+      <w:pPr>
+        <w:tabs>
+          <w:tab w:val="num" w:pos="5760"/>
+        </w:tabs>
+        <w:ind w:left="5760" w:hanging="360"/>
+      </w:pPr>
+    </w:lvl>
+    <w:lvl w:ilvl="8" w:tentative="1">
+      <w:start w:val="1"/>
+      <w:numFmt w:val="decimal"/>
+      <w:lvlText w:val="%9."/>
+      <w:lvlJc w:val="left"/>
+      <w:pPr>
+        <w:tabs>
+          <w:tab w:val="num" w:pos="6480"/>
+        </w:tabs>
+        <w:ind w:left="6480" w:hanging="360"/>
+      </w:pPr>
+    </w:lvl>
+  </w:abstractNum>
+  <w:num w:numId="1" w16cid:durableId="1332443257">
+    <w:abstractNumId w:val="1"/>
+  </w:num>
+  <w:num w:numId="2" w16cid:durableId="1659072683">
+    <w:abstractNumId w:val="0"/>
+  </w:num>
+</w:numbering>
 </file>
 
 <file path=word/styles.xml><?xml version="1.0" encoding="utf-8"?>
@@ -677,7 +1787,6 @@
     <w:next w:val="Normal"/>
     <w:link w:val="Balk3Char"/>
     <w:uiPriority w:val="9"/>
-    <w:semiHidden/>
     <w:unhideWhenUsed/>
     <w:qFormat/>
     <w:rsid w:val="00ED240F"/>
@@ -885,7 +1994,6 @@
     <w:basedOn w:val="VarsaylanParagrafYazTipi"/>
     <w:link w:val="Balk3"/>
     <w:uiPriority w:val="9"/>
-    <w:semiHidden/>
     <w:rsid w:val="00ED240F"/>
     <w:rPr>
       <w:rFonts w:eastAsiaTheme="majorEastAsia" w:cstheme="majorBidi"/>
@@ -1141,6 +2249,53 @@
       <w:smallCaps/>
       <w:color w:val="0F4761" w:themeColor="accent1" w:themeShade="BF"/>
       <w:spacing w:val="5"/>
+    </w:rPr>
+  </w:style>
+  <w:style w:type="paragraph" w:customStyle="1" w:styleId="p1">
+    <w:name w:val="p1"/>
+    <w:basedOn w:val="Normal"/>
+    <w:rsid w:val="00452F82"/>
+    <w:pPr>
+      <w:spacing w:after="0" w:line="240" w:lineRule="auto"/>
+    </w:pPr>
+    <w:rPr>
+      <w:rFonts w:ascii="Helvetica" w:eastAsia="Times New Roman" w:hAnsi="Helvetica" w:cs="Times New Roman"/>
+      <w:color w:val="000000"/>
+      <w:kern w:val="0"/>
+      <w:sz w:val="18"/>
+      <w:szCs w:val="18"/>
+      <w:lang w:eastAsia="tr-TR"/>
+      <w14:ligatures w14:val="none"/>
+    </w:rPr>
+  </w:style>
+  <w:style w:type="paragraph" w:styleId="NormalWeb">
+    <w:name w:val="Normal (Web)"/>
+    <w:basedOn w:val="Normal"/>
+    <w:uiPriority w:val="99"/>
+    <w:semiHidden/>
+    <w:unhideWhenUsed/>
+    <w:rsid w:val="008E22AD"/>
+    <w:pPr>
+      <w:spacing w:before="100" w:beforeAutospacing="1" w:after="100" w:afterAutospacing="1" w:line="240" w:lineRule="auto"/>
+    </w:pPr>
+    <w:rPr>
+      <w:rFonts w:ascii="Times New Roman" w:eastAsia="Times New Roman" w:hAnsi="Times New Roman" w:cs="Times New Roman"/>
+      <w:kern w:val="0"/>
+      <w:lang w:eastAsia="tr-TR"/>
+      <w14:ligatures w14:val="none"/>
+    </w:rPr>
+  </w:style>
+  <w:style w:type="character" w:styleId="HTMLKodu">
+    <w:name w:val="HTML Code"/>
+    <w:basedOn w:val="VarsaylanParagrafYazTipi"/>
+    <w:uiPriority w:val="99"/>
+    <w:semiHidden/>
+    <w:unhideWhenUsed/>
+    <w:rsid w:val="008E22AD"/>
+    <w:rPr>
+      <w:rFonts w:ascii="Courier New" w:eastAsia="Times New Roman" w:hAnsi="Courier New" w:cs="Courier New"/>
+      <w:sz w:val="20"/>
+      <w:szCs w:val="20"/>
     </w:rPr>
   </w:style>
 </w:styles>

</xml_diff>

<commit_message>
removed the project5 boilerplate codes written
</commit_message>
<xml_diff>
--- a/static/Project_4_Report.docx
+++ b/static/Project_4_Report.docx
@@ -222,115 +222,989 @@
           <w:u w:val="single"/>
           <w:lang w:val="tr-TR"/>
         </w:rPr>
-        <w:t xml:space="preserve"> 1 </w:t>
-      </w:r>
-      <w:proofErr w:type="spellStart"/>
-      <w:r>
-        <w:rPr>
-          <w:b/>
-          <w:bCs/>
-          <w:u w:val="single"/>
-          <w:lang w:val="tr-TR"/>
-        </w:rPr>
-        <w:t>Justification</w:t>
-      </w:r>
-      <w:proofErr w:type="spellEnd"/>
-      <w:r>
-        <w:rPr>
-          <w:b/>
-          <w:bCs/>
-          <w:u w:val="single"/>
-          <w:lang w:val="tr-TR"/>
-        </w:rPr>
-        <w:t xml:space="preserve">: </w:t>
+        <w:t xml:space="preserve"> 1: </w:t>
       </w:r>
     </w:p>
     <w:p>
       <w:pPr>
-        <w:rPr>
-          <w:b/>
-          <w:bCs/>
-          <w:u w:val="single"/>
-          <w:lang w:val="tr-TR"/>
-        </w:rPr>
-      </w:pPr>
-      <w:proofErr w:type="spellStart"/>
-      <w:r>
-        <w:rPr>
-          <w:b/>
-          <w:bCs/>
-          <w:u w:val="single"/>
-          <w:lang w:val="tr-TR"/>
-        </w:rPr>
-        <w:t>Task</w:t>
-      </w:r>
-      <w:proofErr w:type="spellEnd"/>
-      <w:r>
-        <w:rPr>
-          <w:b/>
-          <w:bCs/>
-          <w:u w:val="single"/>
-          <w:lang w:val="tr-TR"/>
-        </w:rPr>
-        <w:t xml:space="preserve"> 1: </w:t>
+        <w:pStyle w:val="p1"/>
+        <w:spacing w:line="360" w:lineRule="auto"/>
+        <w:jc w:val="both"/>
+        <w:rPr>
+          <w:rFonts w:ascii="Times New Roman" w:hAnsi="Times New Roman"/>
+          <w:sz w:val="24"/>
+          <w:szCs w:val="24"/>
+        </w:rPr>
+      </w:pPr>
+      <w:r>
+        <w:rPr>
+          <w:rFonts w:ascii="Times New Roman" w:hAnsi="Times New Roman"/>
+          <w:sz w:val="24"/>
+          <w:szCs w:val="24"/>
+        </w:rPr>
+        <w:tab/>
+      </w:r>
+      <w:r>
+        <w:rPr>
+          <w:rFonts w:ascii="Times New Roman" w:hAnsi="Times New Roman"/>
+          <w:sz w:val="24"/>
+          <w:szCs w:val="24"/>
+        </w:rPr>
+        <w:t xml:space="preserve">I have used a hybrid approach for the feature representation. It </w:t>
+      </w:r>
+      <w:r>
+        <w:rPr>
+          <w:rFonts w:ascii="Times New Roman" w:hAnsi="Times New Roman"/>
+          <w:sz w:val="24"/>
+          <w:szCs w:val="24"/>
+        </w:rPr>
+        <w:t>combines</w:t>
+      </w:r>
+      <w:r>
+        <w:rPr>
+          <w:rFonts w:ascii="Times New Roman" w:hAnsi="Times New Roman"/>
+          <w:sz w:val="24"/>
+          <w:szCs w:val="24"/>
+        </w:rPr>
+        <w:t xml:space="preserve"> 2 components: </w:t>
+      </w:r>
+      <w:r>
+        <w:rPr>
+          <w:rFonts w:ascii="Times New Roman" w:hAnsi="Times New Roman"/>
+          <w:b/>
+          <w:bCs/>
+          <w:sz w:val="24"/>
+          <w:szCs w:val="24"/>
+        </w:rPr>
+        <w:t>“Multi-Hot Encoded Movie Genres”</w:t>
+      </w:r>
+      <w:r>
+        <w:rPr>
+          <w:rFonts w:ascii="Times New Roman" w:hAnsi="Times New Roman"/>
+          <w:sz w:val="24"/>
+          <w:szCs w:val="24"/>
+        </w:rPr>
+        <w:t xml:space="preserve"> and </w:t>
+      </w:r>
+      <w:r>
+        <w:rPr>
+          <w:rFonts w:ascii="Times New Roman" w:hAnsi="Times New Roman"/>
+          <w:b/>
+          <w:bCs/>
+          <w:sz w:val="24"/>
+          <w:szCs w:val="24"/>
+        </w:rPr>
+        <w:t>“Minimum-Maximum Scaled Numerical Rating Values”</w:t>
+      </w:r>
+      <w:r>
+        <w:rPr>
+          <w:rFonts w:ascii="Times New Roman" w:hAnsi="Times New Roman"/>
+          <w:sz w:val="24"/>
+          <w:szCs w:val="24"/>
+        </w:rPr>
+        <w:t xml:space="preserve">. </w:t>
+      </w:r>
+      <w:r>
+        <w:rPr>
+          <w:rFonts w:ascii="Times New Roman" w:hAnsi="Times New Roman"/>
+          <w:sz w:val="24"/>
+          <w:szCs w:val="24"/>
+        </w:rPr>
+        <w:t xml:space="preserve"> </w:t>
+      </w:r>
+      <w:r>
+        <w:rPr>
+          <w:rFonts w:ascii="Times New Roman" w:hAnsi="Times New Roman"/>
+          <w:b/>
+          <w:bCs/>
+          <w:sz w:val="24"/>
+          <w:szCs w:val="24"/>
+        </w:rPr>
+        <w:t>“Multi-Hot Encoded Genres”</w:t>
+      </w:r>
+      <w:r>
+        <w:rPr>
+          <w:rFonts w:ascii="Times New Roman" w:hAnsi="Times New Roman"/>
+          <w:b/>
+          <w:bCs/>
+          <w:sz w:val="24"/>
+          <w:szCs w:val="24"/>
+        </w:rPr>
+        <w:t xml:space="preserve"> </w:t>
+      </w:r>
+      <w:r>
+        <w:rPr>
+          <w:rFonts w:ascii="Times New Roman" w:hAnsi="Times New Roman"/>
+          <w:sz w:val="24"/>
+          <w:szCs w:val="24"/>
+        </w:rPr>
+        <w:t>includes the categorical text data</w:t>
+      </w:r>
+      <w:r>
+        <w:rPr>
+          <w:rFonts w:ascii="Times New Roman" w:hAnsi="Times New Roman"/>
+          <w:sz w:val="24"/>
+          <w:szCs w:val="24"/>
+        </w:rPr>
+        <w:t xml:space="preserve"> that</w:t>
+      </w:r>
+      <w:r>
+        <w:rPr>
+          <w:rFonts w:ascii="Times New Roman" w:hAnsi="Times New Roman"/>
+          <w:sz w:val="24"/>
+          <w:szCs w:val="24"/>
+        </w:rPr>
+        <w:t xml:space="preserve"> represent</w:t>
+      </w:r>
+      <w:r>
+        <w:rPr>
+          <w:rFonts w:ascii="Times New Roman" w:hAnsi="Times New Roman"/>
+          <w:sz w:val="24"/>
+          <w:szCs w:val="24"/>
+        </w:rPr>
+        <w:t>s</w:t>
+      </w:r>
+      <w:r>
+        <w:rPr>
+          <w:rFonts w:ascii="Times New Roman" w:hAnsi="Times New Roman"/>
+          <w:sz w:val="24"/>
+          <w:szCs w:val="24"/>
+        </w:rPr>
+        <w:t xml:space="preserve"> </w:t>
+      </w:r>
+      <w:r>
+        <w:rPr>
+          <w:rFonts w:ascii="Times New Roman" w:hAnsi="Times New Roman"/>
+          <w:sz w:val="24"/>
+          <w:szCs w:val="24"/>
+        </w:rPr>
+        <w:t xml:space="preserve">the genres of the movie. </w:t>
+      </w:r>
+      <w:r>
+        <w:rPr>
+          <w:rFonts w:ascii="Times New Roman" w:hAnsi="Times New Roman"/>
+          <w:b/>
+          <w:bCs/>
+          <w:sz w:val="24"/>
+          <w:szCs w:val="24"/>
+        </w:rPr>
+        <w:t xml:space="preserve">“Minimum-Maximum Scaled Numerical Ratings” </w:t>
+      </w:r>
+      <w:r>
+        <w:rPr>
+          <w:rFonts w:ascii="Times New Roman" w:hAnsi="Times New Roman"/>
+          <w:sz w:val="24"/>
+          <w:szCs w:val="24"/>
+        </w:rPr>
+        <w:t xml:space="preserve">includes continuous numerical data that represents the user and critic </w:t>
+      </w:r>
+      <w:r>
+        <w:rPr>
+          <w:rFonts w:ascii="Times New Roman" w:hAnsi="Times New Roman"/>
+          <w:sz w:val="24"/>
+          <w:szCs w:val="24"/>
+        </w:rPr>
+        <w:t>evaluations and feedback given to the movie</w:t>
+      </w:r>
+      <w:r>
+        <w:rPr>
+          <w:rFonts w:ascii="Times New Roman" w:hAnsi="Times New Roman"/>
+          <w:sz w:val="24"/>
+          <w:szCs w:val="24"/>
+        </w:rPr>
+        <w:t xml:space="preserve"> by using the corresponding </w:t>
+      </w:r>
+      <w:r>
+        <w:rPr>
+          <w:rFonts w:ascii="Times New Roman" w:hAnsi="Times New Roman"/>
+          <w:b/>
+          <w:bCs/>
+          <w:sz w:val="24"/>
+          <w:szCs w:val="24"/>
+        </w:rPr>
+        <w:t>‘imdb_score’</w:t>
+      </w:r>
+      <w:r>
+        <w:rPr>
+          <w:rFonts w:ascii="Times New Roman" w:hAnsi="Times New Roman"/>
+          <w:sz w:val="24"/>
+          <w:szCs w:val="24"/>
+        </w:rPr>
+        <w:t xml:space="preserve"> value</w:t>
+      </w:r>
+      <w:r>
+        <w:rPr>
+          <w:rFonts w:ascii="Times New Roman" w:hAnsi="Times New Roman"/>
+          <w:sz w:val="24"/>
+          <w:szCs w:val="24"/>
+        </w:rPr>
+        <w:t xml:space="preserve"> of that movie. </w:t>
       </w:r>
     </w:p>
     <w:p>
       <w:pPr>
         <w:pStyle w:val="p1"/>
-        <w:rPr>
-          <w:sz w:val="24"/>
-          <w:szCs w:val="24"/>
-        </w:rPr>
-      </w:pPr>
-      <w:r>
-        <w:rPr>
-          <w:sz w:val="24"/>
-          <w:szCs w:val="24"/>
-        </w:rPr>
-        <w:t>Choose a feature representation that you believe is appropriate for a movie recom</w:t>
-      </w:r>
-      <w:r>
-        <w:rPr>
-          <w:sz w:val="24"/>
-          <w:szCs w:val="24"/>
-        </w:rPr>
-        <w:t xml:space="preserve">mender </w:t>
-      </w:r>
-      <w:r>
-        <w:rPr>
-          <w:sz w:val="24"/>
-          <w:szCs w:val="24"/>
-        </w:rPr>
-        <w:t>system. Justify your choice of features and write a method to extract them</w:t>
-      </w:r>
-      <w:r>
-        <w:rPr>
-          <w:sz w:val="24"/>
-          <w:szCs w:val="24"/>
-        </w:rPr>
-        <w:t xml:space="preserve"> </w:t>
-      </w:r>
-      <w:r>
-        <w:rPr>
-          <w:sz w:val="24"/>
-          <w:szCs w:val="24"/>
-        </w:rPr>
-        <w:t>from the dataset.</w:t>
-      </w:r>
+        <w:spacing w:line="360" w:lineRule="auto"/>
+        <w:jc w:val="both"/>
+        <w:rPr>
+          <w:rFonts w:ascii="Times New Roman" w:hAnsi="Times New Roman"/>
+          <w:sz w:val="24"/>
+          <w:szCs w:val="24"/>
+        </w:rPr>
+      </w:pPr>
     </w:p>
     <w:p>
       <w:pPr>
         <w:pStyle w:val="p1"/>
-        <w:rPr>
-          <w:sz w:val="24"/>
-          <w:szCs w:val="24"/>
-        </w:rPr>
-      </w:pPr>
+        <w:spacing w:line="360" w:lineRule="auto"/>
+        <w:jc w:val="both"/>
+        <w:rPr>
+          <w:rFonts w:ascii="Times New Roman" w:hAnsi="Times New Roman"/>
+          <w:sz w:val="24"/>
+          <w:szCs w:val="24"/>
+        </w:rPr>
+      </w:pPr>
+      <w:r>
+        <w:rPr>
+          <w:rFonts w:ascii="Times New Roman" w:hAnsi="Times New Roman"/>
+          <w:sz w:val="24"/>
+          <w:szCs w:val="24"/>
+        </w:rPr>
+        <w:tab/>
+        <w:t xml:space="preserve">Movies in the dataset usually do not belong to just a single type (e.g., Sci-Fi | Action | Adventure). </w:t>
+      </w:r>
+      <w:r>
+        <w:rPr>
+          <w:rFonts w:ascii="Times New Roman" w:hAnsi="Times New Roman"/>
+          <w:sz w:val="24"/>
+          <w:szCs w:val="24"/>
+        </w:rPr>
+        <w:t xml:space="preserve">For instance, the first movie entry located in the first row has a genres column with the value of </w:t>
+      </w:r>
+      <w:r>
+        <w:rPr>
+          <w:rFonts w:ascii="Times New Roman" w:hAnsi="Times New Roman"/>
+          <w:b/>
+          <w:bCs/>
+          <w:sz w:val="24"/>
+          <w:szCs w:val="24"/>
+        </w:rPr>
+        <w:t>"Action|Adventure|Fantasy|Sci-Fi"</w:t>
+      </w:r>
+      <w:r>
+        <w:rPr>
+          <w:rFonts w:ascii="Times New Roman" w:hAnsi="Times New Roman"/>
+          <w:sz w:val="24"/>
+          <w:szCs w:val="24"/>
+        </w:rPr>
+        <w:t>, which means that this movie is included in 4 movie genres</w:t>
+      </w:r>
+      <w:r>
+        <w:rPr>
+          <w:rFonts w:ascii="Times New Roman" w:hAnsi="Times New Roman"/>
+          <w:sz w:val="24"/>
+          <w:szCs w:val="24"/>
+        </w:rPr>
+        <w:t>,</w:t>
+      </w:r>
+      <w:r>
+        <w:rPr>
+          <w:rFonts w:ascii="Times New Roman" w:hAnsi="Times New Roman"/>
+          <w:sz w:val="24"/>
+          <w:szCs w:val="24"/>
+        </w:rPr>
+        <w:t xml:space="preserve"> which are </w:t>
+      </w:r>
+      <w:r>
+        <w:rPr>
+          <w:rFonts w:ascii="Times New Roman" w:hAnsi="Times New Roman"/>
+          <w:b/>
+          <w:bCs/>
+          <w:sz w:val="24"/>
+          <w:szCs w:val="24"/>
+        </w:rPr>
+        <w:t>"Action", "Fantasy", "Adventure", and "Sci-Fi".</w:t>
+      </w:r>
+      <w:r>
+        <w:rPr>
+          <w:rFonts w:ascii="Times New Roman" w:hAnsi="Times New Roman"/>
+          <w:sz w:val="24"/>
+          <w:szCs w:val="24"/>
+        </w:rPr>
+        <w:t xml:space="preserve"> </w:t>
+      </w:r>
+      <w:r>
+        <w:rPr>
+          <w:rFonts w:ascii="Times New Roman" w:hAnsi="Times New Roman"/>
+          <w:sz w:val="24"/>
+          <w:szCs w:val="24"/>
+        </w:rPr>
+        <w:t xml:space="preserve">In this dataset, each movie </w:t>
+      </w:r>
+      <w:r>
+        <w:rPr>
+          <w:rFonts w:ascii="Times New Roman" w:hAnsi="Times New Roman"/>
+          <w:sz w:val="24"/>
+          <w:szCs w:val="24"/>
+        </w:rPr>
+        <w:t>can belong</w:t>
+      </w:r>
+      <w:r>
+        <w:rPr>
+          <w:rFonts w:ascii="Times New Roman" w:hAnsi="Times New Roman"/>
+          <w:sz w:val="24"/>
+          <w:szCs w:val="24"/>
+        </w:rPr>
+        <w:t xml:space="preserve"> to multiple genres</w:t>
+      </w:r>
+      <w:r>
+        <w:rPr>
+          <w:rFonts w:ascii="Times New Roman" w:hAnsi="Times New Roman"/>
+          <w:sz w:val="24"/>
+          <w:szCs w:val="24"/>
+        </w:rPr>
+        <w:t xml:space="preserve"> (multi-label or categorical movie genres)</w:t>
+      </w:r>
+      <w:r>
+        <w:rPr>
+          <w:rFonts w:ascii="Times New Roman" w:hAnsi="Times New Roman"/>
+          <w:sz w:val="24"/>
+          <w:szCs w:val="24"/>
+        </w:rPr>
+        <w:t>. Therefore,</w:t>
+      </w:r>
+      <w:r>
+        <w:rPr>
+          <w:rFonts w:ascii="Times New Roman" w:hAnsi="Times New Roman"/>
+          <w:sz w:val="24"/>
+          <w:szCs w:val="24"/>
+        </w:rPr>
+        <w:t xml:space="preserve"> </w:t>
+      </w:r>
+      <w:r>
+        <w:rPr>
+          <w:rFonts w:ascii="Times New Roman" w:hAnsi="Times New Roman"/>
+          <w:sz w:val="24"/>
+          <w:szCs w:val="24"/>
+        </w:rPr>
+        <w:t>I</w:t>
+      </w:r>
+      <w:r>
+        <w:rPr>
+          <w:rFonts w:ascii="Times New Roman" w:hAnsi="Times New Roman"/>
+          <w:sz w:val="24"/>
+          <w:szCs w:val="24"/>
+        </w:rPr>
+        <w:t xml:space="preserve"> </w:t>
+      </w:r>
+      <w:r>
+        <w:rPr>
+          <w:rFonts w:ascii="Times New Roman" w:hAnsi="Times New Roman"/>
+          <w:sz w:val="24"/>
+          <w:szCs w:val="24"/>
+        </w:rPr>
+        <w:t>have used a count</w:t>
+      </w:r>
+      <w:r>
+        <w:rPr>
+          <w:rFonts w:ascii="Times New Roman" w:hAnsi="Times New Roman"/>
+          <w:sz w:val="24"/>
+          <w:szCs w:val="24"/>
+        </w:rPr>
+        <w:t xml:space="preserve"> </w:t>
+      </w:r>
+      <w:r>
+        <w:rPr>
+          <w:rFonts w:ascii="Times New Roman" w:hAnsi="Times New Roman"/>
+          <w:sz w:val="24"/>
+          <w:szCs w:val="24"/>
+        </w:rPr>
+        <w:t xml:space="preserve">vectorizer solution </w:t>
+      </w:r>
+      <w:r>
+        <w:rPr>
+          <w:rFonts w:ascii="Times New Roman" w:hAnsi="Times New Roman"/>
+          <w:b/>
+          <w:bCs/>
+          <w:sz w:val="24"/>
+          <w:szCs w:val="24"/>
+        </w:rPr>
+        <w:t>(CountVectorizer(tokenizer</w:t>
+      </w:r>
+      <w:r>
+        <w:rPr>
+          <w:rFonts w:ascii="Times New Roman" w:hAnsi="Times New Roman"/>
+          <w:b/>
+          <w:bCs/>
+          <w:color w:val="000000" w:themeColor="text1"/>
+          <w:sz w:val="24"/>
+          <w:szCs w:val="24"/>
+        </w:rPr>
+        <w:t>=lambda</w:t>
+      </w:r>
+      <w:r>
+        <w:rPr>
+          <w:rFonts w:ascii="Times New Roman" w:hAnsi="Times New Roman"/>
+          <w:b/>
+          <w:bCs/>
+          <w:color w:val="000000" w:themeColor="text1"/>
+          <w:sz w:val="24"/>
+          <w:szCs w:val="24"/>
+        </w:rPr>
+        <w:t xml:space="preserve"> </w:t>
+      </w:r>
+      <w:r>
+        <w:rPr>
+          <w:rFonts w:ascii="Times New Roman" w:hAnsi="Times New Roman"/>
+          <w:b/>
+          <w:bCs/>
+          <w:color w:val="000000" w:themeColor="text1"/>
+          <w:sz w:val="24"/>
+          <w:szCs w:val="24"/>
+        </w:rPr>
+        <w:t>text: text</w:t>
+      </w:r>
+      <w:r>
+        <w:rPr>
+          <w:rFonts w:ascii="Times New Roman" w:hAnsi="Times New Roman"/>
+          <w:b/>
+          <w:bCs/>
+          <w:color w:val="000000" w:themeColor="text1"/>
+          <w:sz w:val="24"/>
+          <w:szCs w:val="24"/>
+        </w:rPr>
+        <w:t>.</w:t>
+      </w:r>
+      <w:r>
+        <w:rPr>
+          <w:rFonts w:ascii="Times New Roman" w:hAnsi="Times New Roman"/>
+          <w:b/>
+          <w:bCs/>
+          <w:color w:val="000000" w:themeColor="text1"/>
+          <w:sz w:val="24"/>
+          <w:szCs w:val="24"/>
+        </w:rPr>
+        <w:t>split(</w:t>
+      </w:r>
+      <w:r>
+        <w:rPr>
+          <w:rFonts w:ascii="Times New Roman" w:hAnsi="Times New Roman"/>
+          <w:b/>
+          <w:bCs/>
+          <w:color w:val="000000" w:themeColor="text1"/>
+          <w:sz w:val="24"/>
+          <w:szCs w:val="24"/>
+        </w:rPr>
+        <w:t>'|'), token_pattern=None, lowercase=</w:t>
+      </w:r>
+      <w:r>
+        <w:rPr>
+          <w:rFonts w:ascii="Times New Roman" w:hAnsi="Times New Roman"/>
+          <w:b/>
+          <w:bCs/>
+          <w:color w:val="000000" w:themeColor="text1"/>
+          <w:sz w:val="24"/>
+          <w:szCs w:val="24"/>
+        </w:rPr>
+        <w:t>True</w:t>
+      </w:r>
+      <w:r>
+        <w:rPr>
+          <w:rFonts w:ascii="Times New Roman" w:hAnsi="Times New Roman"/>
+          <w:b/>
+          <w:bCs/>
+          <w:color w:val="000000" w:themeColor="text1"/>
+          <w:sz w:val="24"/>
+          <w:szCs w:val="24"/>
+        </w:rPr>
+        <w:t>, binary=True</w:t>
+      </w:r>
+      <w:r>
+        <w:rPr>
+          <w:rFonts w:ascii="Times New Roman" w:hAnsi="Times New Roman"/>
+          <w:b/>
+          <w:bCs/>
+          <w:color w:val="000000" w:themeColor="text1"/>
+          <w:sz w:val="24"/>
+          <w:szCs w:val="24"/>
+        </w:rPr>
+        <w:t>)</w:t>
+      </w:r>
+      <w:r>
+        <w:rPr>
+          <w:rFonts w:ascii="Times New Roman" w:hAnsi="Times New Roman"/>
+          <w:b/>
+          <w:bCs/>
+          <w:color w:val="000000" w:themeColor="text1"/>
+          <w:sz w:val="24"/>
+          <w:szCs w:val="24"/>
+        </w:rPr>
+        <w:t>),</w:t>
+      </w:r>
+      <w:r>
+        <w:rPr>
+          <w:rFonts w:ascii="Times New Roman" w:hAnsi="Times New Roman"/>
+          <w:b/>
+          <w:bCs/>
+          <w:color w:val="000000" w:themeColor="text1"/>
+          <w:sz w:val="24"/>
+          <w:szCs w:val="24"/>
+        </w:rPr>
+        <w:t xml:space="preserve"> </w:t>
+      </w:r>
+      <w:r>
+        <w:rPr>
+          <w:rFonts w:ascii="Times New Roman" w:hAnsi="Times New Roman"/>
+          <w:color w:val="000000" w:themeColor="text1"/>
+          <w:sz w:val="24"/>
+          <w:szCs w:val="24"/>
+        </w:rPr>
+        <w:t>which is split by the pipe (|)</w:t>
+      </w:r>
+      <w:r>
+        <w:rPr>
+          <w:rFonts w:ascii="Times New Roman" w:hAnsi="Times New Roman"/>
+          <w:color w:val="000000" w:themeColor="text1"/>
+          <w:sz w:val="24"/>
+          <w:szCs w:val="24"/>
+        </w:rPr>
+        <w:t xml:space="preserve"> parameter and applies a multi-hot encoding approach. </w:t>
+      </w:r>
+      <w:r>
+        <w:rPr>
+          <w:rFonts w:ascii="Times New Roman" w:hAnsi="Times New Roman"/>
+          <w:color w:val="000000" w:themeColor="text1"/>
+          <w:sz w:val="24"/>
+          <w:szCs w:val="24"/>
+        </w:rPr>
+        <w:t xml:space="preserve">The tokenizer parameter tells the CountVectorizer how to split each input string into separate tokens/labels. Since the movie genres </w:t>
+      </w:r>
+      <w:r>
+        <w:rPr>
+          <w:rFonts w:ascii="Times New Roman" w:hAnsi="Times New Roman"/>
+          <w:color w:val="000000" w:themeColor="text1"/>
+          <w:sz w:val="24"/>
+          <w:szCs w:val="24"/>
+        </w:rPr>
+        <w:t xml:space="preserve">for each movie in the dataset </w:t>
+      </w:r>
+      <w:r>
+        <w:rPr>
+          <w:rFonts w:ascii="Times New Roman" w:hAnsi="Times New Roman"/>
+          <w:color w:val="000000" w:themeColor="text1"/>
+          <w:sz w:val="24"/>
+          <w:szCs w:val="24"/>
+        </w:rPr>
+        <w:t>are sep</w:t>
+      </w:r>
+      <w:r>
+        <w:rPr>
+          <w:rFonts w:ascii="Times New Roman" w:hAnsi="Times New Roman"/>
+          <w:color w:val="000000" w:themeColor="text1"/>
+          <w:sz w:val="24"/>
+          <w:szCs w:val="24"/>
+        </w:rPr>
+        <w:t>a</w:t>
+      </w:r>
+      <w:r>
+        <w:rPr>
+          <w:rFonts w:ascii="Times New Roman" w:hAnsi="Times New Roman"/>
+          <w:color w:val="000000" w:themeColor="text1"/>
+          <w:sz w:val="24"/>
+          <w:szCs w:val="24"/>
+        </w:rPr>
+        <w:t xml:space="preserve">rated by </w:t>
+      </w:r>
+      <w:r>
+        <w:rPr>
+          <w:rFonts w:ascii="Times New Roman" w:hAnsi="Times New Roman"/>
+          <w:b/>
+          <w:bCs/>
+          <w:color w:val="000000" w:themeColor="text1"/>
+          <w:sz w:val="24"/>
+          <w:szCs w:val="24"/>
+        </w:rPr>
+        <w:t>'|'</w:t>
+      </w:r>
+      <w:r>
+        <w:rPr>
+          <w:rFonts w:ascii="Times New Roman" w:hAnsi="Times New Roman"/>
+          <w:b/>
+          <w:bCs/>
+          <w:color w:val="000000" w:themeColor="text1"/>
+          <w:sz w:val="24"/>
+          <w:szCs w:val="24"/>
+        </w:rPr>
+        <w:t xml:space="preserve"> </w:t>
+      </w:r>
+      <w:r>
+        <w:rPr>
+          <w:rFonts w:ascii="Times New Roman" w:hAnsi="Times New Roman"/>
+          <w:b/>
+          <w:bCs/>
+          <w:color w:val="000000" w:themeColor="text1"/>
+          <w:sz w:val="24"/>
+          <w:szCs w:val="24"/>
+        </w:rPr>
+        <w:t xml:space="preserve">, </w:t>
+      </w:r>
+      <w:r>
+        <w:rPr>
+          <w:rFonts w:ascii="Times New Roman" w:hAnsi="Times New Roman"/>
+          <w:color w:val="000000" w:themeColor="text1"/>
+          <w:sz w:val="24"/>
+          <w:szCs w:val="24"/>
+        </w:rPr>
+        <w:t xml:space="preserve">I have split </w:t>
+      </w:r>
+      <w:r>
+        <w:rPr>
+          <w:rFonts w:ascii="Times New Roman" w:hAnsi="Times New Roman"/>
+          <w:color w:val="000000" w:themeColor="text1"/>
+          <w:sz w:val="24"/>
+          <w:szCs w:val="24"/>
+        </w:rPr>
+        <w:t xml:space="preserve">multiple genres per movie </w:t>
+      </w:r>
+      <w:r>
+        <w:rPr>
+          <w:rFonts w:ascii="Times New Roman" w:hAnsi="Times New Roman"/>
+          <w:color w:val="000000" w:themeColor="text1"/>
+          <w:sz w:val="24"/>
+          <w:szCs w:val="24"/>
+        </w:rPr>
+        <w:t>by this delim</w:t>
+      </w:r>
+      <w:r>
+        <w:rPr>
+          <w:rFonts w:ascii="Times New Roman" w:hAnsi="Times New Roman"/>
+          <w:color w:val="000000" w:themeColor="text1"/>
+          <w:sz w:val="24"/>
+          <w:szCs w:val="24"/>
+        </w:rPr>
+        <w:t>i</w:t>
+      </w:r>
+      <w:r>
+        <w:rPr>
+          <w:rFonts w:ascii="Times New Roman" w:hAnsi="Times New Roman"/>
+          <w:color w:val="000000" w:themeColor="text1"/>
+          <w:sz w:val="24"/>
+          <w:szCs w:val="24"/>
+        </w:rPr>
+        <w:t>ter in the tokenizer</w:t>
+      </w:r>
+      <w:r>
+        <w:rPr>
+          <w:rFonts w:ascii="Times New Roman" w:hAnsi="Times New Roman"/>
+          <w:color w:val="000000" w:themeColor="text1"/>
+          <w:sz w:val="24"/>
+          <w:szCs w:val="24"/>
+        </w:rPr>
+        <w:t xml:space="preserve"> part</w:t>
+      </w:r>
+      <w:r>
+        <w:rPr>
+          <w:rFonts w:ascii="Times New Roman" w:hAnsi="Times New Roman"/>
+          <w:color w:val="000000" w:themeColor="text1"/>
+          <w:sz w:val="24"/>
+          <w:szCs w:val="24"/>
+        </w:rPr>
+        <w:t xml:space="preserve">. The </w:t>
+      </w:r>
+      <w:r>
+        <w:rPr>
+          <w:rFonts w:ascii="Times New Roman" w:hAnsi="Times New Roman"/>
+          <w:b/>
+          <w:bCs/>
+          <w:color w:val="000000" w:themeColor="text1"/>
+          <w:sz w:val="24"/>
+          <w:szCs w:val="24"/>
+        </w:rPr>
+        <w:t>'</w:t>
+      </w:r>
+      <w:r>
+        <w:rPr>
+          <w:rFonts w:ascii="Times New Roman" w:hAnsi="Times New Roman"/>
+          <w:b/>
+          <w:bCs/>
+          <w:color w:val="000000" w:themeColor="text1"/>
+          <w:sz w:val="24"/>
+          <w:szCs w:val="24"/>
+        </w:rPr>
+        <w:t>token</w:t>
+      </w:r>
+      <w:r>
+        <w:rPr>
+          <w:rFonts w:ascii="Times New Roman" w:hAnsi="Times New Roman"/>
+          <w:b/>
+          <w:bCs/>
+          <w:color w:val="000000" w:themeColor="text1"/>
+          <w:sz w:val="24"/>
+          <w:szCs w:val="24"/>
+        </w:rPr>
+        <w:t>_</w:t>
+      </w:r>
+      <w:r>
+        <w:rPr>
+          <w:rFonts w:ascii="Times New Roman" w:hAnsi="Times New Roman"/>
+          <w:b/>
+          <w:bCs/>
+          <w:color w:val="000000" w:themeColor="text1"/>
+          <w:sz w:val="24"/>
+          <w:szCs w:val="24"/>
+        </w:rPr>
+        <w:t>pattern</w:t>
+      </w:r>
+      <w:r>
+        <w:rPr>
+          <w:rFonts w:ascii="Times New Roman" w:hAnsi="Times New Roman"/>
+          <w:b/>
+          <w:bCs/>
+          <w:color w:val="000000" w:themeColor="text1"/>
+          <w:sz w:val="24"/>
+          <w:szCs w:val="24"/>
+        </w:rPr>
+        <w:t>'</w:t>
+      </w:r>
+      <w:r>
+        <w:rPr>
+          <w:rFonts w:ascii="Times New Roman" w:hAnsi="Times New Roman"/>
+          <w:color w:val="000000" w:themeColor="text1"/>
+          <w:sz w:val="24"/>
+          <w:szCs w:val="24"/>
+        </w:rPr>
+        <w:t xml:space="preserve"> parameter </w:t>
+      </w:r>
+      <w:r>
+        <w:rPr>
+          <w:rFonts w:ascii="Times New Roman" w:hAnsi="Times New Roman"/>
+          <w:color w:val="000000" w:themeColor="text1"/>
+          <w:sz w:val="24"/>
+          <w:szCs w:val="24"/>
+        </w:rPr>
+        <w:t xml:space="preserve">indicates the regular expression (regex) used by the CountVectorizer, which helps how to decide whether a token is encountered. </w:t>
+      </w:r>
+      <w:r>
+        <w:rPr>
+          <w:rFonts w:ascii="Times New Roman" w:hAnsi="Times New Roman"/>
+          <w:color w:val="000000" w:themeColor="text1"/>
+          <w:sz w:val="24"/>
+          <w:szCs w:val="24"/>
+        </w:rPr>
+        <w:t xml:space="preserve"> I have set this parameter to None since I have not used the default regex but used my own custom regular expression. I have </w:t>
+      </w:r>
+      <w:r>
+        <w:rPr>
+          <w:rFonts w:ascii="Times New Roman" w:hAnsi="Times New Roman"/>
+          <w:color w:val="000000" w:themeColor="text1"/>
+          <w:sz w:val="24"/>
+          <w:szCs w:val="24"/>
+        </w:rPr>
+        <w:t xml:space="preserve">set the </w:t>
+      </w:r>
+      <w:r>
+        <w:rPr>
+          <w:rFonts w:ascii="Times New Roman" w:hAnsi="Times New Roman"/>
+          <w:b/>
+          <w:bCs/>
+          <w:color w:val="000000" w:themeColor="text1"/>
+          <w:sz w:val="24"/>
+          <w:szCs w:val="24"/>
+        </w:rPr>
+        <w:t>'</w:t>
+      </w:r>
+      <w:r>
+        <w:rPr>
+          <w:rFonts w:ascii="Times New Roman" w:hAnsi="Times New Roman"/>
+          <w:b/>
+          <w:bCs/>
+          <w:color w:val="000000" w:themeColor="text1"/>
+          <w:sz w:val="24"/>
+          <w:szCs w:val="24"/>
+        </w:rPr>
+        <w:t>lowercase</w:t>
+      </w:r>
+      <w:r>
+        <w:rPr>
+          <w:rFonts w:ascii="Times New Roman" w:hAnsi="Times New Roman"/>
+          <w:b/>
+          <w:bCs/>
+          <w:color w:val="000000" w:themeColor="text1"/>
+          <w:sz w:val="24"/>
+          <w:szCs w:val="24"/>
+        </w:rPr>
+        <w:t>'</w:t>
+      </w:r>
+      <w:r>
+        <w:rPr>
+          <w:rFonts w:ascii="Times New Roman" w:hAnsi="Times New Roman"/>
+          <w:color w:val="000000" w:themeColor="text1"/>
+          <w:sz w:val="24"/>
+          <w:szCs w:val="24"/>
+        </w:rPr>
+        <w:t xml:space="preserve"> </w:t>
+      </w:r>
+      <w:r>
+        <w:rPr>
+          <w:rFonts w:ascii="Times New Roman" w:hAnsi="Times New Roman"/>
+          <w:color w:val="000000" w:themeColor="text1"/>
+          <w:sz w:val="24"/>
+          <w:szCs w:val="24"/>
+        </w:rPr>
+        <w:t>parameter to True</w:t>
+      </w:r>
+      <w:r>
+        <w:rPr>
+          <w:rFonts w:ascii="Times New Roman" w:hAnsi="Times New Roman"/>
+          <w:color w:val="000000" w:themeColor="text1"/>
+          <w:sz w:val="24"/>
+          <w:szCs w:val="24"/>
+        </w:rPr>
+        <w:t xml:space="preserve"> to convert all processed letters to their lowercase versions, and </w:t>
+      </w:r>
+      <w:r>
+        <w:rPr>
+          <w:rFonts w:ascii="Times New Roman" w:hAnsi="Times New Roman"/>
+          <w:color w:val="000000" w:themeColor="text1"/>
+          <w:sz w:val="24"/>
+          <w:szCs w:val="24"/>
+        </w:rPr>
+        <w:t>t</w:t>
+      </w:r>
+      <w:r>
+        <w:rPr>
+          <w:rFonts w:ascii="Times New Roman" w:hAnsi="Times New Roman"/>
+          <w:color w:val="000000" w:themeColor="text1"/>
+          <w:sz w:val="24"/>
+          <w:szCs w:val="24"/>
+        </w:rPr>
+        <w:t xml:space="preserve">his </w:t>
+      </w:r>
+      <w:r>
+        <w:rPr>
+          <w:rFonts w:ascii="Times New Roman" w:hAnsi="Times New Roman"/>
+          <w:color w:val="000000" w:themeColor="text1"/>
+          <w:sz w:val="24"/>
+          <w:szCs w:val="24"/>
+        </w:rPr>
+        <w:t xml:space="preserve">will count the same movie genres written in different cases as the same. I have set the </w:t>
+      </w:r>
+      <w:r>
+        <w:rPr>
+          <w:rFonts w:ascii="Times New Roman" w:hAnsi="Times New Roman"/>
+          <w:b/>
+          <w:bCs/>
+          <w:color w:val="000000" w:themeColor="text1"/>
+          <w:sz w:val="24"/>
+          <w:szCs w:val="24"/>
+        </w:rPr>
+        <w:t>'</w:t>
+      </w:r>
+      <w:r>
+        <w:rPr>
+          <w:rFonts w:ascii="Times New Roman" w:hAnsi="Times New Roman"/>
+          <w:b/>
+          <w:bCs/>
+          <w:color w:val="000000" w:themeColor="text1"/>
+          <w:sz w:val="24"/>
+          <w:szCs w:val="24"/>
+        </w:rPr>
+        <w:t>binary</w:t>
+      </w:r>
+      <w:r>
+        <w:rPr>
+          <w:rFonts w:ascii="Times New Roman" w:hAnsi="Times New Roman"/>
+          <w:b/>
+          <w:bCs/>
+          <w:color w:val="000000" w:themeColor="text1"/>
+          <w:sz w:val="24"/>
+          <w:szCs w:val="24"/>
+        </w:rPr>
+        <w:t>'</w:t>
+      </w:r>
+      <w:r>
+        <w:rPr>
+          <w:rFonts w:ascii="Times New Roman" w:hAnsi="Times New Roman"/>
+          <w:color w:val="000000" w:themeColor="text1"/>
+          <w:sz w:val="24"/>
+          <w:szCs w:val="24"/>
+        </w:rPr>
+        <w:t xml:space="preserve"> parameter to True to just look for whether a word occurs or not in the text input,</w:t>
+      </w:r>
+      <w:r>
+        <w:rPr>
+          <w:rFonts w:ascii="Times New Roman" w:hAnsi="Times New Roman"/>
+          <w:color w:val="000000" w:themeColor="text1"/>
+          <w:sz w:val="24"/>
+          <w:szCs w:val="24"/>
+        </w:rPr>
+        <w:t xml:space="preserve"> and not count the word frequency. Because the multi-hot encoding approach includes just the binary values of 0 and 1, and not the frequency. This count vectorizer </w:t>
+      </w:r>
+      <w:r>
+        <w:rPr>
+          <w:rFonts w:ascii="Times New Roman" w:hAnsi="Times New Roman"/>
+          <w:color w:val="000000" w:themeColor="text1"/>
+          <w:sz w:val="24"/>
+          <w:szCs w:val="24"/>
+        </w:rPr>
+        <w:t>approach creates a multi-hot binary vector, where each row can contain multiple 1s</w:t>
+      </w:r>
+      <w:r>
+        <w:rPr>
+          <w:rFonts w:ascii="Times New Roman" w:hAnsi="Times New Roman"/>
+          <w:color w:val="000000" w:themeColor="text1"/>
+          <w:sz w:val="24"/>
+          <w:szCs w:val="24"/>
+        </w:rPr>
+        <w:t>.</w:t>
+      </w:r>
+      <w:r>
+        <w:rPr>
+          <w:rFonts w:ascii="Times New Roman" w:hAnsi="Times New Roman"/>
+          <w:color w:val="000000" w:themeColor="text1"/>
+          <w:sz w:val="24"/>
+          <w:szCs w:val="24"/>
+        </w:rPr>
+        <w:t xml:space="preserve"> I could have also utilized a </w:t>
+      </w:r>
+      <w:r>
+        <w:rPr>
+          <w:rFonts w:ascii="Times New Roman" w:hAnsi="Times New Roman"/>
+          <w:sz w:val="24"/>
+          <w:szCs w:val="24"/>
+        </w:rPr>
+        <w:t>"</w:t>
+      </w:r>
+      <w:r>
+        <w:rPr>
+          <w:rFonts w:ascii="Times New Roman" w:hAnsi="Times New Roman"/>
+          <w:color w:val="000000" w:themeColor="text1"/>
+          <w:sz w:val="24"/>
+          <w:szCs w:val="24"/>
+        </w:rPr>
+        <w:t>Bag-of-Words (BoW)</w:t>
+      </w:r>
+      <w:r>
+        <w:rPr>
+          <w:rFonts w:ascii="Times New Roman" w:hAnsi="Times New Roman"/>
+          <w:sz w:val="24"/>
+          <w:szCs w:val="24"/>
+        </w:rPr>
+        <w:t>"</w:t>
+      </w:r>
+      <w:r>
+        <w:rPr>
+          <w:rFonts w:ascii="Times New Roman" w:hAnsi="Times New Roman"/>
+          <w:sz w:val="24"/>
+          <w:szCs w:val="24"/>
+        </w:rPr>
+        <w:t xml:space="preserve"> approach for multi-hot encoding. </w:t>
+      </w:r>
     </w:p>
     <w:p>
       <w:pPr>
         <w:pStyle w:val="p1"/>
+        <w:spacing w:line="360" w:lineRule="auto"/>
         <w:jc w:val="both"/>
         <w:rPr>
           <w:rFonts w:ascii="Times New Roman" w:hAnsi="Times New Roman"/>
@@ -338,244 +1212,217 @@
           <w:szCs w:val="24"/>
         </w:rPr>
       </w:pPr>
-      <w:r>
-        <w:rPr>
-          <w:rFonts w:ascii="Times New Roman" w:hAnsi="Times New Roman"/>
-          <w:sz w:val="24"/>
-          <w:szCs w:val="24"/>
-        </w:rPr>
-        <w:tab/>
-      </w:r>
-      <w:r>
-        <w:rPr>
-          <w:rFonts w:ascii="Times New Roman" w:hAnsi="Times New Roman"/>
-          <w:sz w:val="24"/>
-          <w:szCs w:val="24"/>
-        </w:rPr>
-        <w:t xml:space="preserve">I have used a hybrid approach for the feature representation. It </w:t>
-      </w:r>
-      <w:r>
-        <w:rPr>
-          <w:rFonts w:ascii="Times New Roman" w:hAnsi="Times New Roman"/>
-          <w:sz w:val="24"/>
-          <w:szCs w:val="24"/>
-        </w:rPr>
-        <w:t>combines</w:t>
-      </w:r>
-      <w:r>
-        <w:rPr>
-          <w:rFonts w:ascii="Times New Roman" w:hAnsi="Times New Roman"/>
-          <w:sz w:val="24"/>
-          <w:szCs w:val="24"/>
-        </w:rPr>
-        <w:t xml:space="preserve"> 2 components: </w:t>
-      </w:r>
-      <w:r>
-        <w:rPr>
-          <w:rFonts w:ascii="Times New Roman" w:hAnsi="Times New Roman"/>
-          <w:b/>
-          <w:bCs/>
-          <w:sz w:val="24"/>
-          <w:szCs w:val="24"/>
-        </w:rPr>
-        <w:t>“Multi-Hot Encoded Movie Genres”</w:t>
-      </w:r>
-      <w:r>
-        <w:rPr>
-          <w:rFonts w:ascii="Times New Roman" w:hAnsi="Times New Roman"/>
-          <w:sz w:val="24"/>
-          <w:szCs w:val="24"/>
-        </w:rPr>
-        <w:t xml:space="preserve"> and </w:t>
-      </w:r>
-      <w:r>
-        <w:rPr>
-          <w:rFonts w:ascii="Times New Roman" w:hAnsi="Times New Roman"/>
-          <w:b/>
-          <w:bCs/>
-          <w:sz w:val="24"/>
-          <w:szCs w:val="24"/>
-        </w:rPr>
-        <w:t>“Minimum-Maximum Scaled Numerical Rating Values”</w:t>
-      </w:r>
-      <w:r>
-        <w:rPr>
-          <w:rFonts w:ascii="Times New Roman" w:hAnsi="Times New Roman"/>
-          <w:sz w:val="24"/>
-          <w:szCs w:val="24"/>
-        </w:rPr>
-        <w:t xml:space="preserve">. </w:t>
-      </w:r>
-      <w:r>
-        <w:rPr>
-          <w:rFonts w:ascii="Times New Roman" w:hAnsi="Times New Roman"/>
-          <w:sz w:val="24"/>
-          <w:szCs w:val="24"/>
-        </w:rPr>
-        <w:t xml:space="preserve"> </w:t>
-      </w:r>
-      <w:r>
-        <w:rPr>
-          <w:rFonts w:ascii="Times New Roman" w:hAnsi="Times New Roman"/>
-          <w:b/>
-          <w:bCs/>
-          <w:sz w:val="24"/>
-          <w:szCs w:val="24"/>
-        </w:rPr>
-        <w:t>“Multi-Hot Encoded Genres”</w:t>
-      </w:r>
-      <w:r>
-        <w:rPr>
-          <w:rFonts w:ascii="Times New Roman" w:hAnsi="Times New Roman"/>
-          <w:b/>
-          <w:bCs/>
-          <w:sz w:val="24"/>
-          <w:szCs w:val="24"/>
-        </w:rPr>
-        <w:t xml:space="preserve"> </w:t>
-      </w:r>
-      <w:r>
-        <w:rPr>
-          <w:rFonts w:ascii="Times New Roman" w:hAnsi="Times New Roman"/>
-          <w:sz w:val="24"/>
-          <w:szCs w:val="24"/>
-        </w:rPr>
-        <w:t>includes the categorical text data</w:t>
-      </w:r>
-      <w:r>
-        <w:rPr>
-          <w:rFonts w:ascii="Times New Roman" w:hAnsi="Times New Roman"/>
-          <w:sz w:val="24"/>
-          <w:szCs w:val="24"/>
-        </w:rPr>
-        <w:t xml:space="preserve"> that</w:t>
-      </w:r>
-      <w:r>
-        <w:rPr>
-          <w:rFonts w:ascii="Times New Roman" w:hAnsi="Times New Roman"/>
-          <w:sz w:val="24"/>
-          <w:szCs w:val="24"/>
-        </w:rPr>
-        <w:t xml:space="preserve"> represent</w:t>
-      </w:r>
-      <w:r>
-        <w:rPr>
-          <w:rFonts w:ascii="Times New Roman" w:hAnsi="Times New Roman"/>
-          <w:sz w:val="24"/>
-          <w:szCs w:val="24"/>
-        </w:rPr>
-        <w:t>s</w:t>
-      </w:r>
-      <w:r>
-        <w:rPr>
-          <w:rFonts w:ascii="Times New Roman" w:hAnsi="Times New Roman"/>
-          <w:sz w:val="24"/>
-          <w:szCs w:val="24"/>
-        </w:rPr>
-        <w:t xml:space="preserve"> </w:t>
-      </w:r>
-      <w:r>
-        <w:rPr>
-          <w:rFonts w:ascii="Times New Roman" w:hAnsi="Times New Roman"/>
-          <w:sz w:val="24"/>
-          <w:szCs w:val="24"/>
-        </w:rPr>
-        <w:t xml:space="preserve">the genres of the movie. </w:t>
-      </w:r>
-      <w:r>
-        <w:rPr>
-          <w:rFonts w:ascii="Times New Roman" w:hAnsi="Times New Roman"/>
-          <w:b/>
-          <w:bCs/>
-          <w:sz w:val="24"/>
-          <w:szCs w:val="24"/>
-        </w:rPr>
-        <w:t xml:space="preserve">“Minimum-Maximum Scaled Numerical Ratings” </w:t>
-      </w:r>
-      <w:r>
-        <w:rPr>
-          <w:rFonts w:ascii="Times New Roman" w:hAnsi="Times New Roman"/>
-          <w:sz w:val="24"/>
-          <w:szCs w:val="24"/>
-        </w:rPr>
-        <w:t xml:space="preserve">includes continuous numerical data that represents the user and critic </w:t>
-      </w:r>
-      <w:r>
-        <w:rPr>
-          <w:rFonts w:ascii="Times New Roman" w:hAnsi="Times New Roman"/>
-          <w:sz w:val="24"/>
-          <w:szCs w:val="24"/>
-        </w:rPr>
-        <w:t>evaluations and feedback given to the movie</w:t>
-      </w:r>
-      <w:r>
-        <w:rPr>
-          <w:rFonts w:ascii="Times New Roman" w:hAnsi="Times New Roman"/>
-          <w:sz w:val="24"/>
-          <w:szCs w:val="24"/>
-        </w:rPr>
-        <w:t xml:space="preserve"> by using the corresponding </w:t>
-      </w:r>
-      <w:r>
-        <w:rPr>
-          <w:rFonts w:ascii="Times New Roman" w:hAnsi="Times New Roman"/>
-          <w:b/>
-          <w:bCs/>
-          <w:sz w:val="24"/>
-          <w:szCs w:val="24"/>
-        </w:rPr>
-        <w:t>‘imdb_score’</w:t>
-      </w:r>
-      <w:r>
-        <w:rPr>
-          <w:rFonts w:ascii="Times New Roman" w:hAnsi="Times New Roman"/>
-          <w:sz w:val="24"/>
-          <w:szCs w:val="24"/>
-        </w:rPr>
-        <w:t xml:space="preserve"> value</w:t>
-      </w:r>
-      <w:r>
-        <w:rPr>
-          <w:rFonts w:ascii="Times New Roman" w:hAnsi="Times New Roman"/>
-          <w:sz w:val="24"/>
-          <w:szCs w:val="24"/>
-        </w:rPr>
-        <w:t xml:space="preserve"> of that movie. </w:t>
-      </w:r>
     </w:p>
     <w:p>
       <w:pPr>
-        <w:rPr>
-          <w:lang w:val="tr-TR"/>
-        </w:rPr>
-      </w:pPr>
+        <w:pStyle w:val="p1"/>
+        <w:spacing w:line="360" w:lineRule="auto"/>
+        <w:jc w:val="both"/>
+        <w:rPr>
+          <w:rFonts w:ascii="Times New Roman" w:hAnsi="Times New Roman"/>
+          <w:sz w:val="24"/>
+          <w:szCs w:val="24"/>
+        </w:rPr>
+      </w:pPr>
+      <w:r>
+        <w:rPr>
+          <w:rFonts w:ascii="Times New Roman" w:hAnsi="Times New Roman"/>
+          <w:sz w:val="24"/>
+          <w:szCs w:val="24"/>
+        </w:rPr>
+        <w:lastRenderedPageBreak/>
+        <w:tab/>
+      </w:r>
+      <w:r>
+        <w:rPr>
+          <w:rFonts w:ascii="Times New Roman" w:hAnsi="Times New Roman"/>
+          <w:sz w:val="24"/>
+          <w:szCs w:val="24"/>
+        </w:rPr>
+        <w:t xml:space="preserve">Using the count vectorizer or bag-of-words approach permits the movie recommender model to grasp </w:t>
+      </w:r>
+      <w:r>
+        <w:rPr>
+          <w:rFonts w:ascii="Times New Roman" w:hAnsi="Times New Roman"/>
+          <w:sz w:val="24"/>
+          <w:szCs w:val="24"/>
+        </w:rPr>
+        <w:t>specific movie genre preferences of the user (e.g., comedy, adventure, action</w:t>
+      </w:r>
+      <w:r>
+        <w:rPr>
+          <w:rFonts w:ascii="Times New Roman" w:hAnsi="Times New Roman"/>
+          <w:sz w:val="24"/>
+          <w:szCs w:val="24"/>
+        </w:rPr>
+        <w:t xml:space="preserve">) </w:t>
+      </w:r>
+      <w:r>
+        <w:rPr>
+          <w:rFonts w:ascii="Times New Roman" w:hAnsi="Times New Roman"/>
+          <w:sz w:val="24"/>
+          <w:szCs w:val="24"/>
+        </w:rPr>
+        <w:t xml:space="preserve">through the calculation of the inner product of the user’s movie preference vector w and </w:t>
+      </w:r>
+      <w:r>
+        <w:rPr>
+          <w:rFonts w:ascii="Times New Roman" w:hAnsi="Times New Roman"/>
+          <w:sz w:val="24"/>
+          <w:szCs w:val="24"/>
+        </w:rPr>
+        <w:t xml:space="preserve">the </w:t>
+      </w:r>
+      <w:r>
+        <w:rPr>
+          <w:rFonts w:ascii="Times New Roman" w:hAnsi="Times New Roman"/>
+          <w:sz w:val="24"/>
+          <w:szCs w:val="24"/>
+        </w:rPr>
+        <w:t xml:space="preserve">movie features vector x </w:t>
+      </w:r>
+      <w:r>
+        <w:rPr>
+          <w:rFonts w:ascii="Times New Roman" w:hAnsi="Times New Roman"/>
+          <w:b/>
+          <w:bCs/>
+          <w:sz w:val="24"/>
+          <w:szCs w:val="24"/>
+        </w:rPr>
+        <w:t>(w^T * x).</w:t>
+      </w:r>
+      <w:r>
+        <w:rPr>
+          <w:rFonts w:ascii="Times New Roman" w:hAnsi="Times New Roman"/>
+          <w:sz w:val="24"/>
+          <w:szCs w:val="24"/>
+        </w:rPr>
+        <w:t xml:space="preserve"> </w:t>
+      </w:r>
+      <w:r>
+        <w:rPr>
+          <w:rFonts w:ascii="Times New Roman" w:hAnsi="Times New Roman"/>
+          <w:sz w:val="24"/>
+          <w:szCs w:val="24"/>
+        </w:rPr>
+        <w:t xml:space="preserve">Here, the </w:t>
+      </w:r>
+      <w:r>
+        <w:rPr>
+          <w:rFonts w:ascii="Times New Roman" w:hAnsi="Times New Roman"/>
+          <w:sz w:val="24"/>
+          <w:szCs w:val="24"/>
+        </w:rPr>
+        <w:t xml:space="preserve">utility obtained for the given movie and user is the value of the inner product of the vectors w and x. </w:t>
+      </w:r>
     </w:p>
     <w:p>
       <w:pPr>
-        <w:rPr>
-          <w:lang w:val="tr-TR"/>
-        </w:rPr>
-      </w:pPr>
+        <w:pStyle w:val="p1"/>
+        <w:spacing w:line="360" w:lineRule="auto"/>
+        <w:jc w:val="both"/>
+        <w:rPr>
+          <w:rFonts w:ascii="Times New Roman" w:hAnsi="Times New Roman"/>
+          <w:sz w:val="24"/>
+          <w:szCs w:val="24"/>
+        </w:rPr>
+      </w:pPr>
+      <w:r>
+        <w:rPr>
+          <w:rFonts w:ascii="Times New Roman" w:hAnsi="Times New Roman"/>
+          <w:sz w:val="24"/>
+          <w:szCs w:val="24"/>
+        </w:rPr>
+        <w:tab/>
+        <w:t xml:space="preserve">The rating of a movie is treated as a reliable indicator </w:t>
+      </w:r>
+      <w:r>
+        <w:rPr>
+          <w:rFonts w:ascii="Times New Roman" w:hAnsi="Times New Roman"/>
+          <w:sz w:val="24"/>
+          <w:szCs w:val="24"/>
+        </w:rPr>
+        <w:t>of</w:t>
+      </w:r>
+      <w:r>
+        <w:rPr>
+          <w:rFonts w:ascii="Times New Roman" w:hAnsi="Times New Roman"/>
+          <w:sz w:val="24"/>
+          <w:szCs w:val="24"/>
+        </w:rPr>
+        <w:t xml:space="preserve"> general movie appeal </w:t>
+      </w:r>
+      <w:r>
+        <w:rPr>
+          <w:rFonts w:ascii="Times New Roman" w:hAnsi="Times New Roman"/>
+          <w:sz w:val="24"/>
+          <w:szCs w:val="24"/>
+        </w:rPr>
+        <w:t>by audience</w:t>
+      </w:r>
+      <w:r>
+        <w:rPr>
+          <w:rFonts w:ascii="Times New Roman" w:hAnsi="Times New Roman"/>
+          <w:sz w:val="24"/>
+          <w:szCs w:val="24"/>
+        </w:rPr>
+        <w:t>s</w:t>
+      </w:r>
+      <w:r>
+        <w:rPr>
+          <w:rFonts w:ascii="Times New Roman" w:hAnsi="Times New Roman"/>
+          <w:sz w:val="24"/>
+          <w:szCs w:val="24"/>
+        </w:rPr>
+        <w:t xml:space="preserve"> and critics, and </w:t>
+      </w:r>
+      <w:r>
+        <w:rPr>
+          <w:rFonts w:ascii="Times New Roman" w:hAnsi="Times New Roman"/>
+          <w:sz w:val="24"/>
+          <w:szCs w:val="24"/>
+        </w:rPr>
+        <w:t>of</w:t>
+      </w:r>
+      <w:r>
+        <w:rPr>
+          <w:rFonts w:ascii="Times New Roman" w:hAnsi="Times New Roman"/>
+          <w:sz w:val="24"/>
+          <w:szCs w:val="24"/>
+        </w:rPr>
+        <w:t xml:space="preserve"> overall movie quality. </w:t>
+      </w:r>
+      <w:r>
+        <w:rPr>
+          <w:rFonts w:ascii="Times New Roman" w:hAnsi="Times New Roman"/>
+          <w:sz w:val="24"/>
+          <w:szCs w:val="24"/>
+        </w:rPr>
+        <w:t xml:space="preserve"> </w:t>
+      </w:r>
+      <w:r>
+        <w:rPr>
+          <w:rFonts w:ascii="Times New Roman" w:hAnsi="Times New Roman"/>
+          <w:sz w:val="24"/>
+          <w:szCs w:val="24"/>
+        </w:rPr>
+        <w:t xml:space="preserve">I have applied a scaling operation to every IMDb score in the dataset by using the MinMaxScaler() class. This restricts the value of this score between 0 and 1, </w:t>
+      </w:r>
+      <w:r>
+        <w:rPr>
+          <w:rFonts w:ascii="Times New Roman" w:hAnsi="Times New Roman"/>
+          <w:sz w:val="24"/>
+          <w:szCs w:val="24"/>
+        </w:rPr>
+        <w:t xml:space="preserve">   </w:t>
+      </w:r>
     </w:p>
     <w:p>
       <w:pPr>
-        <w:spacing w:after="100" w:afterAutospacing="1" w:line="240" w:lineRule="auto"/>
-        <w:rPr>
-          <w:rFonts w:ascii="Arial" w:eastAsia="Times New Roman" w:hAnsi="Arial" w:cs="Times New Roman"/>
-          <w:kern w:val="0"/>
-          <w:lang w:eastAsia="tr-TR"/>
-          <w14:ligatures w14:val="none"/>
-        </w:rPr>
-      </w:pPr>
-      <w:r>
-        <w:rPr>
-          <w:rFonts w:ascii="Arial" w:eastAsia="Times New Roman" w:hAnsi="Arial" w:cs="Times New Roman"/>
-          <w:kern w:val="0"/>
-          <w:lang w:eastAsia="tr-TR"/>
-          <w14:ligatures w14:val="none"/>
-        </w:rPr>
-        <w:t>Based on the provided Django application code, here is the feature representation choice, its justification, and the extraction method implemented in the script.</w:t>
-      </w:r>
+        <w:rPr>
+          <w:lang w:val="tr-TR"/>
+        </w:rPr>
+      </w:pPr>
     </w:p>
     <w:p>
       <w:pPr>
@@ -603,325 +1450,7 @@
           <w:lang w:eastAsia="tr-TR"/>
           <w14:ligatures w14:val="none"/>
         </w:rPr>
-        <w:t>1. Choice of Feature Representation</w:t>
-      </w:r>
-    </w:p>
-    <w:p>
-      <w:pPr>
-        <w:spacing w:after="100" w:afterAutospacing="1" w:line="240" w:lineRule="auto"/>
-        <w:rPr>
-          <w:rFonts w:ascii="Arial" w:eastAsia="Times New Roman" w:hAnsi="Arial" w:cs="Times New Roman"/>
-          <w:kern w:val="0"/>
-          <w:lang w:eastAsia="tr-TR"/>
-          <w14:ligatures w14:val="none"/>
-        </w:rPr>
-      </w:pPr>
-      <w:r>
-        <w:rPr>
-          <w:rFonts w:ascii="Arial" w:eastAsia="Times New Roman" w:hAnsi="Arial" w:cs="Times New Roman"/>
-          <w:kern w:val="0"/>
-          <w:lang w:eastAsia="tr-TR"/>
-          <w14:ligatures w14:val="none"/>
-        </w:rPr>
-        <w:t xml:space="preserve">The code utilizes a </w:t>
-      </w:r>
-      <w:r>
-        <w:rPr>
-          <w:rFonts w:ascii="Arial" w:eastAsia="Times New Roman" w:hAnsi="Arial" w:cs="Times New Roman"/>
-          <w:b/>
-          <w:bCs/>
-          <w:kern w:val="0"/>
-          <w:lang w:eastAsia="tr-TR"/>
-          <w14:ligatures w14:val="none"/>
-        </w:rPr>
-        <w:t>Hybrid Feature Representation</w:t>
-      </w:r>
-      <w:r>
-        <w:rPr>
-          <w:rFonts w:ascii="Arial" w:eastAsia="Times New Roman" w:hAnsi="Arial" w:cs="Times New Roman"/>
-          <w:kern w:val="0"/>
-          <w:lang w:eastAsia="tr-TR"/>
-          <w14:ligatures w14:val="none"/>
-        </w:rPr>
-        <w:t xml:space="preserve"> that combines:</w:t>
-      </w:r>
-    </w:p>
-    <w:p>
-      <w:pPr>
-        <w:numPr>
-          <w:ilvl w:val="0"/>
-          <w:numId w:val="1"/>
-        </w:numPr>
-        <w:spacing w:after="100" w:afterAutospacing="1" w:line="240" w:lineRule="auto"/>
-        <w:rPr>
-          <w:rFonts w:ascii="Arial" w:eastAsia="Times New Roman" w:hAnsi="Arial" w:cs="Times New Roman"/>
-          <w:kern w:val="0"/>
-          <w:lang w:eastAsia="tr-TR"/>
-          <w14:ligatures w14:val="none"/>
-        </w:rPr>
-      </w:pPr>
-      <w:r>
-        <w:rPr>
-          <w:rFonts w:ascii="Arial" w:eastAsia="Times New Roman" w:hAnsi="Arial" w:cs="Times New Roman"/>
-          <w:b/>
-          <w:bCs/>
-          <w:kern w:val="0"/>
-          <w:lang w:eastAsia="tr-TR"/>
-          <w14:ligatures w14:val="none"/>
-        </w:rPr>
-        <w:t>Multi-</w:t>
-      </w:r>
-      <w:r>
-        <w:rPr>
-          <w:rFonts w:ascii="Arial" w:eastAsia="Times New Roman" w:hAnsi="Arial" w:cs="Times New Roman"/>
-          <w:b/>
-          <w:bCs/>
-          <w:kern w:val="0"/>
-          <w:lang w:eastAsia="tr-TR"/>
-          <w14:ligatures w14:val="none"/>
-        </w:rPr>
-        <w:t>hot-e</w:t>
-      </w:r>
-      <w:r>
-        <w:rPr>
-          <w:rFonts w:ascii="Arial" w:eastAsia="Times New Roman" w:hAnsi="Arial" w:cs="Times New Roman"/>
-          <w:b/>
-          <w:bCs/>
-          <w:kern w:val="0"/>
-          <w:lang w:eastAsia="tr-TR"/>
-          <w14:ligatures w14:val="none"/>
-        </w:rPr>
-        <w:t xml:space="preserve">ncoded </w:t>
-      </w:r>
-      <w:r>
-        <w:rPr>
-          <w:rFonts w:ascii="Arial" w:eastAsia="Times New Roman" w:hAnsi="Arial" w:cs="Times New Roman"/>
-          <w:b/>
-          <w:bCs/>
-          <w:kern w:val="0"/>
-          <w:lang w:eastAsia="tr-TR"/>
-          <w14:ligatures w14:val="none"/>
-        </w:rPr>
-        <w:t>g</w:t>
-      </w:r>
-      <w:r>
-        <w:rPr>
-          <w:rFonts w:ascii="Arial" w:eastAsia="Times New Roman" w:hAnsi="Arial" w:cs="Times New Roman"/>
-          <w:b/>
-          <w:bCs/>
-          <w:kern w:val="0"/>
-          <w:lang w:eastAsia="tr-TR"/>
-          <w14:ligatures w14:val="none"/>
-        </w:rPr>
-        <w:t>enres:</w:t>
-      </w:r>
-      <w:r>
-        <w:rPr>
-          <w:rFonts w:ascii="Arial" w:eastAsia="Times New Roman" w:hAnsi="Arial" w:cs="Times New Roman"/>
-          <w:kern w:val="0"/>
-          <w:lang w:eastAsia="tr-TR"/>
-          <w14:ligatures w14:val="none"/>
-        </w:rPr>
-        <w:t xml:space="preserve"> Categorical text data representing the movie's genres.</w:t>
-      </w:r>
-    </w:p>
-    <w:p>
-      <w:pPr>
-        <w:numPr>
-          <w:ilvl w:val="0"/>
-          <w:numId w:val="1"/>
-        </w:numPr>
-        <w:spacing w:after="100" w:afterAutospacing="1" w:line="240" w:lineRule="auto"/>
-        <w:rPr>
-          <w:rFonts w:ascii="Arial" w:eastAsia="Times New Roman" w:hAnsi="Arial" w:cs="Times New Roman"/>
-          <w:kern w:val="0"/>
-          <w:lang w:eastAsia="tr-TR"/>
-          <w14:ligatures w14:val="none"/>
-        </w:rPr>
-      </w:pPr>
-      <w:r>
-        <w:rPr>
-          <w:rFonts w:ascii="Arial" w:eastAsia="Times New Roman" w:hAnsi="Arial" w:cs="Times New Roman"/>
-          <w:b/>
-          <w:bCs/>
-          <w:kern w:val="0"/>
-          <w:lang w:eastAsia="tr-TR"/>
-          <w14:ligatures w14:val="none"/>
-        </w:rPr>
-        <w:t>Min-Max Scaled Numerical Ratings:</w:t>
-      </w:r>
-      <w:r>
-        <w:rPr>
-          <w:rFonts w:ascii="Arial" w:eastAsia="Times New Roman" w:hAnsi="Arial" w:cs="Times New Roman"/>
-          <w:kern w:val="0"/>
-          <w:lang w:eastAsia="tr-TR"/>
-          <w14:ligatures w14:val="none"/>
-        </w:rPr>
-        <w:t xml:space="preserve"> Continuous numerical data representing the movie's critical/audience reception via its </w:t>
-      </w:r>
-      <w:r>
-        <w:rPr>
-          <w:rFonts w:ascii="Arial" w:eastAsia="Times New Roman" w:hAnsi="Arial" w:cs="Courier New"/>
-          <w:kern w:val="0"/>
-          <w:sz w:val="20"/>
-          <w:szCs w:val="20"/>
-          <w:lang w:eastAsia="tr-TR"/>
-          <w14:ligatures w14:val="none"/>
-        </w:rPr>
-        <w:t>imdb_score</w:t>
-      </w:r>
-      <w:r>
-        <w:rPr>
-          <w:rFonts w:ascii="Arial" w:eastAsia="Times New Roman" w:hAnsi="Arial" w:cs="Times New Roman"/>
-          <w:kern w:val="0"/>
-          <w:lang w:eastAsia="tr-TR"/>
-          <w14:ligatures w14:val="none"/>
-        </w:rPr>
-        <w:t>.</w:t>
-      </w:r>
-    </w:p>
-    <w:p>
-      <w:pPr>
-        <w:spacing w:after="100" w:afterAutospacing="1" w:line="240" w:lineRule="auto"/>
-        <w:outlineLvl w:val="2"/>
-        <w:rPr>
-          <w:rFonts w:ascii="Arial" w:eastAsia="Times New Roman" w:hAnsi="Arial" w:cs="Times New Roman"/>
-          <w:b/>
-          <w:bCs/>
-          <w:kern w:val="0"/>
-          <w:sz w:val="27"/>
-          <w:szCs w:val="27"/>
-          <w:lang w:eastAsia="tr-TR"/>
-          <w14:ligatures w14:val="none"/>
-        </w:rPr>
-      </w:pPr>
-      <w:r>
-        <w:rPr>
-          <w:rFonts w:ascii="Arial" w:eastAsia="Times New Roman" w:hAnsi="Arial" w:cs="Times New Roman"/>
-          <w:b/>
-          <w:bCs/>
-          <w:kern w:val="0"/>
-          <w:sz w:val="27"/>
-          <w:szCs w:val="27"/>
-          <w:lang w:eastAsia="tr-TR"/>
-          <w14:ligatures w14:val="none"/>
-        </w:rPr>
         <w:t>2. Justification of Features</w:t>
-      </w:r>
-    </w:p>
-    <w:p>
-      <w:pPr>
-        <w:numPr>
-          <w:ilvl w:val="0"/>
-          <w:numId w:val="2"/>
-        </w:numPr>
-        <w:spacing w:after="100" w:afterAutospacing="1" w:line="240" w:lineRule="auto"/>
-        <w:rPr>
-          <w:rFonts w:ascii="Arial" w:eastAsia="Times New Roman" w:hAnsi="Arial" w:cs="Times New Roman"/>
-          <w:kern w:val="0"/>
-          <w:lang w:eastAsia="tr-TR"/>
-          <w14:ligatures w14:val="none"/>
-        </w:rPr>
-      </w:pPr>
-      <w:r>
-        <w:rPr>
-          <w:rFonts w:ascii="Arial" w:eastAsia="Times New Roman" w:hAnsi="Arial" w:cs="Times New Roman"/>
-          <w:b/>
-          <w:bCs/>
-          <w:kern w:val="0"/>
-          <w:lang w:eastAsia="tr-TR"/>
-          <w14:ligatures w14:val="none"/>
-        </w:rPr>
-        <w:t>Genres (Categorical / Multi-label):</w:t>
-      </w:r>
-      <w:r>
-        <w:rPr>
-          <w:rFonts w:ascii="Arial" w:eastAsia="Times New Roman" w:hAnsi="Arial" w:cs="Times New Roman"/>
-          <w:kern w:val="0"/>
-          <w:lang w:eastAsia="tr-TR"/>
-          <w14:ligatures w14:val="none"/>
-        </w:rPr>
-        <w:t xml:space="preserve"> Movies rarely belong to just a single genre (e.g., </w:t>
-      </w:r>
-      <w:r>
-        <w:rPr>
-          <w:rFonts w:ascii="Arial" w:eastAsia="Times New Roman" w:hAnsi="Arial" w:cs="Times New Roman"/>
-          <w:i/>
-          <w:iCs/>
-          <w:kern w:val="0"/>
-          <w:lang w:eastAsia="tr-TR"/>
-          <w14:ligatures w14:val="none"/>
-        </w:rPr>
-        <w:t>Action|Adventure|Sci-Fi</w:t>
-      </w:r>
-      <w:r>
-        <w:rPr>
-          <w:rFonts w:ascii="Arial" w:eastAsia="Times New Roman" w:hAnsi="Arial" w:cs="Times New Roman"/>
-          <w:kern w:val="0"/>
-          <w:lang w:eastAsia="tr-TR"/>
-          <w14:ligatures w14:val="none"/>
-        </w:rPr>
-        <w:t>). Using a bag-of-words / count vectorizer approach (</w:t>
-      </w:r>
-      <w:r>
-        <w:rPr>
-          <w:rFonts w:ascii="Arial" w:eastAsia="Times New Roman" w:hAnsi="Arial" w:cs="Courier New"/>
-          <w:kern w:val="0"/>
-          <w:sz w:val="20"/>
-          <w:szCs w:val="20"/>
-          <w:lang w:eastAsia="tr-TR"/>
-          <w14:ligatures w14:val="none"/>
-        </w:rPr>
-        <w:t>CountVectorizer</w:t>
-      </w:r>
-      <w:r>
-        <w:rPr>
-          <w:rFonts w:ascii="Arial" w:eastAsia="Times New Roman" w:hAnsi="Arial" w:cs="Times New Roman"/>
-          <w:kern w:val="0"/>
-          <w:lang w:eastAsia="tr-TR"/>
-          <w14:ligatures w14:val="none"/>
-        </w:rPr>
-        <w:t>) split by the pipe (</w:t>
-      </w:r>
-      <w:r>
-        <w:rPr>
-          <w:rFonts w:ascii="Arial" w:eastAsia="Times New Roman" w:hAnsi="Arial" w:cs="Courier New"/>
-          <w:kern w:val="0"/>
-          <w:sz w:val="20"/>
-          <w:szCs w:val="20"/>
-          <w:lang w:eastAsia="tr-TR"/>
-          <w14:ligatures w14:val="none"/>
-        </w:rPr>
-        <w:t>|</w:t>
-      </w:r>
-      <w:r>
-        <w:rPr>
-          <w:rFonts w:ascii="Arial" w:eastAsia="Times New Roman" w:hAnsi="Arial" w:cs="Times New Roman"/>
-          <w:kern w:val="0"/>
-          <w:lang w:eastAsia="tr-TR"/>
-          <w14:ligatures w14:val="none"/>
-        </w:rPr>
-        <w:t xml:space="preserve">) delimiter creates a multi-hot binary vector. This allows the recommender model to capture specific content preferences (e.g., a user who prefers comedies or action films) through the inner product with the user preference vector </w:t>
-      </w:r>
-      <m:oMath>
-        <m:r>
-          <w:rPr>
-            <w:rFonts w:ascii="Cambria Math" w:eastAsia="Times New Roman" w:hAnsi="Cambria Math" w:cs="Times New Roman"/>
-            <w:kern w:val="0"/>
-            <w:lang w:eastAsia="tr-TR"/>
-            <w14:ligatures w14:val="none"/>
-          </w:rPr>
-          <m:t>w</m:t>
-        </m:r>
-      </m:oMath>
-      <w:r>
-        <w:rPr>
-          <w:rFonts w:ascii="Arial" w:eastAsia="Times New Roman" w:hAnsi="Arial" w:cs="Times New Roman"/>
-          <w:kern w:val="0"/>
-          <w:lang w:eastAsia="tr-TR"/>
-          <w14:ligatures w14:val="none"/>
-        </w:rPr>
-        <w:t>.</w:t>
       </w:r>
     </w:p>
     <w:p>
@@ -2298,6 +2827,16 @@
       <w:szCs w:val="20"/>
     </w:rPr>
   </w:style>
+  <w:style w:type="character" w:customStyle="1" w:styleId="s1">
+    <w:name w:val="s1"/>
+    <w:basedOn w:val="VarsaylanParagrafYazTipi"/>
+    <w:rsid w:val="0077452F"/>
+    <w:rPr>
+      <w:rFonts w:ascii="Helvetica" w:hAnsi="Helvetica" w:hint="default"/>
+      <w:sz w:val="12"/>
+      <w:szCs w:val="12"/>
+    </w:rPr>
+  </w:style>
 </w:styles>
 </file>
 

</xml_diff>

<commit_message>
modified comments to be more descriptive, and the utility score precision
</commit_message>
<xml_diff>
--- a/static/Project_4_Report.docx
+++ b/static/Project_4_Report.docx
@@ -198,6 +198,7 @@
     <w:p>
       <w:pPr>
         <w:rPr>
+          <w:rFonts w:ascii="Times New Roman" w:hAnsi="Times New Roman" w:cs="Times New Roman"/>
           <w:b/>
           <w:bCs/>
           <w:u w:val="single"/>
@@ -207,6 +208,7 @@
       <w:proofErr w:type="spellStart"/>
       <w:r>
         <w:rPr>
+          <w:rFonts w:ascii="Times New Roman" w:hAnsi="Times New Roman" w:cs="Times New Roman"/>
           <w:b/>
           <w:bCs/>
           <w:u w:val="single"/>
@@ -217,6 +219,7 @@
       <w:proofErr w:type="spellEnd"/>
       <w:r>
         <w:rPr>
+          <w:rFonts w:ascii="Times New Roman" w:hAnsi="Times New Roman" w:cs="Times New Roman"/>
           <w:b/>
           <w:bCs/>
           <w:u w:val="single"/>
@@ -294,7 +297,27 @@
           <w:sz w:val="24"/>
           <w:szCs w:val="24"/>
         </w:rPr>
-        <w:t>“Minimum-Maximum Scaled Numerical Rating Values”</w:t>
+        <w:t xml:space="preserve">“Minimum-Maximum Scaled Numerical </w:t>
+      </w:r>
+      <w:r>
+        <w:rPr>
+          <w:rFonts w:ascii="Times New Roman" w:hAnsi="Times New Roman"/>
+          <w:b/>
+          <w:bCs/>
+          <w:sz w:val="24"/>
+          <w:szCs w:val="24"/>
+        </w:rPr>
+        <w:t xml:space="preserve">IMDB </w:t>
+      </w:r>
+      <w:r>
+        <w:rPr>
+          <w:rFonts w:ascii="Times New Roman" w:hAnsi="Times New Roman"/>
+          <w:b/>
+          <w:bCs/>
+          <w:sz w:val="24"/>
+          <w:szCs w:val="24"/>
+        </w:rPr>
+        <w:t>Rating Values”</w:t>
       </w:r>
       <w:r>
         <w:rPr>
@@ -379,6 +402,22 @@
           <w:szCs w:val="24"/>
         </w:rPr>
         <w:t xml:space="preserve">the genres of the movie. </w:t>
+      </w:r>
+      <w:r>
+        <w:rPr>
+          <w:rFonts w:ascii="Times New Roman" w:hAnsi="Times New Roman"/>
+          <w:sz w:val="24"/>
+          <w:szCs w:val="24"/>
+        </w:rPr>
+        <w:t xml:space="preserve">I have chosen the features of movie genre and IMDB score, since they better represent the user’s movie selection/order and provide more realistic movie(s) to be recommended. </w:t>
+      </w:r>
+      <w:r>
+        <w:rPr>
+          <w:rFonts w:ascii="Times New Roman" w:hAnsi="Times New Roman"/>
+          <w:sz w:val="24"/>
+          <w:szCs w:val="24"/>
+        </w:rPr>
+        <w:t xml:space="preserve">If a movie is included under a category, the genre matrix takes the value 1 for the given movie and category. Otherwise, the genre matrix takes the value of 0. </w:t>
       </w:r>
       <w:r>
         <w:rPr>
@@ -1138,7 +1177,17 @@
           <w:sz w:val="24"/>
           <w:szCs w:val="24"/>
         </w:rPr>
-        <w:t xml:space="preserve"> and not count the word frequency. Because the multi-hot encoding approach includes just the binary values of 0 and 1, and not the frequency. This count vectorizer </w:t>
+        <w:t xml:space="preserve"> and not count the word frequency. Because the multi-hot encoding approach </w:t>
+      </w:r>
+      <w:r>
+        <w:rPr>
+          <w:rFonts w:ascii="Times New Roman" w:hAnsi="Times New Roman"/>
+          <w:color w:val="000000" w:themeColor="text1"/>
+          <w:sz w:val="24"/>
+          <w:szCs w:val="24"/>
+        </w:rPr>
+        <w:lastRenderedPageBreak/>
+        <w:t xml:space="preserve">includes just the binary values of 0 and 1, and not the frequency. This count vectorizer </w:t>
       </w:r>
       <w:r>
         <w:rPr>
@@ -1212,6 +1261,88 @@
           <w:szCs w:val="24"/>
         </w:rPr>
       </w:pPr>
+      <w:r>
+        <w:rPr>
+          <w:rFonts w:ascii="Times New Roman" w:hAnsi="Times New Roman"/>
+          <w:sz w:val="24"/>
+          <w:szCs w:val="24"/>
+        </w:rPr>
+        <w:tab/>
+      </w:r>
+      <w:r>
+        <w:rPr>
+          <w:rFonts w:ascii="Times New Roman" w:hAnsi="Times New Roman"/>
+          <w:sz w:val="24"/>
+          <w:szCs w:val="24"/>
+        </w:rPr>
+        <w:t xml:space="preserve">Using the count vectorizer or bag-of-words approach </w:t>
+      </w:r>
+      <w:r>
+        <w:rPr>
+          <w:rFonts w:ascii="Times New Roman" w:hAnsi="Times New Roman"/>
+          <w:sz w:val="24"/>
+          <w:szCs w:val="24"/>
+        </w:rPr>
+        <w:t>lets the movie recommender model capture the user's genre preferences (e.g., comedy, adventure, action) by calculating the inner product of the user’s preference vector w and the movie feature</w:t>
+      </w:r>
+      <w:r>
+        <w:rPr>
+          <w:rFonts w:ascii="Times New Roman" w:hAnsi="Times New Roman"/>
+          <w:sz w:val="24"/>
+          <w:szCs w:val="24"/>
+        </w:rPr>
+        <w:t xml:space="preserve"> vector x </w:t>
+      </w:r>
+      <w:r>
+        <w:rPr>
+          <w:rFonts w:ascii="Times New Roman" w:hAnsi="Times New Roman"/>
+          <w:b/>
+          <w:bCs/>
+          <w:sz w:val="24"/>
+          <w:szCs w:val="24"/>
+        </w:rPr>
+        <w:t>(w^T * x).</w:t>
+      </w:r>
+      <w:r>
+        <w:rPr>
+          <w:rFonts w:ascii="Times New Roman" w:hAnsi="Times New Roman"/>
+          <w:sz w:val="24"/>
+          <w:szCs w:val="24"/>
+        </w:rPr>
+        <w:t xml:space="preserve"> </w:t>
+      </w:r>
+      <w:r>
+        <w:rPr>
+          <w:rFonts w:ascii="Times New Roman" w:hAnsi="Times New Roman"/>
+          <w:sz w:val="24"/>
+          <w:szCs w:val="24"/>
+        </w:rPr>
+        <w:t xml:space="preserve">Here, the </w:t>
+      </w:r>
+      <w:r>
+        <w:rPr>
+          <w:rFonts w:ascii="Times New Roman" w:hAnsi="Times New Roman"/>
+          <w:sz w:val="24"/>
+          <w:szCs w:val="24"/>
+        </w:rPr>
+        <w:t xml:space="preserve">utility for </w:t>
+      </w:r>
+      <w:r>
+        <w:rPr>
+          <w:rFonts w:ascii="Times New Roman" w:hAnsi="Times New Roman"/>
+          <w:sz w:val="24"/>
+          <w:szCs w:val="24"/>
+        </w:rPr>
+        <w:t>a</w:t>
+      </w:r>
+      <w:r>
+        <w:rPr>
+          <w:rFonts w:ascii="Times New Roman" w:hAnsi="Times New Roman"/>
+          <w:sz w:val="24"/>
+          <w:szCs w:val="24"/>
+        </w:rPr>
+        <w:t xml:space="preserve"> given movie and user is the value of the inner product of vectors w and x. </w:t>
+      </w:r>
     </w:p>
     <w:p>
       <w:pPr>
@@ -1230,40 +1361,64 @@
           <w:sz w:val="24"/>
           <w:szCs w:val="24"/>
         </w:rPr>
-        <w:lastRenderedPageBreak/>
         <w:tab/>
-      </w:r>
-      <w:r>
-        <w:rPr>
-          <w:rFonts w:ascii="Times New Roman" w:hAnsi="Times New Roman"/>
-          <w:sz w:val="24"/>
-          <w:szCs w:val="24"/>
-        </w:rPr>
-        <w:t xml:space="preserve">Using the count vectorizer or bag-of-words approach permits the movie recommender model to grasp </w:t>
-      </w:r>
-      <w:r>
-        <w:rPr>
-          <w:rFonts w:ascii="Times New Roman" w:hAnsi="Times New Roman"/>
-          <w:sz w:val="24"/>
-          <w:szCs w:val="24"/>
-        </w:rPr>
-        <w:t>specific movie genre preferences of the user (e.g., comedy, adventure, action</w:t>
-      </w:r>
-      <w:r>
-        <w:rPr>
-          <w:rFonts w:ascii="Times New Roman" w:hAnsi="Times New Roman"/>
-          <w:sz w:val="24"/>
-          <w:szCs w:val="24"/>
-        </w:rPr>
-        <w:t xml:space="preserve">) </w:t>
-      </w:r>
-      <w:r>
-        <w:rPr>
-          <w:rFonts w:ascii="Times New Roman" w:hAnsi="Times New Roman"/>
-          <w:sz w:val="24"/>
-          <w:szCs w:val="24"/>
-        </w:rPr>
-        <w:t xml:space="preserve">through the calculation of the inner product of the user’s movie preference vector w and </w:t>
+        <w:t xml:space="preserve">The rating of a movie is treated as a reliable indicator </w:t>
+      </w:r>
+      <w:r>
+        <w:rPr>
+          <w:rFonts w:ascii="Times New Roman" w:hAnsi="Times New Roman"/>
+          <w:sz w:val="24"/>
+          <w:szCs w:val="24"/>
+        </w:rPr>
+        <w:t>of</w:t>
+      </w:r>
+      <w:r>
+        <w:rPr>
+          <w:rFonts w:ascii="Times New Roman" w:hAnsi="Times New Roman"/>
+          <w:sz w:val="24"/>
+          <w:szCs w:val="24"/>
+        </w:rPr>
+        <w:t xml:space="preserve"> general movie appeal </w:t>
+      </w:r>
+      <w:r>
+        <w:rPr>
+          <w:rFonts w:ascii="Times New Roman" w:hAnsi="Times New Roman"/>
+          <w:sz w:val="24"/>
+          <w:szCs w:val="24"/>
+        </w:rPr>
+        <w:t>by audience</w:t>
+      </w:r>
+      <w:r>
+        <w:rPr>
+          <w:rFonts w:ascii="Times New Roman" w:hAnsi="Times New Roman"/>
+          <w:sz w:val="24"/>
+          <w:szCs w:val="24"/>
+        </w:rPr>
+        <w:t>s</w:t>
+      </w:r>
+      <w:r>
+        <w:rPr>
+          <w:rFonts w:ascii="Times New Roman" w:hAnsi="Times New Roman"/>
+          <w:sz w:val="24"/>
+          <w:szCs w:val="24"/>
+        </w:rPr>
+        <w:t xml:space="preserve"> and critics, and </w:t>
+      </w:r>
+      <w:r>
+        <w:rPr>
+          <w:rFonts w:ascii="Times New Roman" w:hAnsi="Times New Roman"/>
+          <w:sz w:val="24"/>
+          <w:szCs w:val="24"/>
+        </w:rPr>
+        <w:t>of</w:t>
+      </w:r>
+      <w:r>
+        <w:rPr>
+          <w:rFonts w:ascii="Times New Roman" w:hAnsi="Times New Roman"/>
+          <w:sz w:val="24"/>
+          <w:szCs w:val="24"/>
+        </w:rPr>
+        <w:t xml:space="preserve"> </w:t>
       </w:r>
       <w:r>
         <w:rPr>
@@ -1279,17 +1434,7 @@
           <w:sz w:val="24"/>
           <w:szCs w:val="24"/>
         </w:rPr>
-        <w:t xml:space="preserve">movie features vector x </w:t>
-      </w:r>
-      <w:r>
-        <w:rPr>
-          <w:rFonts w:ascii="Times New Roman" w:hAnsi="Times New Roman"/>
-          <w:b/>
-          <w:bCs/>
-          <w:sz w:val="24"/>
-          <w:szCs w:val="24"/>
-        </w:rPr>
-        <w:t>(w^T * x).</w:t>
+        <w:t xml:space="preserve">overall movie quality. </w:t>
       </w:r>
       <w:r>
         <w:rPr>
@@ -1305,15 +1450,197 @@
           <w:sz w:val="24"/>
           <w:szCs w:val="24"/>
         </w:rPr>
-        <w:t xml:space="preserve">Here, the </w:t>
-      </w:r>
-      <w:r>
-        <w:rPr>
-          <w:rFonts w:ascii="Times New Roman" w:hAnsi="Times New Roman"/>
-          <w:sz w:val="24"/>
-          <w:szCs w:val="24"/>
-        </w:rPr>
-        <w:t xml:space="preserve">utility obtained for the given movie and user is the value of the inner product of the vectors w and x. </w:t>
+        <w:t xml:space="preserve">I have applied a scaling operation to every IMDb score in the dataset by using the MinMaxScaler() class. This </w:t>
+      </w:r>
+      <w:r>
+        <w:rPr>
+          <w:rFonts w:ascii="Times New Roman" w:hAnsi="Times New Roman"/>
+          <w:sz w:val="24"/>
+          <w:szCs w:val="24"/>
+        </w:rPr>
+        <w:t xml:space="preserve">normalization operation </w:t>
+      </w:r>
+      <w:r>
+        <w:rPr>
+          <w:rFonts w:ascii="Times New Roman" w:hAnsi="Times New Roman"/>
+          <w:sz w:val="24"/>
+          <w:szCs w:val="24"/>
+        </w:rPr>
+        <w:t xml:space="preserve">restricts the value of </w:t>
+      </w:r>
+      <w:r>
+        <w:rPr>
+          <w:rFonts w:ascii="Times New Roman" w:hAnsi="Times New Roman"/>
+          <w:sz w:val="24"/>
+          <w:szCs w:val="24"/>
+        </w:rPr>
+        <w:t xml:space="preserve">the IMDb score </w:t>
+      </w:r>
+      <w:r>
+        <w:rPr>
+          <w:rFonts w:ascii="Times New Roman" w:hAnsi="Times New Roman"/>
+          <w:sz w:val="24"/>
+          <w:szCs w:val="24"/>
+        </w:rPr>
+        <w:t xml:space="preserve">between 0 and 1, </w:t>
+      </w:r>
+      <w:r>
+        <w:rPr>
+          <w:rFonts w:ascii="Times New Roman" w:hAnsi="Times New Roman"/>
+          <w:sz w:val="24"/>
+          <w:szCs w:val="24"/>
+        </w:rPr>
+        <w:t xml:space="preserve"> </w:t>
+      </w:r>
+      <w:r>
+        <w:rPr>
+          <w:rFonts w:ascii="Times New Roman" w:hAnsi="Times New Roman"/>
+          <w:sz w:val="24"/>
+          <w:szCs w:val="24"/>
+        </w:rPr>
+        <w:t xml:space="preserve">which is significant since it makes sure that the IMDb score does not dominate the binary movie genre dimensions while calculating the linear utility values using the w^T * x multiplication, the dot product of the vectors w and x. Because, originally, in the given dataset, the IMDb score of a movie takes values between 0 and 10. </w:t>
+      </w:r>
+      <w:r>
+        <w:rPr>
+          <w:rFonts w:ascii="Times New Roman" w:hAnsi="Times New Roman"/>
+          <w:sz w:val="24"/>
+          <w:szCs w:val="24"/>
+        </w:rPr>
+        <w:t xml:space="preserve">Moreover, the binary movie genre </w:t>
+      </w:r>
+      <w:r>
+        <w:rPr>
+          <w:rFonts w:ascii="Times New Roman" w:hAnsi="Times New Roman"/>
+          <w:sz w:val="24"/>
+          <w:szCs w:val="24"/>
+        </w:rPr>
+        <w:t>value,</w:t>
+      </w:r>
+      <w:r>
+        <w:rPr>
+          <w:rFonts w:ascii="Times New Roman" w:hAnsi="Times New Roman"/>
+          <w:sz w:val="24"/>
+          <w:szCs w:val="24"/>
+        </w:rPr>
+        <w:t xml:space="preserve"> depending </w:t>
+      </w:r>
+      <w:r>
+        <w:rPr>
+          <w:rFonts w:ascii="Times New Roman" w:hAnsi="Times New Roman"/>
+          <w:sz w:val="24"/>
+          <w:szCs w:val="24"/>
+        </w:rPr>
+        <w:t xml:space="preserve">on the existence of the movie in the specified genre, lies between 0 and 1. The linear utility model </w:t>
+      </w:r>
+      <w:r>
+        <w:rPr>
+          <w:rFonts w:ascii="Times New Roman" w:hAnsi="Times New Roman"/>
+          <w:b/>
+          <w:bCs/>
+          <w:sz w:val="24"/>
+          <w:szCs w:val="24"/>
+        </w:rPr>
+        <w:t>(w^T * x)</w:t>
+      </w:r>
+      <w:r>
+        <w:rPr>
+          <w:rFonts w:ascii="Times New Roman" w:hAnsi="Times New Roman"/>
+          <w:sz w:val="24"/>
+          <w:szCs w:val="24"/>
+        </w:rPr>
+        <w:t xml:space="preserve"> </w:t>
+      </w:r>
+      <w:r>
+        <w:rPr>
+          <w:rFonts w:ascii="Times New Roman" w:hAnsi="Times New Roman"/>
+          <w:sz w:val="24"/>
+          <w:szCs w:val="24"/>
+        </w:rPr>
+        <w:t xml:space="preserve">will overemphasize the IMDb score over the movie genre if normalization to the range between 0 and 1 is not applied. Because the range of IMDb scores </w:t>
+      </w:r>
+      <w:r>
+        <w:rPr>
+          <w:rFonts w:ascii="Times New Roman" w:hAnsi="Times New Roman"/>
+          <w:b/>
+          <w:bCs/>
+          <w:sz w:val="24"/>
+          <w:szCs w:val="24"/>
+        </w:rPr>
+        <w:t>(0-10)</w:t>
+      </w:r>
+      <w:r>
+        <w:rPr>
+          <w:rFonts w:ascii="Times New Roman" w:hAnsi="Times New Roman"/>
+          <w:sz w:val="24"/>
+          <w:szCs w:val="24"/>
+        </w:rPr>
+        <w:t xml:space="preserve"> is much higher than the binary movie genre values </w:t>
+      </w:r>
+      <w:r>
+        <w:rPr>
+          <w:rFonts w:ascii="Times New Roman" w:hAnsi="Times New Roman"/>
+          <w:b/>
+          <w:bCs/>
+          <w:sz w:val="24"/>
+          <w:szCs w:val="24"/>
+        </w:rPr>
+        <w:t>(0-1, 0 or 1)</w:t>
+      </w:r>
+      <w:r>
+        <w:rPr>
+          <w:rFonts w:ascii="Times New Roman" w:hAnsi="Times New Roman"/>
+          <w:sz w:val="24"/>
+          <w:szCs w:val="24"/>
+        </w:rPr>
+        <w:t>.</w:t>
+      </w:r>
+      <w:r>
+        <w:rPr>
+          <w:rFonts w:ascii="Times New Roman" w:hAnsi="Times New Roman"/>
+          <w:sz w:val="24"/>
+          <w:szCs w:val="24"/>
+        </w:rPr>
+        <w:t xml:space="preserve"> After the normalization, both </w:t>
+      </w:r>
+      <w:r>
+        <w:rPr>
+          <w:rFonts w:ascii="Times New Roman" w:hAnsi="Times New Roman"/>
+          <w:sz w:val="24"/>
+          <w:szCs w:val="24"/>
+        </w:rPr>
+        <w:t>the IMDb</w:t>
+      </w:r>
+      <w:r>
+        <w:rPr>
+          <w:rFonts w:ascii="Times New Roman" w:hAnsi="Times New Roman"/>
+          <w:sz w:val="24"/>
+          <w:szCs w:val="24"/>
+        </w:rPr>
+        <w:t xml:space="preserve"> score and genre value will be in the range of 0 to 1</w:t>
+      </w:r>
+      <w:r>
+        <w:rPr>
+          <w:rFonts w:ascii="Times New Roman" w:hAnsi="Times New Roman"/>
+          <w:sz w:val="24"/>
+          <w:szCs w:val="24"/>
+        </w:rPr>
+        <w:t xml:space="preserve">, and thus equally emphasized, which leads to more realistic </w:t>
+      </w:r>
+      <w:r>
+        <w:rPr>
+          <w:rFonts w:ascii="Times New Roman" w:hAnsi="Times New Roman"/>
+          <w:sz w:val="24"/>
+          <w:szCs w:val="24"/>
+        </w:rPr>
+        <w:t xml:space="preserve">(fairer) </w:t>
+      </w:r>
+      <w:r>
+        <w:rPr>
+          <w:rFonts w:ascii="Times New Roman" w:hAnsi="Times New Roman"/>
+          <w:sz w:val="24"/>
+          <w:szCs w:val="24"/>
+        </w:rPr>
+        <w:t xml:space="preserve">utility scores of the linear model. </w:t>
       </w:r>
     </w:p>
     <w:p>
@@ -1327,257 +1654,580 @@
           <w:szCs w:val="24"/>
         </w:rPr>
       </w:pPr>
-      <w:r>
-        <w:rPr>
-          <w:rFonts w:ascii="Times New Roman" w:hAnsi="Times New Roman"/>
-          <w:sz w:val="24"/>
-          <w:szCs w:val="24"/>
-        </w:rPr>
-        <w:tab/>
-        <w:t xml:space="preserve">The rating of a movie is treated as a reliable indicator </w:t>
-      </w:r>
-      <w:r>
-        <w:rPr>
-          <w:rFonts w:ascii="Times New Roman" w:hAnsi="Times New Roman"/>
-          <w:sz w:val="24"/>
-          <w:szCs w:val="24"/>
-        </w:rPr>
-        <w:t>of</w:t>
-      </w:r>
-      <w:r>
-        <w:rPr>
-          <w:rFonts w:ascii="Times New Roman" w:hAnsi="Times New Roman"/>
-          <w:sz w:val="24"/>
-          <w:szCs w:val="24"/>
-        </w:rPr>
-        <w:t xml:space="preserve"> general movie appeal </w:t>
-      </w:r>
-      <w:r>
-        <w:rPr>
-          <w:rFonts w:ascii="Times New Roman" w:hAnsi="Times New Roman"/>
-          <w:sz w:val="24"/>
-          <w:szCs w:val="24"/>
-        </w:rPr>
-        <w:t>by audience</w:t>
-      </w:r>
-      <w:r>
-        <w:rPr>
-          <w:rFonts w:ascii="Times New Roman" w:hAnsi="Times New Roman"/>
-          <w:sz w:val="24"/>
-          <w:szCs w:val="24"/>
-        </w:rPr>
-        <w:t>s</w:t>
-      </w:r>
-      <w:r>
-        <w:rPr>
-          <w:rFonts w:ascii="Times New Roman" w:hAnsi="Times New Roman"/>
-          <w:sz w:val="24"/>
-          <w:szCs w:val="24"/>
-        </w:rPr>
-        <w:t xml:space="preserve"> and critics, and </w:t>
-      </w:r>
-      <w:r>
-        <w:rPr>
-          <w:rFonts w:ascii="Times New Roman" w:hAnsi="Times New Roman"/>
-          <w:sz w:val="24"/>
-          <w:szCs w:val="24"/>
-        </w:rPr>
-        <w:t>of</w:t>
-      </w:r>
-      <w:r>
-        <w:rPr>
-          <w:rFonts w:ascii="Times New Roman" w:hAnsi="Times New Roman"/>
-          <w:sz w:val="24"/>
-          <w:szCs w:val="24"/>
-        </w:rPr>
-        <w:t xml:space="preserve"> overall movie quality. </w:t>
-      </w:r>
-      <w:r>
-        <w:rPr>
-          <w:rFonts w:ascii="Times New Roman" w:hAnsi="Times New Roman"/>
-          <w:sz w:val="24"/>
-          <w:szCs w:val="24"/>
-        </w:rPr>
-        <w:t xml:space="preserve"> </w:t>
-      </w:r>
-      <w:r>
-        <w:rPr>
-          <w:rFonts w:ascii="Times New Roman" w:hAnsi="Times New Roman"/>
-          <w:sz w:val="24"/>
-          <w:szCs w:val="24"/>
-        </w:rPr>
-        <w:t xml:space="preserve">I have applied a scaling operation to every IMDb score in the dataset by using the MinMaxScaler() class. This restricts the value of this score between 0 and 1, </w:t>
-      </w:r>
-      <w:r>
-        <w:rPr>
-          <w:rFonts w:ascii="Times New Roman" w:hAnsi="Times New Roman"/>
-          <w:sz w:val="24"/>
-          <w:szCs w:val="24"/>
-        </w:rPr>
-        <w:t xml:space="preserve">   </w:t>
-      </w:r>
     </w:p>
     <w:p>
       <w:pPr>
         <w:rPr>
+          <w:b/>
+          <w:bCs/>
+          <w:u w:val="single"/>
           <w:lang w:val="tr-TR"/>
         </w:rPr>
       </w:pPr>
+      <w:proofErr w:type="spellStart"/>
+      <w:r>
+        <w:rPr>
+          <w:b/>
+          <w:bCs/>
+          <w:u w:val="single"/>
+          <w:lang w:val="tr-TR"/>
+        </w:rPr>
+        <w:t>Task</w:t>
+      </w:r>
+      <w:proofErr w:type="spellEnd"/>
+      <w:r>
+        <w:rPr>
+          <w:b/>
+          <w:bCs/>
+          <w:u w:val="single"/>
+          <w:lang w:val="tr-TR"/>
+        </w:rPr>
+        <w:t xml:space="preserve"> 2: </w:t>
+      </w:r>
     </w:p>
     <w:p>
       <w:pPr>
-        <w:spacing w:after="100" w:afterAutospacing="1" w:line="240" w:lineRule="auto"/>
-        <w:outlineLvl w:val="2"/>
-        <w:rPr>
-          <w:rFonts w:ascii="Arial" w:eastAsia="Times New Roman" w:hAnsi="Arial" w:cs="Times New Roman"/>
-          <w:b/>
-          <w:bCs/>
-          <w:kern w:val="0"/>
-          <w:sz w:val="27"/>
-          <w:szCs w:val="27"/>
-          <w:lang w:eastAsia="tr-TR"/>
-          <w14:ligatures w14:val="none"/>
-        </w:rPr>
-      </w:pPr>
-      <w:r>
-        <w:rPr>
-          <w:rFonts w:ascii="Arial" w:eastAsia="Times New Roman" w:hAnsi="Arial" w:cs="Times New Roman"/>
-          <w:b/>
-          <w:bCs/>
-          <w:kern w:val="0"/>
-          <w:sz w:val="27"/>
-          <w:szCs w:val="27"/>
-          <w:lang w:eastAsia="tr-TR"/>
-          <w14:ligatures w14:val="none"/>
-        </w:rPr>
-        <w:t>2. Justification of Features</w:t>
+        <w:pStyle w:val="p1"/>
+        <w:rPr>
+          <w:rFonts w:ascii="Times New Roman" w:hAnsi="Times New Roman"/>
+          <w:sz w:val="24"/>
+          <w:szCs w:val="24"/>
+        </w:rPr>
+      </w:pPr>
+      <w:r>
+        <w:rPr>
+          <w:rFonts w:ascii="Times New Roman" w:hAnsi="Times New Roman"/>
+          <w:sz w:val="24"/>
+          <w:szCs w:val="24"/>
+        </w:rPr>
+        <w:t>Propose an extension of the Bradley-Terry model capable of modeling a ranking of</w:t>
       </w:r>
     </w:p>
     <w:p>
       <w:pPr>
-        <w:numPr>
-          <w:ilvl w:val="0"/>
-          <w:numId w:val="2"/>
-        </w:numPr>
-        <w:spacing w:after="100" w:afterAutospacing="1" w:line="240" w:lineRule="auto"/>
-        <w:rPr>
-          <w:rFonts w:ascii="Arial" w:eastAsia="Times New Roman" w:hAnsi="Arial" w:cs="Times New Roman"/>
-          <w:kern w:val="0"/>
-          <w:lang w:eastAsia="tr-TR"/>
-          <w14:ligatures w14:val="none"/>
-        </w:rPr>
-      </w:pPr>
-      <w:r>
-        <w:rPr>
-          <w:rFonts w:ascii="Arial" w:eastAsia="Times New Roman" w:hAnsi="Arial" w:cs="Times New Roman"/>
-          <w:b/>
-          <w:bCs/>
-          <w:kern w:val="0"/>
-          <w:lang w:eastAsia="tr-TR"/>
-          <w14:ligatures w14:val="none"/>
-        </w:rPr>
-        <w:t>IMDB Score (Numerical Quality Indicator):</w:t>
-      </w:r>
-      <w:r>
-        <w:rPr>
-          <w:rFonts w:ascii="Arial" w:eastAsia="Times New Roman" w:hAnsi="Arial" w:cs="Times New Roman"/>
-          <w:kern w:val="0"/>
-          <w:lang w:eastAsia="tr-TR"/>
-          <w14:ligatures w14:val="none"/>
-        </w:rPr>
-        <w:t xml:space="preserve"> A movie's rating acts as a reliable proxy for overall quality and general appeal. Applying a </w:t>
-      </w:r>
-      <w:r>
-        <w:rPr>
-          <w:rFonts w:ascii="Arial" w:eastAsia="Times New Roman" w:hAnsi="Arial" w:cs="Courier New"/>
-          <w:kern w:val="0"/>
-          <w:sz w:val="20"/>
-          <w:szCs w:val="20"/>
-          <w:lang w:eastAsia="tr-TR"/>
-          <w14:ligatures w14:val="none"/>
-        </w:rPr>
-        <w:t>MinMaxScaler</w:t>
-      </w:r>
-      <w:r>
-        <w:rPr>
-          <w:rFonts w:ascii="Arial" w:eastAsia="Times New Roman" w:hAnsi="Arial" w:cs="Times New Roman"/>
-          <w:kern w:val="0"/>
-          <w:lang w:eastAsia="tr-TR"/>
-          <w14:ligatures w14:val="none"/>
-        </w:rPr>
-        <w:t xml:space="preserve"> bounds this continuous score between </w:t>
-      </w:r>
-      <m:oMath>
-        <m:r>
-          <w:rPr>
-            <w:rFonts w:ascii="Cambria Math" w:eastAsia="Times New Roman" w:hAnsi="Cambria Math" w:cs="Times New Roman"/>
-            <w:kern w:val="0"/>
-            <w:lang w:eastAsia="tr-TR"/>
-            <w14:ligatures w14:val="none"/>
-          </w:rPr>
-          <m:t>0</m:t>
-        </m:r>
-      </m:oMath>
-      <w:r>
-        <w:rPr>
-          <w:rFonts w:ascii="Arial" w:eastAsia="Times New Roman" w:hAnsi="Arial" w:cs="Times New Roman"/>
-          <w:kern w:val="0"/>
-          <w:lang w:eastAsia="tr-TR"/>
-          <w14:ligatures w14:val="none"/>
-        </w:rPr>
-        <w:t xml:space="preserve"> and </w:t>
-      </w:r>
-      <m:oMath>
-        <m:r>
-          <w:rPr>
-            <w:rFonts w:ascii="Cambria Math" w:eastAsia="Times New Roman" w:hAnsi="Cambria Math" w:cs="Times New Roman"/>
-            <w:kern w:val="0"/>
-            <w:lang w:eastAsia="tr-TR"/>
-            <w14:ligatures w14:val="none"/>
-          </w:rPr>
-          <m:t>1</m:t>
-        </m:r>
-      </m:oMath>
-      <w:r>
-        <w:rPr>
-          <w:rFonts w:ascii="Arial" w:eastAsia="Times New Roman" w:hAnsi="Arial" w:cs="Times New Roman"/>
-          <w:kern w:val="0"/>
-          <w:lang w:eastAsia="tr-TR"/>
-          <w14:ligatures w14:val="none"/>
-        </w:rPr>
-        <w:t>. This normalization is crucial because it ensures that the numerical score doesn't overpower or unfairly dominate the binary genre dimensions during linear utility calculations (</w:t>
-      </w:r>
-      <m:oMath>
-        <m:r>
-          <w:rPr>
-            <w:rFonts w:ascii="Cambria Math" w:eastAsia="Times New Roman" w:hAnsi="Cambria Math" w:cs="Times New Roman"/>
-            <w:kern w:val="0"/>
-            <w:lang w:eastAsia="tr-TR"/>
-            <w14:ligatures w14:val="none"/>
-          </w:rPr>
-          <m:t>u=w⋅x</m:t>
-        </m:r>
-      </m:oMath>
-      <w:r>
-        <w:rPr>
-          <w:rFonts w:ascii="Arial" w:eastAsia="Times New Roman" w:hAnsi="Arial" w:cs="Times New Roman"/>
-          <w:kern w:val="0"/>
-          <w:lang w:eastAsia="tr-TR"/>
-          <w14:ligatures w14:val="none"/>
-        </w:rPr>
-        <w:t>).</w:t>
+        <w:pStyle w:val="p1"/>
+        <w:rPr>
+          <w:rFonts w:ascii="Times New Roman" w:hAnsi="Times New Roman"/>
+          <w:sz w:val="24"/>
+          <w:szCs w:val="24"/>
+        </w:rPr>
+      </w:pPr>
+      <w:r>
+        <w:rPr>
+          <w:rFonts w:ascii="Times New Roman" w:hAnsi="Times New Roman"/>
+          <w:sz w:val="24"/>
+          <w:szCs w:val="24"/>
+        </w:rPr>
+        <w:t>i</w:t>
+      </w:r>
+      <w:r>
+        <w:rPr>
+          <w:rStyle w:val="s1"/>
+          <w:rFonts w:ascii="Times New Roman" w:hAnsi="Times New Roman"/>
+          <w:sz w:val="24"/>
+          <w:szCs w:val="24"/>
+        </w:rPr>
+        <w:t xml:space="preserve">1 </w:t>
+      </w:r>
+      <w:r>
+        <w:rPr>
+          <w:rFonts w:ascii="Cambria Math" w:hAnsi="Cambria Math" w:cs="Cambria Math"/>
+          <w:sz w:val="24"/>
+          <w:szCs w:val="24"/>
+        </w:rPr>
+        <w:t>≻</w:t>
+      </w:r>
+      <w:r>
+        <w:rPr>
+          <w:rFonts w:ascii="Times New Roman" w:hAnsi="Times New Roman"/>
+          <w:sz w:val="24"/>
+          <w:szCs w:val="24"/>
+        </w:rPr>
+        <w:t xml:space="preserve"> i</w:t>
+      </w:r>
+      <w:r>
+        <w:rPr>
+          <w:rStyle w:val="s1"/>
+          <w:rFonts w:ascii="Times New Roman" w:hAnsi="Times New Roman"/>
+          <w:sz w:val="24"/>
+          <w:szCs w:val="24"/>
+        </w:rPr>
+        <w:t xml:space="preserve">2 </w:t>
+      </w:r>
+      <w:r>
+        <w:rPr>
+          <w:rFonts w:ascii="Cambria Math" w:hAnsi="Cambria Math" w:cs="Cambria Math"/>
+          <w:sz w:val="24"/>
+          <w:szCs w:val="24"/>
+        </w:rPr>
+        <w:t>≻</w:t>
+      </w:r>
+      <w:r>
+        <w:rPr>
+          <w:rFonts w:ascii="Times New Roman" w:hAnsi="Times New Roman"/>
+          <w:sz w:val="24"/>
+          <w:szCs w:val="24"/>
+        </w:rPr>
+        <w:t xml:space="preserve"> · · · </w:t>
+      </w:r>
+      <w:r>
+        <w:rPr>
+          <w:rFonts w:ascii="Cambria Math" w:hAnsi="Cambria Math" w:cs="Cambria Math"/>
+          <w:sz w:val="24"/>
+          <w:szCs w:val="24"/>
+        </w:rPr>
+        <w:t>≻</w:t>
+      </w:r>
+      <w:r>
+        <w:rPr>
+          <w:rFonts w:ascii="Times New Roman" w:hAnsi="Times New Roman"/>
+          <w:sz w:val="24"/>
+          <w:szCs w:val="24"/>
+        </w:rPr>
+        <w:t xml:space="preserve"> i</w:t>
+      </w:r>
+      <w:r>
+        <w:rPr>
+          <w:rStyle w:val="s1"/>
+          <w:rFonts w:ascii="Times New Roman" w:hAnsi="Times New Roman"/>
+          <w:sz w:val="24"/>
+          <w:szCs w:val="24"/>
+        </w:rPr>
+        <w:t xml:space="preserve">n </w:t>
+      </w:r>
+      <w:r>
+        <w:rPr>
+          <w:rFonts w:ascii="Times New Roman" w:hAnsi="Times New Roman"/>
+          <w:sz w:val="24"/>
+          <w:szCs w:val="24"/>
+        </w:rPr>
+        <w:t>instead of a single pairwise comparison. Explain and justify your</w:t>
       </w:r>
     </w:p>
     <w:p>
       <w:pPr>
-        <w:rPr>
-          <w:lang w:val="tr-TR"/>
-        </w:rPr>
-      </w:pPr>
+        <w:pStyle w:val="p1"/>
+        <w:rPr>
+          <w:rFonts w:ascii="Times New Roman" w:hAnsi="Times New Roman"/>
+          <w:sz w:val="24"/>
+          <w:szCs w:val="24"/>
+        </w:rPr>
+      </w:pPr>
+      <w:r>
+        <w:rPr>
+          <w:rFonts w:ascii="Times New Roman" w:hAnsi="Times New Roman"/>
+          <w:sz w:val="24"/>
+          <w:szCs w:val="24"/>
+        </w:rPr>
+        <w:t>proposed formulation.</w:t>
+      </w:r>
     </w:p>
     <w:p>
       <w:pPr>
-        <w:rPr>
+        <w:pStyle w:val="p1"/>
+        <w:rPr>
+          <w:rFonts w:ascii="Times New Roman" w:hAnsi="Times New Roman"/>
+          <w:sz w:val="24"/>
+          <w:szCs w:val="24"/>
+        </w:rPr>
+      </w:pPr>
+    </w:p>
+    <w:p>
+      <w:pPr>
+        <w:pStyle w:val="p1"/>
+        <w:rPr>
+          <w:rFonts w:ascii="Times New Roman" w:hAnsi="Times New Roman"/>
+          <w:sz w:val="24"/>
+          <w:szCs w:val="24"/>
+        </w:rPr>
+      </w:pPr>
+      <w:r>
+        <w:rPr>
+          <w:rFonts w:ascii="Times New Roman" w:hAnsi="Times New Roman"/>
+          <w:sz w:val="24"/>
+          <w:szCs w:val="24"/>
+        </w:rPr>
+        <w:t xml:space="preserve">The Bradley-Terry model applies </w:t>
+      </w:r>
+      <w:r>
+        <w:rPr>
+          <w:rFonts w:ascii="Times New Roman" w:hAnsi="Times New Roman"/>
+          <w:sz w:val="24"/>
+          <w:szCs w:val="24"/>
+        </w:rPr>
+        <w:t xml:space="preserve">a </w:t>
+      </w:r>
+      <w:r>
+        <w:rPr>
+          <w:rFonts w:ascii="Times New Roman" w:hAnsi="Times New Roman"/>
+          <w:sz w:val="24"/>
+          <w:szCs w:val="24"/>
+        </w:rPr>
+        <w:t>sigmoid (logistic) function to the difference of the utility values</w:t>
+      </w:r>
+      <w:r>
+        <w:rPr>
+          <w:rFonts w:ascii="Times New Roman" w:hAnsi="Times New Roman"/>
+          <w:sz w:val="24"/>
+          <w:szCs w:val="24"/>
+        </w:rPr>
+        <w:t xml:space="preserve"> for the given vectors of movie preference of the user and movie features.</w:t>
+      </w:r>
+      <w:r>
+        <w:rPr>
+          <w:rFonts w:ascii="Times New Roman" w:hAnsi="Times New Roman"/>
+          <w:sz w:val="24"/>
+          <w:szCs w:val="24"/>
+        </w:rPr>
+        <w:t xml:space="preserve"> I have used the gradient descent algorithm while updating the user’s movie preference vector. </w:t>
+      </w:r>
+    </w:p>
+    <w:p>
+      <w:pPr>
+        <w:pStyle w:val="p1"/>
+        <w:rPr>
+          <w:rFonts w:ascii="Times New Roman" w:hAnsi="Times New Roman"/>
+          <w:sz w:val="24"/>
+          <w:szCs w:val="24"/>
+        </w:rPr>
+      </w:pPr>
+    </w:p>
+    <w:p>
+      <w:pPr>
+        <w:pStyle w:val="p1"/>
+        <w:jc w:val="both"/>
+        <w:rPr>
+          <w:rFonts w:ascii="Times New Roman" w:hAnsi="Times New Roman"/>
+          <w:sz w:val="24"/>
+          <w:szCs w:val="24"/>
+        </w:rPr>
+      </w:pPr>
+      <w:r>
+        <w:rPr>
+          <w:rFonts w:ascii="Times New Roman" w:hAnsi="Times New Roman"/>
+          <w:sz w:val="24"/>
+          <w:szCs w:val="24"/>
+        </w:rPr>
+        <w:t xml:space="preserve">I have used the plackett_luce_probability() function </w:t>
+      </w:r>
+      <w:r>
+        <w:rPr>
+          <w:rFonts w:ascii="Times New Roman" w:hAnsi="Times New Roman"/>
+          <w:sz w:val="24"/>
+          <w:szCs w:val="24"/>
+        </w:rPr>
+        <w:t xml:space="preserve">for the extension to the ranking of a list of movies, with multiple (more than 2) movies involved rather than comparing just two movies. So, instead of the sigmoid function, I have applied the softmax function to each of the movies in the list and the remaining ones. </w:t>
+      </w:r>
+      <w:r>
+        <w:rPr>
+          <w:rFonts w:ascii="Times New Roman" w:hAnsi="Times New Roman"/>
+          <w:sz w:val="24"/>
+          <w:szCs w:val="24"/>
+        </w:rPr>
+        <w:t xml:space="preserve">The Plackett-Luce Probability Model is </w:t>
+      </w:r>
+      <w:r>
+        <w:rPr>
+          <w:rFonts w:ascii="Times New Roman" w:hAnsi="Times New Roman"/>
+          <w:sz w:val="24"/>
+          <w:szCs w:val="24"/>
+        </w:rPr>
+        <w:t>an</w:t>
+      </w:r>
+      <w:r>
+        <w:rPr>
+          <w:rFonts w:ascii="Times New Roman" w:hAnsi="Times New Roman"/>
+          <w:sz w:val="24"/>
+          <w:szCs w:val="24"/>
+        </w:rPr>
+        <w:t xml:space="preserve"> extension of the Bradley-Terry Probability Model, and it is able to handle full ranking of the items in the list with size </w:t>
+      </w:r>
+      <w:r>
+        <w:rPr>
+          <w:rFonts w:ascii="Times New Roman" w:hAnsi="Times New Roman"/>
+          <w:sz w:val="24"/>
+          <w:szCs w:val="24"/>
+        </w:rPr>
+        <w:t>greater</w:t>
+      </w:r>
+      <w:r>
+        <w:rPr>
+          <w:rFonts w:ascii="Times New Roman" w:hAnsi="Times New Roman"/>
+          <w:sz w:val="24"/>
+          <w:szCs w:val="24"/>
+        </w:rPr>
+        <w:t xml:space="preserve"> than 2. </w:t>
+      </w:r>
+      <w:r>
+        <w:rPr>
+          <w:rFonts w:ascii="Times New Roman" w:hAnsi="Times New Roman"/>
+          <w:sz w:val="24"/>
+          <w:szCs w:val="24"/>
+        </w:rPr>
+        <w:t>The Plackett-Luce model calculates the probability of a</w:t>
+      </w:r>
+      <w:r>
+        <w:rPr>
+          <w:rFonts w:ascii="Times New Roman" w:hAnsi="Times New Roman"/>
+          <w:sz w:val="24"/>
+          <w:szCs w:val="24"/>
+        </w:rPr>
+        <w:t xml:space="preserve">n ordered list </w:t>
+      </w:r>
+      <w:r>
+        <w:rPr>
+          <w:rFonts w:ascii="Times New Roman" w:hAnsi="Times New Roman"/>
+          <w:sz w:val="24"/>
+          <w:szCs w:val="24"/>
+        </w:rPr>
+        <w:lastRenderedPageBreak/>
+        <w:t>of choices by decomposing it into the product of sequential multinomial logistic regression (Softmax) function outputs</w:t>
+      </w:r>
+      <w:r>
+        <w:rPr>
+          <w:rFonts w:ascii="Times New Roman" w:hAnsi="Times New Roman"/>
+          <w:sz w:val="24"/>
+          <w:szCs w:val="24"/>
+        </w:rPr>
+        <w:t>;</w:t>
+      </w:r>
+      <w:r>
+        <w:rPr>
+          <w:rFonts w:ascii="Times New Roman" w:hAnsi="Times New Roman"/>
+          <w:sz w:val="24"/>
+          <w:szCs w:val="24"/>
+        </w:rPr>
+        <w:t xml:space="preserve"> in other words</w:t>
+      </w:r>
+      <w:r>
+        <w:rPr>
+          <w:rFonts w:ascii="Times New Roman" w:hAnsi="Times New Roman"/>
+          <w:sz w:val="24"/>
+          <w:szCs w:val="24"/>
+        </w:rPr>
+        <w:t>,</w:t>
+      </w:r>
+      <w:r>
+        <w:rPr>
+          <w:rFonts w:ascii="Times New Roman" w:hAnsi="Times New Roman"/>
+          <w:sz w:val="24"/>
+          <w:szCs w:val="24"/>
+        </w:rPr>
+        <w:t xml:space="preserve"> Softmax probabilities. </w:t>
+      </w:r>
+    </w:p>
+    <w:p>
+      <w:pPr>
+        <w:pStyle w:val="p1"/>
+        <w:jc w:val="both"/>
+        <w:rPr>
+          <w:rFonts w:ascii="Times New Roman" w:hAnsi="Times New Roman"/>
+          <w:sz w:val="24"/>
+          <w:szCs w:val="24"/>
+        </w:rPr>
+      </w:pPr>
+    </w:p>
+    <w:p>
+      <w:pPr>
+        <w:pStyle w:val="p1"/>
+        <w:jc w:val="both"/>
+        <w:rPr>
+          <w:rFonts w:ascii="Times New Roman" w:hAnsi="Times New Roman"/>
+          <w:sz w:val="24"/>
+          <w:szCs w:val="24"/>
+        </w:rPr>
+      </w:pPr>
+    </w:p>
+    <w:p>
+      <w:pPr>
+        <w:pStyle w:val="p1"/>
+        <w:jc w:val="both"/>
+        <w:rPr>
+          <w:rFonts w:ascii="Times New Roman" w:hAnsi="Times New Roman"/>
+          <w:sz w:val="24"/>
+          <w:szCs w:val="24"/>
+        </w:rPr>
+      </w:pPr>
+      <w:r>
+        <w:rPr>
+          <w:rFonts w:ascii="Times New Roman" w:hAnsi="Times New Roman"/>
+          <w:sz w:val="24"/>
+          <w:szCs w:val="24"/>
+        </w:rPr>
+        <w:t xml:space="preserve">In the extension, the gradient accumulates over the list elements and is calculated using the log-likelihood of the softmax function. </w:t>
+      </w:r>
+    </w:p>
+    <w:p>
+      <w:pPr>
+        <w:pStyle w:val="p1"/>
+        <w:jc w:val="both"/>
+        <w:rPr>
+          <w:rFonts w:ascii="Times New Roman" w:hAnsi="Times New Roman"/>
+          <w:sz w:val="24"/>
+          <w:szCs w:val="24"/>
+        </w:rPr>
+      </w:pPr>
+    </w:p>
+    <w:p>
+      <w:pPr>
+        <w:pStyle w:val="p1"/>
+        <w:jc w:val="both"/>
+        <w:rPr>
+          <w:rFonts w:ascii="Times New Roman" w:hAnsi="Times New Roman"/>
+          <w:sz w:val="24"/>
+          <w:szCs w:val="24"/>
+        </w:rPr>
+      </w:pPr>
+    </w:p>
+    <w:p>
+      <w:pPr>
+        <w:rPr>
+          <w:lang w:val="tr-TR"/>
+        </w:rPr>
+      </w:pPr>
+    </w:p>
+    <w:p>
+      <w:pPr>
+        <w:rPr>
+          <w:b/>
+          <w:bCs/>
+          <w:u w:val="single"/>
+          <w:lang w:val="tr-TR"/>
+        </w:rPr>
+      </w:pPr>
+      <w:proofErr w:type="spellStart"/>
+      <w:r>
+        <w:rPr>
+          <w:b/>
+          <w:bCs/>
+          <w:u w:val="single"/>
+          <w:lang w:val="tr-TR"/>
+        </w:rPr>
+        <w:t>Task</w:t>
+      </w:r>
+      <w:proofErr w:type="spellEnd"/>
+      <w:r>
+        <w:rPr>
+          <w:b/>
+          <w:bCs/>
+          <w:u w:val="single"/>
+          <w:lang w:val="tr-TR"/>
+        </w:rPr>
+        <w:t xml:space="preserve"> 3: </w:t>
+      </w:r>
+    </w:p>
+    <w:p>
+      <w:pPr>
+        <w:pStyle w:val="p1"/>
+        <w:rPr>
+          <w:rFonts w:ascii="Times New Roman" w:hAnsi="Times New Roman"/>
+          <w:sz w:val="24"/>
+          <w:szCs w:val="24"/>
+        </w:rPr>
+      </w:pPr>
+      <w:r>
+        <w:rPr>
+          <w:rFonts w:ascii="Times New Roman" w:hAnsi="Times New Roman"/>
+          <w:sz w:val="24"/>
+          <w:szCs w:val="24"/>
+        </w:rPr>
+        <w:t>Design a complete user study comparing the two elicitation methods. You have to</w:t>
+      </w:r>
+    </w:p>
+    <w:p>
+      <w:pPr>
+        <w:pStyle w:val="p1"/>
+        <w:rPr>
+          <w:rFonts w:ascii="Times New Roman" w:hAnsi="Times New Roman"/>
+          <w:sz w:val="24"/>
+          <w:szCs w:val="24"/>
+        </w:rPr>
+      </w:pPr>
+      <w:r>
+        <w:rPr>
+          <w:rFonts w:ascii="Times New Roman" w:hAnsi="Times New Roman"/>
+          <w:sz w:val="24"/>
+          <w:szCs w:val="24"/>
+        </w:rPr>
+        <w:t>choose the hypothesis you are testing, the design of the user study, the recruitment</w:t>
+      </w:r>
+    </w:p>
+    <w:p>
+      <w:pPr>
+        <w:pStyle w:val="p1"/>
+        <w:rPr>
+          <w:rFonts w:ascii="Times New Roman" w:hAnsi="Times New Roman"/>
+          <w:sz w:val="24"/>
+          <w:szCs w:val="24"/>
+        </w:rPr>
+      </w:pPr>
+      <w:r>
+        <w:rPr>
+          <w:rFonts w:ascii="Times New Roman" w:hAnsi="Times New Roman"/>
+          <w:sz w:val="24"/>
+          <w:szCs w:val="24"/>
+        </w:rPr>
+        <w:t>process</w:t>
+      </w:r>
+      <w:r>
+        <w:rPr>
+          <w:rFonts w:ascii="Times New Roman" w:hAnsi="Times New Roman"/>
+          <w:sz w:val="24"/>
+          <w:szCs w:val="24"/>
+        </w:rPr>
+        <w:t>,</w:t>
+      </w:r>
+      <w:r>
+        <w:rPr>
+          <w:rFonts w:ascii="Times New Roman" w:hAnsi="Times New Roman"/>
+          <w:sz w:val="24"/>
+          <w:szCs w:val="24"/>
+        </w:rPr>
+        <w:t xml:space="preserve"> etc. Explain the steps that you would follow in practice if you would have to</w:t>
+      </w:r>
+    </w:p>
+    <w:p>
+      <w:pPr>
+        <w:pStyle w:val="p1"/>
+        <w:rPr>
+          <w:rFonts w:ascii="Times New Roman" w:hAnsi="Times New Roman"/>
+          <w:sz w:val="24"/>
+          <w:szCs w:val="24"/>
+        </w:rPr>
+      </w:pPr>
+      <w:r>
+        <w:rPr>
+          <w:rFonts w:ascii="Times New Roman" w:hAnsi="Times New Roman"/>
+          <w:sz w:val="24"/>
+          <w:szCs w:val="24"/>
+        </w:rPr>
+        <w:t>really run the user study. (I remind you that you don’t have to run the user</w:t>
+      </w:r>
+    </w:p>
+    <w:p>
+      <w:pPr>
+        <w:pStyle w:val="p1"/>
+        <w:rPr>
+          <w:rFonts w:ascii="Times New Roman" w:hAnsi="Times New Roman"/>
+          <w:sz w:val="24"/>
+          <w:szCs w:val="24"/>
+        </w:rPr>
+      </w:pPr>
+      <w:r>
+        <w:rPr>
+          <w:rFonts w:ascii="Times New Roman" w:hAnsi="Times New Roman"/>
+          <w:sz w:val="24"/>
+          <w:szCs w:val="24"/>
+        </w:rPr>
+        <w:t>study!)</w:t>
+      </w:r>
+    </w:p>
+    <w:p>
+      <w:pPr>
+        <w:rPr>
+          <w:b/>
+          <w:bCs/>
+          <w:u w:val="single"/>
           <w:lang w:val="tr-TR"/>
         </w:rPr>
       </w:pPr>

</xml_diff>

<commit_message>
change some namings of the variables in project 4
</commit_message>
<xml_diff>
--- a/static/Project_4_Report.docx
+++ b/static/Project_4_Report.docx
@@ -7354,355 +7354,180 @@
     </w:p>
     <w:p>
       <w:pPr>
-        <w:pStyle w:val="p1"/>
-        <w:jc w:val="both"/>
-        <w:rPr>
-          <w:rFonts w:ascii="Times New Roman" w:hAnsi="Times New Roman"/>
-          <w:sz w:val="24"/>
-          <w:szCs w:val="24"/>
-        </w:rPr>
-      </w:pPr>
-      <w:r>
-        <w:rPr>
-          <w:rFonts w:ascii="Times New Roman" w:hAnsi="Times New Roman"/>
-          <w:sz w:val="24"/>
-          <w:szCs w:val="24"/>
-        </w:rPr>
-        <w:t>Design a complete user study comparing the two elicitation methods. You have to</w:t>
-      </w:r>
-    </w:p>
-    <w:p>
-      <w:pPr>
-        <w:pStyle w:val="p1"/>
-        <w:jc w:val="both"/>
-        <w:rPr>
-          <w:rFonts w:ascii="Times New Roman" w:hAnsi="Times New Roman"/>
-          <w:sz w:val="24"/>
-          <w:szCs w:val="24"/>
-        </w:rPr>
-      </w:pPr>
-      <w:r>
-        <w:rPr>
-          <w:rFonts w:ascii="Times New Roman" w:hAnsi="Times New Roman"/>
-          <w:sz w:val="24"/>
-          <w:szCs w:val="24"/>
-        </w:rPr>
-        <w:t>choose the hypothesis you are testing, the design of the user study, the recruitment</w:t>
-      </w:r>
-    </w:p>
-    <w:p>
-      <w:pPr>
-        <w:pStyle w:val="p1"/>
-        <w:jc w:val="both"/>
-        <w:rPr>
-          <w:rFonts w:ascii="Times New Roman" w:hAnsi="Times New Roman"/>
-          <w:sz w:val="24"/>
-          <w:szCs w:val="24"/>
-        </w:rPr>
-      </w:pPr>
-      <w:r>
-        <w:rPr>
-          <w:rFonts w:ascii="Times New Roman" w:hAnsi="Times New Roman"/>
-          <w:sz w:val="24"/>
-          <w:szCs w:val="24"/>
-        </w:rPr>
-        <w:t>process</w:t>
-      </w:r>
-      <w:r>
-        <w:rPr>
-          <w:rFonts w:ascii="Times New Roman" w:hAnsi="Times New Roman"/>
-          <w:sz w:val="24"/>
-          <w:szCs w:val="24"/>
-        </w:rPr>
-        <w:t>,</w:t>
-      </w:r>
-      <w:r>
-        <w:rPr>
-          <w:rFonts w:ascii="Times New Roman" w:hAnsi="Times New Roman"/>
-          <w:sz w:val="24"/>
-          <w:szCs w:val="24"/>
-        </w:rPr>
-        <w:t xml:space="preserve"> etc. Explain the steps that you would follow in practice if you would have to</w:t>
-      </w:r>
-    </w:p>
-    <w:p>
-      <w:pPr>
-        <w:pStyle w:val="p1"/>
-        <w:jc w:val="both"/>
-        <w:rPr>
-          <w:rFonts w:ascii="Times New Roman" w:hAnsi="Times New Roman"/>
-          <w:sz w:val="24"/>
-          <w:szCs w:val="24"/>
-        </w:rPr>
-      </w:pPr>
-      <w:r>
-        <w:rPr>
-          <w:rFonts w:ascii="Times New Roman" w:hAnsi="Times New Roman"/>
-          <w:sz w:val="24"/>
-          <w:szCs w:val="24"/>
-        </w:rPr>
-        <w:t>really run the user study. (I remind you that you don’t have to run the user</w:t>
-      </w:r>
-    </w:p>
-    <w:p>
-      <w:pPr>
-        <w:pStyle w:val="p1"/>
-        <w:jc w:val="both"/>
-        <w:rPr>
-          <w:rFonts w:ascii="Times New Roman" w:hAnsi="Times New Roman"/>
-          <w:sz w:val="24"/>
-          <w:szCs w:val="24"/>
-        </w:rPr>
-      </w:pPr>
-      <w:r>
-        <w:rPr>
-          <w:rFonts w:ascii="Times New Roman" w:hAnsi="Times New Roman"/>
-          <w:sz w:val="24"/>
-          <w:szCs w:val="24"/>
-        </w:rPr>
-        <w:t>study!)</w:t>
-      </w:r>
-    </w:p>
-    <w:p>
-      <w:pPr>
-        <w:pStyle w:val="p1"/>
-        <w:rPr>
-          <w:rFonts w:ascii="Times New Roman" w:hAnsi="Times New Roman"/>
-          <w:sz w:val="24"/>
-          <w:szCs w:val="24"/>
-        </w:rPr>
-      </w:pPr>
-    </w:p>
-    <w:p>
-      <w:pPr>
-        <w:pStyle w:val="p1"/>
-        <w:rPr>
-          <w:rFonts w:ascii="Times New Roman" w:hAnsi="Times New Roman"/>
-          <w:sz w:val="24"/>
-          <w:szCs w:val="24"/>
-        </w:rPr>
-      </w:pPr>
-    </w:p>
-    <w:p>
-      <w:pPr>
         <w:pStyle w:val="NormalWeb"/>
         <w:spacing w:line="360" w:lineRule="auto"/>
         <w:jc w:val="both"/>
-      </w:pPr>
-      <w:r>
-        <w:rPr>
-          <w:b/>
-          <w:bCs/>
-        </w:rPr>
-        <w:t>Research Hypotheses</w:t>
+        <w:rPr>
+          <w:b/>
+          <w:bCs/>
+        </w:rPr>
+      </w:pPr>
+      <w:r>
+        <w:rPr>
+          <w:b/>
+          <w:bCs/>
+        </w:rPr>
+        <w:t>The Research Hypothesis</w:t>
+      </w:r>
+      <w:r>
+        <w:rPr>
+          <w:b/>
+          <w:bCs/>
+        </w:rPr>
+        <w:t xml:space="preserve"> (</w:t>
+      </w:r>
+      <w:r>
+        <w:rPr>
+          <w:b/>
+          <w:bCs/>
+        </w:rPr>
+        <w:t xml:space="preserve">The Quality of </w:t>
+      </w:r>
+      <w:r>
+        <w:rPr>
+          <w:b/>
+          <w:bCs/>
+        </w:rPr>
+        <w:t xml:space="preserve">Movie </w:t>
+      </w:r>
+      <w:r>
+        <w:rPr>
+          <w:b/>
+          <w:bCs/>
+        </w:rPr>
+        <w:t>Recommendation):</w:t>
+      </w:r>
+      <w:r>
+        <w:t xml:space="preserve"> </w:t>
+      </w:r>
+      <w:r>
+        <w:t xml:space="preserve">The method used in </w:t>
+      </w:r>
+      <w:r>
+        <w:t xml:space="preserve">Design 2 (Plackett-Luce </w:t>
+      </w:r>
+      <w:r>
+        <w:t xml:space="preserve">model’s </w:t>
+      </w:r>
+      <w:r>
+        <w:t xml:space="preserve">ranking of </w:t>
+      </w:r>
+      <w:r>
+        <w:t xml:space="preserve">a set of </w:t>
+      </w:r>
+      <w:r>
+        <w:t xml:space="preserve">10 </w:t>
+      </w:r>
+      <w:r>
+        <w:t xml:space="preserve">movie </w:t>
+      </w:r>
+      <w:r>
+        <w:t xml:space="preserve">items) </w:t>
+      </w:r>
+      <w:r>
+        <w:t>results in</w:t>
+      </w:r>
+      <w:r>
+        <w:t xml:space="preserve"> </w:t>
+      </w:r>
+      <w:r>
+        <w:t xml:space="preserve">faster convergence of the user preference vector </w:t>
+      </w:r>
+      <w:r>
+        <w:rPr>
+          <w:b/>
+          <w:bCs/>
+          <w:i/>
+          <w:iCs/>
+        </w:rPr>
+        <w:t>w</w:t>
+      </w:r>
+      <w:r>
+        <w:t xml:space="preserve"> and </w:t>
+      </w:r>
+      <w:r>
+        <w:t xml:space="preserve">higher-quality recommendations than </w:t>
+      </w:r>
+      <w:r>
+        <w:t xml:space="preserve">the method used in </w:t>
+      </w:r>
+      <w:r>
+        <w:t xml:space="preserve">Design 1 (Bradley-Terry </w:t>
+      </w:r>
+      <w:r>
+        <w:t xml:space="preserve">model’s </w:t>
+      </w:r>
+      <w:r>
+        <w:t xml:space="preserve">pairwise </w:t>
+      </w:r>
+      <w:r>
+        <w:t>selection</w:t>
+      </w:r>
+      <w:r>
+        <w:t>)</w:t>
+      </w:r>
+      <w:r>
+        <w:t xml:space="preserve">. Because Design 2’s method extracts more informational gain per user interaction. </w:t>
+      </w:r>
+      <w:r>
+        <w:t xml:space="preserve"> </w:t>
       </w:r>
     </w:p>
     <w:p>
       <w:pPr>
         <w:pStyle w:val="NormalWeb"/>
-        <w:numPr>
-          <w:ilvl w:val="0"/>
-          <w:numId w:val="3"/>
-        </w:numPr>
         <w:spacing w:line="360" w:lineRule="auto"/>
         <w:jc w:val="both"/>
-      </w:pPr>
-      <w:r>
-        <w:rPr>
-          <w:b/>
-          <w:bCs/>
-        </w:rPr>
-        <w:t>The First Research Hypothesis</w:t>
-      </w:r>
-      <w:r>
-        <w:rPr>
-          <w:b/>
-          <w:bCs/>
-        </w:rPr>
-        <w:t xml:space="preserve"> (</w:t>
-      </w:r>
-      <w:r>
-        <w:rPr>
-          <w:b/>
-          <w:bCs/>
-        </w:rPr>
-        <w:t xml:space="preserve">Movie </w:t>
-      </w:r>
-      <w:r>
-        <w:rPr>
-          <w:b/>
-          <w:bCs/>
-        </w:rPr>
-        <w:t>Recommendation Quality):</w:t>
-      </w:r>
-      <w:r>
-        <w:t xml:space="preserve"> Design 2 (Plackett-Luce </w:t>
-      </w:r>
-      <w:r>
-        <w:t xml:space="preserve">model’s </w:t>
-      </w:r>
-      <w:r>
-        <w:t xml:space="preserve">ranking of </w:t>
-      </w:r>
-      <w:r>
-        <w:t xml:space="preserve">a set of </w:t>
-      </w:r>
-      <w:r>
-        <w:t xml:space="preserve">10 </w:t>
-      </w:r>
-      <w:r>
-        <w:t xml:space="preserve">movie </w:t>
-      </w:r>
-      <w:r>
-        <w:t xml:space="preserve">items) </w:t>
-      </w:r>
-      <w:r>
-        <w:t>results in</w:t>
-      </w:r>
-      <w:r>
+        <w:rPr>
+          <w:b/>
+          <w:bCs/>
+        </w:rPr>
+      </w:pPr>
+      <w:r>
+        <w:rPr>
+          <w:b/>
+          <w:bCs/>
+        </w:rPr>
+        <w:t xml:space="preserve">The </w:t>
+      </w:r>
+      <w:r>
+        <w:rPr>
+          <w:b/>
+          <w:bCs/>
+        </w:rPr>
+        <w:t>within-subjects</w:t>
+      </w:r>
+      <w:r>
+        <w:rPr>
+          <w:b/>
+          <w:bCs/>
+        </w:rPr>
         <w:t xml:space="preserve"> </w:t>
       </w:r>
       <w:r>
-        <w:t xml:space="preserve">faster convergence of the user preference vector </w:t>
-      </w:r>
-      <w:r>
-        <w:rPr>
-          <w:b/>
-          <w:bCs/>
-          <w:i/>
-          <w:iCs/>
-        </w:rPr>
-        <w:t>w</w:t>
-      </w:r>
-      <w:r>
-        <w:t xml:space="preserve"> and </w:t>
-      </w:r>
-      <w:r>
-        <w:t xml:space="preserve">higher-quality recommendations than Design 1 (Bradley-Terry </w:t>
-      </w:r>
-      <w:r>
-        <w:t xml:space="preserve">model’s </w:t>
-      </w:r>
-      <w:r>
-        <w:t xml:space="preserve">pairwise </w:t>
-      </w:r>
-      <w:r>
-        <w:t>selection</w:t>
-      </w:r>
-      <w:r>
-        <w:t xml:space="preserve">) because it extracts more informational gain per </w:t>
-      </w:r>
-      <w:r>
-        <w:t xml:space="preserve">user </w:t>
-      </w:r>
-      <w:r>
-        <w:t>interaction.</w:t>
-      </w:r>
-    </w:p>
-    <w:p>
-      <w:pPr>
-        <w:pStyle w:val="NormalWeb"/>
-        <w:numPr>
-          <w:ilvl w:val="0"/>
-          <w:numId w:val="3"/>
-        </w:numPr>
-        <w:spacing w:line="360" w:lineRule="auto"/>
-        <w:jc w:val="both"/>
-      </w:pPr>
-      <w:r>
-        <w:rPr>
-          <w:b/>
-          <w:bCs/>
-        </w:rPr>
-        <w:lastRenderedPageBreak/>
-        <w:t>The Second Research Hypothesis</w:t>
-      </w:r>
-      <w:r>
-        <w:rPr>
-          <w:b/>
-          <w:bCs/>
-        </w:rPr>
+        <w:rPr>
+          <w:b/>
+          <w:bCs/>
+        </w:rPr>
+        <w:t>design</w:t>
+      </w:r>
+      <w:r>
+        <w:t xml:space="preserve"> is </w:t>
+      </w:r>
+      <w:r>
+        <w:t>used instead of the between-subjects experimental design.</w:t>
+      </w:r>
+      <w:r>
         <w:t xml:space="preserve"> </w:t>
       </w:r>
       <w:r>
-        <w:rPr>
-          <w:b/>
-          <w:bCs/>
-        </w:rPr>
-        <w:t xml:space="preserve">(User’s </w:t>
-      </w:r>
-      <w:r>
-        <w:rPr>
-          <w:b/>
-          <w:bCs/>
-        </w:rPr>
-        <w:t>Cognitive Load):</w:t>
-      </w:r>
-      <w:r>
-        <w:t xml:space="preserve"> </w:t>
-      </w:r>
-      <w:r>
-        <w:t xml:space="preserve">Even though Design 1 requires more rounds to grasp subtle movie preferences, </w:t>
-      </w:r>
-      <w:r>
-        <w:t>it results in</w:t>
-      </w:r>
-      <w:r>
-        <w:t xml:space="preserve"> </w:t>
-      </w:r>
-      <w:r>
-        <w:t xml:space="preserve">shorter per-task completion time and </w:t>
-      </w:r>
-      <w:r>
-        <w:t xml:space="preserve">therefore </w:t>
-      </w:r>
-      <w:r>
-        <w:t>lower cognitive load</w:t>
-      </w:r>
-      <w:r>
-        <w:t xml:space="preserve"> per person.</w:t>
-      </w:r>
-      <w:r>
-        <w:t xml:space="preserve"> </w:t>
-      </w:r>
-    </w:p>
-    <w:p>
-      <w:pPr>
-        <w:pStyle w:val="NormalWeb"/>
-        <w:spacing w:line="360" w:lineRule="auto"/>
-        <w:ind w:left="720"/>
-        <w:jc w:val="both"/>
-      </w:pPr>
-    </w:p>
-    <w:p>
-      <w:pPr>
-        <w:pStyle w:val="NormalWeb"/>
-        <w:numPr>
-          <w:ilvl w:val="0"/>
-          <w:numId w:val="3"/>
-        </w:numPr>
-        <w:spacing w:line="360" w:lineRule="auto"/>
-        <w:jc w:val="both"/>
-      </w:pPr>
-      <w:r>
-        <w:rPr>
-          <w:b/>
-          <w:bCs/>
-        </w:rPr>
-        <w:t>Study Design</w:t>
-      </w:r>
-      <w:r>
-        <w:t xml:space="preserve"> A </w:t>
-      </w:r>
-      <w:r>
-        <w:rPr>
-          <w:b/>
-          <w:bCs/>
-        </w:rPr>
-        <w:t>within-subjects (repeated measures) design</w:t>
-      </w:r>
-      <w:r>
-        <w:t xml:space="preserve"> is employed where every participant evaluates both elicitation interfaces. To mitigate learning and order effects, participants are randomly divided into two counterbalanced groups:</w:t>
+        <w:t xml:space="preserve">In this design methodology, every participant in the user study is exposed to both movie elicitation </w:t>
+      </w:r>
+      <w:r>
+        <w:t xml:space="preserve">methods and </w:t>
+      </w:r>
+      <w:r>
+        <w:t xml:space="preserve">user interfaces. User study participants are randomly divided into two different counterbalanced groups to avoid order and learning implications: </w:t>
       </w:r>
     </w:p>
     <w:p>
@@ -7720,43 +7545,86 @@
           <w:b/>
           <w:bCs/>
         </w:rPr>
-        <w:t>Group A:</w:t>
-      </w:r>
-      <w:r>
-        <w:t xml:space="preserve"> Completes Design 1 (5 rounds of pairwise choices) </w:t>
-      </w:r>
-      <m:oMath>
-        <m:r>
-          <w:rPr>
-            <w:rFonts w:ascii="Cambria Math" w:hAnsi="Cambria Math"/>
-          </w:rPr>
-          <m:t>→</m:t>
-        </m:r>
-      </m:oMath>
-      <w:r>
-        <w:t xml:space="preserve">views recommendations </w:t>
-      </w:r>
-      <m:oMath>
-        <m:r>
-          <w:rPr>
-            <w:rFonts w:ascii="Cambria Math" w:hAnsi="Cambria Math"/>
-          </w:rPr>
-          <m:t>→</m:t>
-        </m:r>
-      </m:oMath>
-      <w:r>
-        <w:t xml:space="preserve">completes Design 2 (ranking 10 movies) </w:t>
-      </w:r>
-      <m:oMath>
-        <m:r>
-          <w:rPr>
-            <w:rFonts w:ascii="Cambria Math" w:hAnsi="Cambria Math"/>
-          </w:rPr>
-          <m:t>→</m:t>
-        </m:r>
-      </m:oMath>
-      <w:r>
-        <w:t>views recommendations.</w:t>
+        <w:t>Group 1</w:t>
+      </w:r>
+      <w:r>
+        <w:rPr>
+          <w:b/>
+          <w:bCs/>
+        </w:rPr>
+        <w:t>:</w:t>
+      </w:r>
+      <w:r>
+        <w:t xml:space="preserve"> </w:t>
+      </w:r>
+    </w:p>
+    <w:p>
+      <w:pPr>
+        <w:pStyle w:val="NormalWeb"/>
+        <w:numPr>
+          <w:ilvl w:val="1"/>
+          <w:numId w:val="4"/>
+        </w:numPr>
+        <w:spacing w:line="360" w:lineRule="auto"/>
+        <w:jc w:val="both"/>
+      </w:pPr>
+      <w:r>
+        <w:t>The user c</w:t>
+      </w:r>
+      <w:r>
+        <w:t>ompletes Design 1</w:t>
+      </w:r>
+      <w:r>
+        <w:t xml:space="preserve">, which involves 5 rounds of pairwise movie choices. </w:t>
+      </w:r>
+    </w:p>
+    <w:p>
+      <w:pPr>
+        <w:pStyle w:val="NormalWeb"/>
+        <w:numPr>
+          <w:ilvl w:val="1"/>
+          <w:numId w:val="4"/>
+        </w:numPr>
+        <w:spacing w:line="360" w:lineRule="auto"/>
+        <w:jc w:val="both"/>
+      </w:pPr>
+      <w:r>
+        <w:lastRenderedPageBreak/>
+        <w:t>He/she views movie recommendations after completing the rounds of Design 1.</w:t>
+      </w:r>
+    </w:p>
+    <w:p>
+      <w:pPr>
+        <w:pStyle w:val="NormalWeb"/>
+        <w:numPr>
+          <w:ilvl w:val="1"/>
+          <w:numId w:val="4"/>
+        </w:numPr>
+        <w:spacing w:line="360" w:lineRule="auto"/>
+        <w:jc w:val="both"/>
+      </w:pPr>
+      <w:r>
+        <w:t xml:space="preserve">Then, the user completes Design 2, which involves ranking ten movies from the most preferred movie to the least preferred one. </w:t>
+      </w:r>
+    </w:p>
+    <w:p>
+      <w:pPr>
+        <w:pStyle w:val="NormalWeb"/>
+        <w:numPr>
+          <w:ilvl w:val="1"/>
+          <w:numId w:val="4"/>
+        </w:numPr>
+        <w:spacing w:line="360" w:lineRule="auto"/>
+        <w:jc w:val="both"/>
+      </w:pPr>
+      <w:r>
+        <w:t>After that,</w:t>
+      </w:r>
+      <w:r>
+        <w:t xml:space="preserve"> he/she views movie recommendations after completing the </w:t>
+      </w:r>
+      <w:r>
+        <w:t>ranking of 10 movies in Design 2.</w:t>
       </w:r>
     </w:p>
     <w:p>
@@ -7774,43 +7642,103 @@
           <w:b/>
           <w:bCs/>
         </w:rPr>
-        <w:t>Group B:</w:t>
-      </w:r>
-      <w:r>
-        <w:t xml:space="preserve"> Completes Design 2 </w:t>
-      </w:r>
-      <m:oMath>
-        <m:r>
-          <w:rPr>
-            <w:rFonts w:ascii="Cambria Math" w:hAnsi="Cambria Math"/>
-          </w:rPr>
-          <m:t>→</m:t>
-        </m:r>
-      </m:oMath>
-      <w:r>
-        <w:t xml:space="preserve">views recommendations </w:t>
-      </w:r>
-      <m:oMath>
-        <m:r>
-          <w:rPr>
-            <w:rFonts w:ascii="Cambria Math" w:hAnsi="Cambria Math"/>
-          </w:rPr>
-          <m:t>→</m:t>
-        </m:r>
-      </m:oMath>
-      <w:r>
-        <w:t xml:space="preserve">completes Design 1 </w:t>
-      </w:r>
-      <m:oMath>
-        <m:r>
-          <w:rPr>
-            <w:rFonts w:ascii="Cambria Math" w:hAnsi="Cambria Math"/>
-          </w:rPr>
-          <m:t>→</m:t>
-        </m:r>
-      </m:oMath>
-      <w:r>
-        <w:t>views recommendations.</w:t>
+        <w:t>Group 2</w:t>
+      </w:r>
+      <w:r>
+        <w:rPr>
+          <w:b/>
+          <w:bCs/>
+        </w:rPr>
+        <w:t>:</w:t>
+      </w:r>
+      <w:r>
+        <w:t xml:space="preserve"> </w:t>
+      </w:r>
+    </w:p>
+    <w:p>
+      <w:pPr>
+        <w:pStyle w:val="NormalWeb"/>
+        <w:numPr>
+          <w:ilvl w:val="1"/>
+          <w:numId w:val="4"/>
+        </w:numPr>
+        <w:spacing w:line="360" w:lineRule="auto"/>
+        <w:jc w:val="both"/>
+      </w:pPr>
+      <w:r>
+        <w:t xml:space="preserve">The user completes Design </w:t>
+      </w:r>
+      <w:r>
+        <w:t>2</w:t>
+      </w:r>
+      <w:r>
+        <w:t xml:space="preserve">, which involves </w:t>
+      </w:r>
+      <w:r>
+        <w:t>ranking a set of 10 movies from the most preferred movie to the least preferred one.</w:t>
+      </w:r>
+      <w:r>
+        <w:t xml:space="preserve"> </w:t>
+      </w:r>
+    </w:p>
+    <w:p>
+      <w:pPr>
+        <w:pStyle w:val="NormalWeb"/>
+        <w:numPr>
+          <w:ilvl w:val="1"/>
+          <w:numId w:val="4"/>
+        </w:numPr>
+        <w:spacing w:line="360" w:lineRule="auto"/>
+        <w:jc w:val="both"/>
+      </w:pPr>
+      <w:r>
+        <w:t xml:space="preserve">He/she views movie recommendations </w:t>
+      </w:r>
+      <w:r>
+        <w:t>after completing the ranking of 10 movies in Design 2.</w:t>
+      </w:r>
+    </w:p>
+    <w:p>
+      <w:pPr>
+        <w:pStyle w:val="NormalWeb"/>
+        <w:numPr>
+          <w:ilvl w:val="1"/>
+          <w:numId w:val="4"/>
+        </w:numPr>
+        <w:spacing w:line="360" w:lineRule="auto"/>
+        <w:jc w:val="both"/>
+      </w:pPr>
+      <w:r>
+        <w:t xml:space="preserve">Then, the user completes Design </w:t>
+      </w:r>
+      <w:r>
+        <w:t>1</w:t>
+      </w:r>
+      <w:r>
+        <w:t xml:space="preserve">, which involves </w:t>
+      </w:r>
+      <w:r>
+        <w:t xml:space="preserve">5 rounds of pairwise movie selections. </w:t>
+      </w:r>
+    </w:p>
+    <w:p>
+      <w:pPr>
+        <w:pStyle w:val="NormalWeb"/>
+        <w:numPr>
+          <w:ilvl w:val="1"/>
+          <w:numId w:val="4"/>
+        </w:numPr>
+        <w:spacing w:line="360" w:lineRule="auto"/>
+        <w:jc w:val="both"/>
+      </w:pPr>
+      <w:r>
+        <w:t xml:space="preserve">After that, he/she views movie recommendations after completing the rounds of Design </w:t>
+      </w:r>
+      <w:r>
+        <w:t>1</w:t>
+      </w:r>
+      <w:r>
+        <w:t xml:space="preserve">. </w:t>
       </w:r>
     </w:p>
     <w:p>
@@ -7818,76 +7746,24 @@
         <w:pStyle w:val="NormalWeb"/>
         <w:spacing w:line="360" w:lineRule="auto"/>
         <w:jc w:val="both"/>
-      </w:pPr>
-      <w:r>
-        <w:rPr>
-          <w:b/>
-          <w:bCs/>
-        </w:rPr>
-        <w:t>Participant Recruitment &amp; Screening</w:t>
-      </w:r>
-    </w:p>
-    <w:p>
-      <w:pPr>
-        <w:pStyle w:val="NormalWeb"/>
-        <w:numPr>
-          <w:ilvl w:val="0"/>
-          <w:numId w:val="5"/>
-        </w:numPr>
-        <w:spacing w:line="360" w:lineRule="auto"/>
-        <w:jc w:val="both"/>
-      </w:pPr>
-      <w:r>
-        <w:rPr>
-          <w:b/>
-          <w:bCs/>
-        </w:rPr>
-        <w:t>Sample Size:</w:t>
-      </w:r>
-      <w:r>
-        <w:t xml:space="preserve"> 40 participants (aged 18–50), providing adequate statistical power for paired-sample analyses.</w:t>
-      </w:r>
-    </w:p>
-    <w:p>
-      <w:pPr>
-        <w:pStyle w:val="NormalWeb"/>
-        <w:numPr>
-          <w:ilvl w:val="0"/>
-          <w:numId w:val="5"/>
-        </w:numPr>
-        <w:spacing w:line="360" w:lineRule="auto"/>
-        <w:jc w:val="both"/>
-      </w:pPr>
-      <w:r>
-        <w:rPr>
-          <w:b/>
-          <w:bCs/>
-        </w:rPr>
-        <w:t>Recruitment Channels:</w:t>
-      </w:r>
-      <w:r>
-        <w:t xml:space="preserve"> University mailing lists, local film appreciation clubs, and online tech forums.</w:t>
-      </w:r>
-    </w:p>
-    <w:p>
-      <w:pPr>
-        <w:pStyle w:val="NormalWeb"/>
-        <w:numPr>
-          <w:ilvl w:val="0"/>
-          <w:numId w:val="5"/>
-        </w:numPr>
-        <w:spacing w:line="360" w:lineRule="auto"/>
-        <w:jc w:val="both"/>
-      </w:pPr>
-      <w:r>
-        <w:rPr>
-          <w:b/>
-          <w:bCs/>
-        </w:rPr>
-        <w:t>Screening Criteria:</w:t>
-      </w:r>
-      <w:r>
-        <w:t xml:space="preserve"> Participants must watch movies at least weekly, use streaming recommendation platforms regularly, and have basic digital literacy to navigate drag-and-drop elements seamlessly.</w:t>
+        <w:rPr>
+          <w:b/>
+          <w:bCs/>
+        </w:rPr>
+      </w:pPr>
+      <w:r>
+        <w:rPr>
+          <w:b/>
+          <w:bCs/>
+        </w:rPr>
+        <w:t xml:space="preserve">Participant </w:t>
+      </w:r>
+      <w:r>
+        <w:rPr>
+          <w:b/>
+          <w:bCs/>
+        </w:rPr>
+        <w:t xml:space="preserve">Screening and Recruitment: </w:t>
       </w:r>
     </w:p>
     <w:p>
@@ -7901,7 +7777,258 @@
           <w:b/>
           <w:bCs/>
         </w:rPr>
-        <w:t>Step-by-Step Procedure in Practice</w:t>
+        <w:t xml:space="preserve">1. Screening Evaluation Criteria: </w:t>
+      </w:r>
+      <w:r>
+        <w:t xml:space="preserve">Firstly, participants </w:t>
+      </w:r>
+      <w:r>
+        <w:t>in</w:t>
+      </w:r>
+      <w:r>
+        <w:t xml:space="preserve"> the user study must have basic digital </w:t>
+      </w:r>
+      <w:r>
+        <w:t>skills to click on the preferred movie in the pairwise selection design (Design 1), drag and drop the movie items in the ranking of a set of multiple movie items (Design 2), and click on the buttons available in the user interfaces of the designs utilized, as well as in the user interface of the landing page. Moreover, these participants must regularly watch movies (at least 1-2 movies per week</w:t>
+      </w:r>
+      <w:r>
+        <w:t>, as per possible requirements</w:t>
+      </w:r>
+      <w:r>
+        <w:t>)</w:t>
+      </w:r>
+      <w:r>
+        <w:t xml:space="preserve"> and </w:t>
+      </w:r>
+      <w:r>
+        <w:t>be accustomed to using movie streaming recommendation platforms</w:t>
+      </w:r>
+      <w:r>
+        <w:t>.</w:t>
+      </w:r>
+      <w:r>
+        <w:t xml:space="preserve"> </w:t>
+      </w:r>
+    </w:p>
+    <w:p>
+      <w:pPr>
+        <w:pStyle w:val="NormalWeb"/>
+        <w:spacing w:line="360" w:lineRule="auto"/>
+        <w:jc w:val="both"/>
+      </w:pPr>
+      <w:r>
+        <w:rPr>
+          <w:b/>
+          <w:bCs/>
+        </w:rPr>
+        <w:t>2.</w:t>
+      </w:r>
+      <w:r>
+        <w:t xml:space="preserve"> </w:t>
+      </w:r>
+      <w:r>
+        <w:rPr>
+          <w:b/>
+          <w:bCs/>
+        </w:rPr>
+        <w:t xml:space="preserve">Sample Type and Size: </w:t>
+      </w:r>
+      <w:r>
+        <w:t xml:space="preserve">Due to the incomplete cognitive development of people under the age of 18, and possible legal and ethical problems that may arise from accepting them into the user study, the sample should involve adults and some elderly people as well. The age range of the sample can start at 18 and end at 55 </w:t>
+      </w:r>
+      <w:r>
+        <w:rPr>
+          <w:b/>
+          <w:bCs/>
+        </w:rPr>
+        <w:t>(18-55)</w:t>
+      </w:r>
+      <w:r>
+        <w:t xml:space="preserve">. The </w:t>
+      </w:r>
+      <w:r>
+        <w:rPr>
+          <w:b/>
+          <w:bCs/>
+        </w:rPr>
+        <w:t>sample size</w:t>
+      </w:r>
+      <w:r>
+        <w:t xml:space="preserve"> can be selected as </w:t>
+      </w:r>
+      <w:r>
+        <w:rPr>
+          <w:b/>
+          <w:bCs/>
+        </w:rPr>
+        <w:t>100</w:t>
+      </w:r>
+      <w:r>
+        <w:t xml:space="preserve">, which will provide enough statistical power for </w:t>
+      </w:r>
+      <w:r>
+        <w:t xml:space="preserve">the analysis of the design of pairwise movie comparison and selection </w:t>
+      </w:r>
+      <w:r>
+        <w:rPr>
+          <w:b/>
+          <w:bCs/>
+        </w:rPr>
+        <w:t>(Design 1)</w:t>
+      </w:r>
+      <w:r>
+        <w:t xml:space="preserve">. </w:t>
+      </w:r>
+      <w:r>
+        <w:t xml:space="preserve">Because 500 rounds of data from 100 participants in the user study will provide enough information about movie preferences with more manageable round data, where each round only contains 2 movies, out of which 1 will be selected. Therefore, this will decrease the user's confusion more, compared to Design 2, where he/she needs to deal with the ranking of multiple movies at once. This mental clarity results in less </w:t>
+      </w:r>
+      <w:r>
+        <w:lastRenderedPageBreak/>
+        <w:t>varied and more consistent movie recommendations. Moreover, as the sample size increases, the movie recommendation results will be less random a</w:t>
+      </w:r>
+      <w:r>
+        <w:t xml:space="preserve">nd </w:t>
+      </w:r>
+      <w:r>
+        <w:t>more stable and reliable</w:t>
+      </w:r>
+      <w:r>
+        <w:t xml:space="preserve">. The results will be closer to the true expected value. This proposition is known as the </w:t>
+      </w:r>
+      <w:r>
+        <w:rPr>
+          <w:b/>
+          <w:bCs/>
+        </w:rPr>
+        <w:t xml:space="preserve">“Law of Large Numbers” </w:t>
+      </w:r>
+      <w:r>
+        <w:t xml:space="preserve">in statistics. In addition, the preferences/rankings of the movies selected will approach a normal distribution as the sample size starts to increase. </w:t>
+      </w:r>
+    </w:p>
+    <w:p>
+      <w:pPr>
+        <w:pStyle w:val="NormalWeb"/>
+        <w:spacing w:line="360" w:lineRule="auto"/>
+        <w:jc w:val="both"/>
+      </w:pPr>
+      <w:r>
+        <w:rPr>
+          <w:b/>
+          <w:bCs/>
+        </w:rPr>
+        <w:t xml:space="preserve">3. </w:t>
+      </w:r>
+      <w:r>
+        <w:rPr>
+          <w:b/>
+          <w:bCs/>
+        </w:rPr>
+        <w:t xml:space="preserve">Participant </w:t>
+      </w:r>
+      <w:r>
+        <w:rPr>
+          <w:b/>
+          <w:bCs/>
+        </w:rPr>
+        <w:t xml:space="preserve">Outreaching and </w:t>
+      </w:r>
+      <w:r>
+        <w:rPr>
+          <w:b/>
+          <w:bCs/>
+        </w:rPr>
+        <w:t>Recruit</w:t>
+      </w:r>
+      <w:r>
+        <w:rPr>
+          <w:b/>
+          <w:bCs/>
+        </w:rPr>
+        <w:t>ing</w:t>
+      </w:r>
+      <w:r>
+        <w:rPr>
+          <w:b/>
+          <w:bCs/>
+        </w:rPr>
+        <w:t xml:space="preserve"> </w:t>
+      </w:r>
+      <w:r>
+        <w:rPr>
+          <w:b/>
+          <w:bCs/>
+        </w:rPr>
+        <w:t xml:space="preserve">Methods: </w:t>
+      </w:r>
+      <w:r>
+        <w:t xml:space="preserve">The participants </w:t>
+      </w:r>
+      <w:r>
+        <w:t>for</w:t>
+      </w:r>
+      <w:r>
+        <w:t xml:space="preserve"> our user study can be found </w:t>
+      </w:r>
+      <w:r>
+        <w:t>through</w:t>
+      </w:r>
+      <w:r>
+        <w:t xml:space="preserve"> movie evaluation clubs</w:t>
+      </w:r>
+      <w:r>
+        <w:t xml:space="preserve"> (within mostly educational facilities such as universities and high schools)</w:t>
+      </w:r>
+      <w:r>
+        <w:t>, online movie forums, university mailing lists,</w:t>
+      </w:r>
+      <w:r>
+        <w:t xml:space="preserve"> and the databases of cinema venues. The participants should bring their </w:t>
+      </w:r>
+      <w:r>
+        <w:rPr>
+          <w:b/>
+          <w:bCs/>
+        </w:rPr>
+        <w:t>“National Identity Cards”</w:t>
+      </w:r>
+      <w:r>
+        <w:t xml:space="preserve"> to prove that they are at least 18-years old and at most 55-years old.</w:t>
+      </w:r>
+    </w:p>
+    <w:p>
+      <w:pPr>
+        <w:pStyle w:val="NormalWeb"/>
+        <w:spacing w:line="360" w:lineRule="auto"/>
+        <w:jc w:val="both"/>
+      </w:pPr>
+      <w:r>
+        <w:rPr>
+          <w:b/>
+          <w:bCs/>
+        </w:rPr>
+        <w:t xml:space="preserve">Step-by-Step Procedure </w:t>
+      </w:r>
+      <w:r>
+        <w:rPr>
+          <w:b/>
+          <w:bCs/>
+        </w:rPr>
+        <w:t xml:space="preserve">of the User Study </w:t>
+      </w:r>
+      <w:r>
+        <w:rPr>
+          <w:b/>
+          <w:bCs/>
+        </w:rPr>
+        <w:t>in Practice</w:t>
+      </w:r>
+      <w:r>
+        <w:rPr>
+          <w:b/>
+          <w:bCs/>
+        </w:rPr>
+        <w:t>:</w:t>
       </w:r>
     </w:p>
     <w:p>
@@ -7919,10 +8046,47 @@
           <w:b/>
           <w:bCs/>
         </w:rPr>
-        <w:t>Introduction &amp; Consent:</w:t>
-      </w:r>
-      <w:r>
-        <w:t xml:space="preserve"> Participants land on a welcome page, review the study overview, and submit informed consent.</w:t>
+        <w:t xml:space="preserve">Introduction </w:t>
+      </w:r>
+      <w:r>
+        <w:rPr>
+          <w:b/>
+          <w:bCs/>
+        </w:rPr>
+        <w:t xml:space="preserve">to the Study </w:t>
+      </w:r>
+      <w:r>
+        <w:rPr>
+          <w:b/>
+          <w:bCs/>
+        </w:rPr>
+        <w:t xml:space="preserve">&amp; </w:t>
+      </w:r>
+      <w:r>
+        <w:rPr>
+          <w:b/>
+          <w:bCs/>
+        </w:rPr>
+        <w:t>User’s Approval</w:t>
+      </w:r>
+      <w:r>
+        <w:rPr>
+          <w:b/>
+          <w:bCs/>
+        </w:rPr>
+        <w:t>:</w:t>
+      </w:r>
+      <w:r>
+        <w:t xml:space="preserve"> Participants </w:t>
+      </w:r>
+      <w:r>
+        <w:t>in</w:t>
+      </w:r>
+      <w:r>
+        <w:t xml:space="preserve"> our user study land on a welcome page</w:t>
+      </w:r>
+      <w:r>
+        <w:t xml:space="preserve">, review the details of the implementation choice of the extended model, read the user study design methodology, and submit informed user consent before starting the study.  </w:t>
       </w:r>
     </w:p>
     <w:p>
@@ -7940,10 +8104,75 @@
           <w:b/>
           <w:bCs/>
         </w:rPr>
-        <w:t>First Elicitation Block:</w:t>
-      </w:r>
-      <w:r>
-        <w:t xml:space="preserve"> The participant interacts with the first assigned method (e.g., comparing movie pairs or sorting a list of 10 via drag-and-drop).</w:t>
+        <w:t xml:space="preserve">The </w:t>
+      </w:r>
+      <w:r>
+        <w:rPr>
+          <w:b/>
+          <w:bCs/>
+        </w:rPr>
+        <w:t xml:space="preserve">First </w:t>
+      </w:r>
+      <w:r>
+        <w:rPr>
+          <w:b/>
+          <w:bCs/>
+        </w:rPr>
+        <w:t xml:space="preserve">Movie </w:t>
+      </w:r>
+      <w:r>
+        <w:rPr>
+          <w:b/>
+          <w:bCs/>
+        </w:rPr>
+        <w:t xml:space="preserve">Elicitation </w:t>
+      </w:r>
+      <w:r>
+        <w:rPr>
+          <w:b/>
+          <w:bCs/>
+        </w:rPr>
+        <w:t>Method</w:t>
+      </w:r>
+      <w:r>
+        <w:rPr>
+          <w:b/>
+          <w:bCs/>
+        </w:rPr>
+        <w:t>:</w:t>
+      </w:r>
+      <w:r>
+        <w:t xml:space="preserve"> The participant interacts with the </w:t>
+      </w:r>
+      <w:r>
+        <w:t xml:space="preserve">initially </w:t>
+      </w:r>
+      <w:r>
+        <w:t xml:space="preserve">assigned </w:t>
+      </w:r>
+      <w:r>
+        <w:t xml:space="preserve">elicitation </w:t>
+      </w:r>
+      <w:r>
+        <w:t xml:space="preserve">method (e.g., comparing movie pairs or sorting a list of 10 </w:t>
+      </w:r>
+      <w:r>
+        <w:t xml:space="preserve">movies </w:t>
+      </w:r>
+      <w:r>
+        <w:t xml:space="preserve">via </w:t>
+      </w:r>
+      <w:r>
+        <w:t xml:space="preserve">a </w:t>
+      </w:r>
+      <w:r>
+        <w:t>drag-and-drop</w:t>
+      </w:r>
+      <w:r>
+        <w:t xml:space="preserve"> method from the most preferred movie to the least preferred one</w:t>
+      </w:r>
+      <w:r>
+        <w:t>).</w:t>
       </w:r>
     </w:p>
     <w:p>
@@ -7961,6 +8190,13 @@
           <w:b/>
           <w:bCs/>
         </w:rPr>
+        <w:t xml:space="preserve">Movie </w:t>
+      </w:r>
+      <w:r>
+        <w:rPr>
+          <w:b/>
+          <w:bCs/>
+        </w:rPr>
         <w:t>Recommendation Assessment:</w:t>
       </w:r>
       <w:r>
@@ -7968,12 +8204,33 @@
       </w:r>
       <w:r>
         <w:rPr>
-          <w:rStyle w:val="HTMLKodu"/>
+          <w:b/>
+          <w:bCs/>
+          <w:i/>
+          <w:iCs/>
         </w:rPr>
         <w:t>recommendations_view</w:t>
       </w:r>
       <w:r>
-        <w:t xml:space="preserve">, displaying the top 10 recommended movies based on the learned vector </w:t>
+        <w:t xml:space="preserve">, </w:t>
+      </w:r>
+      <w:r>
+        <w:t>which displays</w:t>
+      </w:r>
+      <w:r>
+        <w:t xml:space="preserve"> the top</w:t>
+      </w:r>
+      <w:r>
+        <w:t>-</w:t>
+      </w:r>
+      <w:r>
+        <w:t xml:space="preserve">10 recommended movies based on the learned </w:t>
+      </w:r>
+      <w:r>
+        <w:t xml:space="preserve">user’s movie preference </w:t>
+      </w:r>
+      <w:r>
+        <w:t xml:space="preserve">vector </w:t>
       </w:r>
       <m:oMath>
         <m:r>
@@ -7984,7 +8241,25 @@
         </m:r>
       </m:oMath>
       <w:r>
-        <w:t>. Participants rate each recommendation's relevance on a 1–5 Likert scale.</w:t>
+        <w:t xml:space="preserve">. Participants rate </w:t>
+      </w:r>
+      <w:r>
+        <w:t xml:space="preserve">the relevance of each movie recommendation </w:t>
+      </w:r>
+      <w:r>
+        <w:t xml:space="preserve">by the method of Design 1 </w:t>
+      </w:r>
+      <w:r>
+        <w:t xml:space="preserve">on a numerical scale </w:t>
+      </w:r>
+      <w:r>
+        <w:t>that ranges</w:t>
+      </w:r>
+      <w:r>
+        <w:t xml:space="preserve"> from 1 to 10. </w:t>
+      </w:r>
+      <w:r>
+        <w:t xml:space="preserve">The implementation can be changed to recommend more than 10 movies to have a more precise opinion of the users about the movie recommendations. </w:t>
       </w:r>
     </w:p>
     <w:p>
@@ -8002,21 +8277,13 @@
           <w:b/>
           <w:bCs/>
         </w:rPr>
-        <w:lastRenderedPageBreak/>
-        <w:t>Cognitive Load Assessment:</w:t>
-      </w:r>
-      <w:r>
-        <w:t xml:space="preserve"> Participants complete a standardized </w:t>
-      </w:r>
-      <w:r>
-        <w:rPr>
-          <w:b/>
-          <w:bCs/>
-        </w:rPr>
-        <w:t>NASA-TLX (Task Load Index)</w:t>
-      </w:r>
-      <w:r>
-        <w:t xml:space="preserve"> questionnaire to evaluate mental effort, frustration, and time pressure for the first method.</w:t>
+        <w:t xml:space="preserve">The Second Movie Elicitation Method: </w:t>
+      </w:r>
+      <w:r>
+        <w:t xml:space="preserve">The participants </w:t>
+      </w:r>
+      <w:r>
+        <w:t xml:space="preserve">complete the rating of each movie recommendation by the method of Design 1, and then rank the set of 10 movies from the most preferred movie to the least preferred one. After ranking, the participant should rate the trustworthiness of each movie recommendation by the method of Design 2 on a numerical scale that ranges from 1 to 10. </w:t>
       </w:r>
     </w:p>
     <w:p>
@@ -8034,20 +8301,40 @@
           <w:b/>
           <w:bCs/>
         </w:rPr>
-        <w:t>Second Elicitation Block:</w:t>
-      </w:r>
-      <w:r>
-        <w:t xml:space="preserve"> Participants clear their session state and complete the second method, followed by the identical recommendation rating and NASA-TLX survey.</w:t>
+        <w:t>Final Closing</w:t>
+      </w:r>
+      <w:r>
+        <w:rPr>
+          <w:b/>
+          <w:bCs/>
+        </w:rPr>
+        <w:t xml:space="preserve"> Interview:</w:t>
+      </w:r>
+      <w:r>
+        <w:t xml:space="preserve"> A brief </w:t>
+      </w:r>
+      <w:r>
+        <w:t>5 to 10-minute</w:t>
+      </w:r>
+      <w:r>
+        <w:t xml:space="preserve"> qualitative </w:t>
+      </w:r>
+      <w:r>
+        <w:t xml:space="preserve">summary interview should be done with the user study participants to capture user preference about the </w:t>
+      </w:r>
+      <w:r>
+        <w:lastRenderedPageBreak/>
+        <w:t>intuitiveness of the user interfaces used in the study, and perceived accuracy of the movie recommendations.</w:t>
+      </w:r>
+      <w:r>
+        <w:t xml:space="preserve"> </w:t>
       </w:r>
     </w:p>
     <w:p>
       <w:pPr>
         <w:pStyle w:val="NormalWeb"/>
-        <w:numPr>
-          <w:ilvl w:val="0"/>
-          <w:numId w:val="6"/>
-        </w:numPr>
         <w:spacing w:line="360" w:lineRule="auto"/>
+        <w:ind w:left="720"/>
         <w:jc w:val="both"/>
       </w:pPr>
       <w:r>
@@ -8055,24 +8342,14 @@
           <w:b/>
           <w:bCs/>
         </w:rPr>
-        <w:t>Exit Interview:</w:t>
-      </w:r>
-      <w:r>
-        <w:t xml:space="preserve"> A brief 5-minute qualitative wrap-up captures user preference regarding interface intuitiveness, fatigue levels, and perceived accuracy.</w:t>
-      </w:r>
-    </w:p>
-    <w:p>
-      <w:pPr>
-        <w:pStyle w:val="NormalWeb"/>
-        <w:spacing w:line="360" w:lineRule="auto"/>
-        <w:jc w:val="both"/>
-      </w:pPr>
-      <w:r>
-        <w:rPr>
-          <w:b/>
-          <w:bCs/>
-        </w:rPr>
         <w:t>Data Analysis Plan</w:t>
+      </w:r>
+      <w:r>
+        <w:rPr>
+          <w:b/>
+          <w:bCs/>
+        </w:rPr>
+        <w:t>:</w:t>
       </w:r>
     </w:p>
     <w:p>
@@ -8602,7 +8879,7 @@
   <w:abstractNum w:abstractNumId="3" w15:restartNumberingAfterBreak="0">
     <w:nsid w:val="2E4D0D16"/>
     <w:multiLevelType w:val="multilevel"/>
-    <w:tmpl w:val="718A5C34"/>
+    <w:tmpl w:val="35B4AE48"/>
     <w:lvl w:ilvl="0">
       <w:start w:val="1"/>
       <w:numFmt w:val="bullet"/>
@@ -8619,20 +8896,15 @@
         <w:sz w:val="20"/>
       </w:rPr>
     </w:lvl>
-    <w:lvl w:ilvl="1" w:tentative="1">
-      <w:start w:val="1"/>
+    <w:lvl w:ilvl="1">
       <w:numFmt w:val="bullet"/>
-      <w:lvlText w:val="o"/>
+      <w:lvlText w:val="-"/>
       <w:lvlJc w:val="left"/>
       <w:pPr>
-        <w:tabs>
-          <w:tab w:val="num" w:pos="1440"/>
-        </w:tabs>
         <w:ind w:left="1440" w:hanging="360"/>
       </w:pPr>
       <w:rPr>
-        <w:rFonts w:ascii="Courier New" w:hAnsi="Courier New" w:hint="default"/>
-        <w:sz w:val="20"/>
+        <w:rFonts w:ascii="Times New Roman" w:eastAsia="Times New Roman" w:hAnsi="Times New Roman" w:cs="Times New Roman" w:hint="default"/>
       </w:rPr>
     </w:lvl>
     <w:lvl w:ilvl="2" w:tentative="1">

</xml_diff>